<commit_message>
docs(informe): regenerate informe_3.docx with corrected budget (1Gbps + fluido electrico)
</commit_message>
<xml_diff>
--- a/markdown/informe_3.docx
+++ b/markdown/informe_3.docx
@@ -18235,29 +18235,41 @@
                 <w:b/>
                 <w:bCs/>
               </w:rPr>
-              <w:t xml:space="preserve">Internet empresarial</w:t>
-            </w:r>
-          </w:p>
-        </w:tc>
-        <w:tc>
-          <w:tcPr/>
-          <w:p>
-            <w:pPr>
-              <w:pStyle w:val="Compact"/>
-            </w:pPr>
-            <w:r>
-              <w:t xml:space="preserve">Servicio de fibra óptica de 200 Mbps para el área DTIC; necesario para el despliegue y acceso remoto al servidor</w:t>
-            </w:r>
-          </w:p>
-        </w:tc>
-        <w:tc>
-          <w:tcPr/>
-          <w:p>
-            <w:pPr>
-              <w:pStyle w:val="Compact"/>
-            </w:pPr>
-            <w:r>
-              <w:t xml:space="preserve">450.00</w:t>
+              <w:t xml:space="preserve">Internet institucional</w:t>
+            </w:r>
+          </w:p>
+        </w:tc>
+        <w:tc>
+          <w:tcPr/>
+          <w:p>
+            <w:pPr>
+              <w:pStyle w:val="Compact"/>
+            </w:pPr>
+            <w:r>
+              <w:t xml:space="preserve">Servicio de fibra óptica de 1 Gbps contratado por la EMCH</w:t>
+            </w:r>
+            <w:r>
+              <w:t xml:space="preserve"> </w:t>
+            </w:r>
+            <w:r>
+              <w:t xml:space="preserve">“CFB”</w:t>
+            </w:r>
+            <w:r>
+              <w:t xml:space="preserve"> </w:t>
+            </w:r>
+            <w:r>
+              <w:t xml:space="preserve">(S/. 90,000/año); necesario para el despliegue, acceso remoto al servidor y operación continua del sistema</w:t>
+            </w:r>
+          </w:p>
+        </w:tc>
+        <w:tc>
+          <w:tcPr/>
+          <w:p>
+            <w:pPr>
+              <w:pStyle w:val="Compact"/>
+            </w:pPr>
+            <w:r>
+              <w:t xml:space="preserve">7,500.00</w:t>
             </w:r>
           </w:p>
         </w:tc>
@@ -18279,7 +18291,7 @@
               <w:pStyle w:val="Compact"/>
             </w:pPr>
             <w:r>
-              <w:t xml:space="preserve">1,575.00</w:t>
+              <w:t xml:space="preserve">26,250.00</w:t>
             </w:r>
           </w:p>
         </w:tc>
@@ -18451,29 +18463,29 @@
                 <w:b/>
                 <w:bCs/>
               </w:rPr>
-              <w:t xml:space="preserve">Agua</w:t>
-            </w:r>
-          </w:p>
-        </w:tc>
-        <w:tc>
-          <w:tcPr/>
-          <w:p>
-            <w:pPr>
-              <w:pStyle w:val="Compact"/>
-            </w:pPr>
-            <w:r>
-              <w:t xml:space="preserve">Servicio sanitario del área DTIC (uso del personal durante el período del proyecto)</w:t>
-            </w:r>
-          </w:p>
-        </w:tc>
-        <w:tc>
-          <w:tcPr/>
-          <w:p>
-            <w:pPr>
-              <w:pStyle w:val="Compact"/>
-            </w:pPr>
-            <w:r>
-              <w:t xml:space="preserve">75.00</w:t>
+              <w:t xml:space="preserve">Fluido eléctrico</w:t>
+            </w:r>
+          </w:p>
+        </w:tc>
+        <w:tc>
+          <w:tcPr/>
+          <w:p>
+            <w:pPr>
+              <w:pStyle w:val="Compact"/>
+            </w:pPr>
+            <w:r>
+              <w:t xml:space="preserve">Suministro eléctrico general del área DTIC (iluminación, estaciones de trabajo, equipos de red)</w:t>
+            </w:r>
+          </w:p>
+        </w:tc>
+        <w:tc>
+          <w:tcPr/>
+          <w:p>
+            <w:pPr>
+              <w:pStyle w:val="Compact"/>
+            </w:pPr>
+            <w:r>
+              <w:t xml:space="preserve">280.00</w:t>
             </w:r>
           </w:p>
         </w:tc>
@@ -18495,7 +18507,7 @@
               <w:pStyle w:val="Compact"/>
             </w:pPr>
             <w:r>
-              <w:t xml:space="preserve">262.50</w:t>
+              <w:t xml:space="preserve">980.00</w:t>
             </w:r>
           </w:p>
         </w:tc>
@@ -18687,7 +18699,7 @@
                 <w:b/>
                 <w:bCs/>
               </w:rPr>
-              <w:t xml:space="preserve">2,105.00</w:t>
+              <w:t xml:space="preserve">9,360.00</w:t>
             </w:r>
           </w:p>
         </w:tc>
@@ -18713,7 +18725,7 @@
                 <w:b/>
                 <w:bCs/>
               </w:rPr>
-              <w:t xml:space="preserve">S/. 7,367.50</w:t>
+              <w:t xml:space="preserve">S/. 32,760.00</w:t>
             </w:r>
           </w:p>
         </w:tc>
@@ -18734,7 +18746,19 @@
         <w:t xml:space="preserve"> </w:t>
       </w:r>
       <w:r>
-        <w:t xml:space="preserve">tarifas OSIPTEL para internet empresarial Lima 2026, tarifas Luz del Sur para uso comercial, costos referenciales de mantenimiento TI en Lima metropolitana 2026.</w:t>
+        <w:t xml:space="preserve">contrato institucional EMCH</w:t>
+      </w:r>
+      <w:r>
+        <w:t xml:space="preserve"> </w:t>
+      </w:r>
+      <w:r>
+        <w:t xml:space="preserve">“CFB”</w:t>
+      </w:r>
+      <w:r>
+        <w:t xml:space="preserve"> </w:t>
+      </w:r>
+      <w:r>
+        <w:t xml:space="preserve">para internet 1 Gbps (S/. 90,000/año), tarifas Enel/Luz del Sur para uso comercial Lima 2026 (energía eléctrica y fluido eléctrico), costos referenciales de mantenimiento TI en Lima metropolitana 2026.</w:t>
       </w:r>
     </w:p>
     <w:p>

</xml_diff>

<commit_message>
docs(informe): fix Gantt syntax errors and add exact Docusaurus URLs
- Fix Gantt: replace em-dashes with hyphens in section/title names
- Fix Gantt: remove commas from task names (Mermaid field separator conflict)
- Fix Gantt: mark final delivery s6b as crit for visual emphasis
- Portada: add production URL, docs URL and GitHub repo link
- Section 3.1.11: replace generic Docusaurus link with full URL table (9 entries)
- Subsections 3.1.11.5-8: replace generic refs with exact direct links
- Section 3.2.2: add URL column per module in manual de usuario table
- Anexo 5: expand to full resource index (25 entries) with system, GitHub and all docs

Co-Authored-By: Claude Sonnet 4.6 <noreply@anthropic.com>
</commit_message>
<xml_diff>
--- a/markdown/informe_3.docx
+++ b/markdown/informe_3.docx
@@ -262,6 +262,90 @@
             </w:pPr>
             <w:r>
               <w:t xml:space="preserve">Junio – Julio 2026</w:t>
+            </w:r>
+          </w:p>
+        </w:tc>
+      </w:tr>
+      <w:tr>
+        <w:tc>
+          <w:tcPr/>
+          <w:p>
+            <w:pPr>
+              <w:pStyle w:val="Compact"/>
+            </w:pPr>
+            <w:r>
+              <w:rPr>
+                <w:b/>
+                <w:bCs/>
+              </w:rPr>
+              <w:t xml:space="preserve">Sistema en producción:</w:t>
+            </w:r>
+          </w:p>
+        </w:tc>
+        <w:tc>
+          <w:tcPr/>
+          <w:p>
+            <w:pPr>
+              <w:pStyle w:val="Compact"/>
+            </w:pPr>
+            <w:r>
+              <w:t xml:space="preserve">https://sgi.escuelamilitar.edu.pe</w:t>
+            </w:r>
+          </w:p>
+        </w:tc>
+      </w:tr>
+      <w:tr>
+        <w:tc>
+          <w:tcPr/>
+          <w:p>
+            <w:pPr>
+              <w:pStyle w:val="Compact"/>
+            </w:pPr>
+            <w:r>
+              <w:rPr>
+                <w:b/>
+                <w:bCs/>
+              </w:rPr>
+              <w:t xml:space="preserve">Documentación técnica:</w:t>
+            </w:r>
+          </w:p>
+        </w:tc>
+        <w:tc>
+          <w:tcPr/>
+          <w:p>
+            <w:pPr>
+              <w:pStyle w:val="Compact"/>
+            </w:pPr>
+            <w:r>
+              <w:t xml:space="preserve">https://sgi-docs.escuelamilitar.edu.pe</w:t>
+            </w:r>
+          </w:p>
+        </w:tc>
+      </w:tr>
+      <w:tr>
+        <w:tc>
+          <w:tcPr/>
+          <w:p>
+            <w:pPr>
+              <w:pStyle w:val="Compact"/>
+            </w:pPr>
+            <w:r>
+              <w:rPr>
+                <w:b/>
+                <w:bCs/>
+              </w:rPr>
+              <w:t xml:space="preserve">Repositorio GitHub:</w:t>
+            </w:r>
+          </w:p>
+        </w:tc>
+        <w:tc>
+          <w:tcPr/>
+          <w:p>
+            <w:pPr>
+              <w:pStyle w:val="Compact"/>
+            </w:pPr>
+            <w:r>
+              <w:t xml:space="preserve">https://github.com/Jnasus/sgi-emch</w:t>
             </w:r>
           </w:p>
         </w:tc>
@@ -4665,7 +4749,7 @@
     <w:bookmarkEnd w:id="25"/>
     <w:bookmarkEnd w:id="26"/>
     <w:bookmarkEnd w:id="27"/>
-    <w:bookmarkStart w:id="43" w:name="capítulo-3-desarrollo-de-la-solución"/>
+    <w:bookmarkStart w:id="47" w:name="capítulo-3-desarrollo-de-la-solución"/>
     <w:p>
       <w:pPr>
         <w:pStyle w:val="Heading1"/>
@@ -4674,7 +4758,7 @@
         <w:t xml:space="preserve">Capítulo 3 — DESARROLLO DE LA SOLUCIÓN</w:t>
       </w:r>
     </w:p>
-    <w:bookmarkStart w:id="39" w:name="desarrollo-de-la-solución"/>
+    <w:bookmarkStart w:id="43" w:name="desarrollo-de-la-solución"/>
     <w:p>
       <w:pPr>
         <w:pStyle w:val="Heading2"/>
@@ -13374,7 +13458,7 @@
       </w:tr>
     </w:tbl>
     <w:bookmarkEnd w:id="37"/>
-    <w:bookmarkStart w:id="38" w:name="arquitectura-de-aplicaciones"/>
+    <w:bookmarkStart w:id="42" w:name="arquitectura-de-aplicaciones"/>
     <w:p>
       <w:pPr>
         <w:pStyle w:val="Heading3"/>
@@ -13388,7 +13472,7 @@
         <w:pStyle w:val="FirstParagraph"/>
       </w:pPr>
       <w:r>
-        <w:t xml:space="preserve">La documentación completa de arquitectura está disponible en la documentación oficial del proyecto:</w:t>
+        <w:t xml:space="preserve">La documentación completa de arquitectura está disponible en la documentación oficial del proyecto (sección</w:t>
       </w:r>
       <w:r>
         <w:t xml:space="preserve"> </w:t>
@@ -13398,424 +13482,26 @@
           <w:b/>
           <w:bCs/>
         </w:rPr>
-        <w:t xml:space="preserve">https://sgi-docs.escuelamilitar.edu.pe</w:t>
-      </w:r>
-      <w:r>
-        <w:t xml:space="preserve"> </w:t>
-      </w:r>
-      <w:r>
-        <w:t xml:space="preserve">(sección</w:t>
-      </w:r>
-      <w:r>
-        <w:t xml:space="preserve"> </w:t>
-      </w:r>
-      <w:r>
-        <w:rPr>
-          <w:i/>
-          <w:iCs/>
-        </w:rPr>
         <w:t xml:space="preserve">Arquitectura</w:t>
       </w:r>
       <w:r>
-        <w:t xml:space="preserve">).</w:t>
-      </w:r>
-    </w:p>
-    <w:p>
-      <w:pPr>
-        <w:pStyle w:val="BodyText"/>
-      </w:pPr>
+        <w:t xml:space="preserve"> </w:t>
+      </w:r>
+      <w:r>
+        <w:t xml:space="preserve">y</w:t>
+      </w:r>
+      <w:r>
+        <w:t xml:space="preserve"> </w:t>
+      </w:r>
       <w:r>
         <w:rPr>
           <w:b/>
           <w:bCs/>
         </w:rPr>
-        <w:t xml:space="preserve">3.1.11.1. Diagrama de Arquitectura de Aplicaciones</w:t>
-      </w:r>
-    </w:p>
-    <w:p>
-      <w:pPr>
-        <w:pStyle w:val="SourceCode"/>
-      </w:pPr>
-      <w:r>
-        <w:rPr>
-          <w:rStyle w:val="VerbatimChar"/>
-        </w:rPr>
-        <w:t xml:space="preserve">graph TB</w:t>
-      </w:r>
-      <w:r>
-        <w:br/>
-      </w:r>
-      <w:r>
-        <w:rPr>
-          <w:rStyle w:val="VerbatimChar"/>
-        </w:rPr>
-        <w:t xml:space="preserve">    subgraph Cliente["Cliente — Navegador Web"]</w:t>
-      </w:r>
-      <w:r>
-        <w:br/>
-      </w:r>
-      <w:r>
-        <w:rPr>
-          <w:rStyle w:val="VerbatimChar"/>
-        </w:rPr>
-        <w:t xml:space="preserve">        RT["React Router (App.tsx)"]</w:t>
-      </w:r>
-      <w:r>
-        <w:br/>
-      </w:r>
-      <w:r>
-        <w:rPr>
-          <w:rStyle w:val="VerbatimChar"/>
-        </w:rPr>
-        <w:t xml:space="preserve">        PC["Componentes de página (Dashboard, Inventario, Incidentes…)"]</w:t>
-      </w:r>
-      <w:r>
-        <w:br/>
-      </w:r>
-      <w:r>
-        <w:rPr>
-          <w:rStyle w:val="VerbatimChar"/>
-        </w:rPr>
-        <w:t xml:space="preserve">        SM["Servicios (inventarioService, ticketService…)"]</w:t>
-      </w:r>
-      <w:r>
-        <w:br/>
-      </w:r>
-      <w:r>
-        <w:rPr>
-          <w:rStyle w:val="VerbatimChar"/>
-        </w:rPr>
-        <w:t xml:space="preserve">        FA["fetchWithAuth — api.ts (inyecta JWT)"]</w:t>
-      </w:r>
-      <w:r>
-        <w:br/>
-      </w:r>
-      <w:r>
-        <w:rPr>
-          <w:rStyle w:val="VerbatimChar"/>
-        </w:rPr>
-        <w:t xml:space="preserve">        RT --&gt; PC --&gt; SM --&gt; FA</w:t>
-      </w:r>
-      <w:r>
-        <w:br/>
-      </w:r>
-      <w:r>
-        <w:rPr>
-          <w:rStyle w:val="VerbatimChar"/>
-        </w:rPr>
-        <w:t xml:space="preserve">    end</w:t>
-      </w:r>
-      <w:r>
-        <w:br/>
-      </w:r>
-      <w:r>
-        <w:br/>
-      </w:r>
-      <w:r>
-        <w:rPr>
-          <w:rStyle w:val="VerbatimChar"/>
-        </w:rPr>
-        <w:t xml:space="preserve">    FA --&gt;|"HTTPS · Bearer Token"| SEC</w:t>
-      </w:r>
-      <w:r>
-        <w:br/>
-      </w:r>
-      <w:r>
-        <w:br/>
-      </w:r>
-      <w:r>
-        <w:rPr>
-          <w:rStyle w:val="VerbatimChar"/>
-        </w:rPr>
-        <w:t xml:space="preserve">    subgraph Servidor["Servidor — Spring Boot"]</w:t>
-      </w:r>
-      <w:r>
-        <w:br/>
-      </w:r>
-      <w:r>
-        <w:rPr>
-          <w:rStyle w:val="VerbatimChar"/>
-        </w:rPr>
-        <w:t xml:space="preserve">        SEC["Spring Security (JwtFilter + AuditSessionInterceptor)"]</w:t>
-      </w:r>
-      <w:r>
-        <w:br/>
-      </w:r>
-      <w:r>
-        <w:rPr>
-          <w:rStyle w:val="VerbatimChar"/>
-        </w:rPr>
-        <w:t xml:space="preserve">        CTRL["Controladores REST (@RestController)"]</w:t>
-      </w:r>
-      <w:r>
-        <w:br/>
-      </w:r>
-      <w:r>
-        <w:rPr>
-          <w:rStyle w:val="VerbatimChar"/>
-        </w:rPr>
-        <w:t xml:space="preserve">        SVC["Servicios (@Service + lógica de negocio)"]</w:t>
-      </w:r>
-      <w:r>
-        <w:br/>
-      </w:r>
-      <w:r>
-        <w:rPr>
-          <w:rStyle w:val="VerbatimChar"/>
-        </w:rPr>
-        <w:t xml:space="preserve">        CACHE["Caché Caffeine (@Cacheable / @CacheEvict)"]</w:t>
-      </w:r>
-      <w:r>
-        <w:br/>
-      </w:r>
-      <w:r>
-        <w:rPr>
-          <w:rStyle w:val="VerbatimChar"/>
-        </w:rPr>
-        <w:t xml:space="preserve">        REPO["Repositorios JPA (Spring Data)"]</w:t>
-      </w:r>
-      <w:r>
-        <w:br/>
-      </w:r>
-      <w:r>
-        <w:rPr>
-          <w:rStyle w:val="VerbatimChar"/>
-        </w:rPr>
-        <w:t xml:space="preserve">        SCHED["Scheduler (@Scheduled — SLA + stock)"]</w:t>
-      </w:r>
-      <w:r>
-        <w:br/>
-      </w:r>
-      <w:r>
-        <w:rPr>
-          <w:rStyle w:val="VerbatimChar"/>
-        </w:rPr>
-        <w:t xml:space="preserve">        NOTIF["NotificadorService"]</w:t>
-      </w:r>
-      <w:r>
-        <w:br/>
-      </w:r>
-      <w:r>
-        <w:br/>
-      </w:r>
-      <w:r>
-        <w:rPr>
-          <w:rStyle w:val="VerbatimChar"/>
-        </w:rPr>
-        <w:t xml:space="preserve">        SEC --&gt; CTRL --&gt; SVC</w:t>
-      </w:r>
-      <w:r>
-        <w:br/>
-      </w:r>
-      <w:r>
-        <w:rPr>
-          <w:rStyle w:val="VerbatimChar"/>
-        </w:rPr>
-        <w:t xml:space="preserve">        SVC --&gt; CACHE</w:t>
-      </w:r>
-      <w:r>
-        <w:br/>
-      </w:r>
-      <w:r>
-        <w:rPr>
-          <w:rStyle w:val="VerbatimChar"/>
-        </w:rPr>
-        <w:t xml:space="preserve">        SVC --&gt; REPO</w:t>
-      </w:r>
-      <w:r>
-        <w:br/>
-      </w:r>
-      <w:r>
-        <w:rPr>
-          <w:rStyle w:val="VerbatimChar"/>
-        </w:rPr>
-        <w:t xml:space="preserve">        SCHED --&gt; NOTIF --&gt; SVC</w:t>
-      </w:r>
-      <w:r>
-        <w:br/>
-      </w:r>
-      <w:r>
-        <w:rPr>
-          <w:rStyle w:val="VerbatimChar"/>
-        </w:rPr>
-        <w:t xml:space="preserve">    end</w:t>
-      </w:r>
-      <w:r>
-        <w:br/>
-      </w:r>
-      <w:r>
-        <w:br/>
-      </w:r>
-      <w:r>
-        <w:rPr>
-          <w:rStyle w:val="VerbatimChar"/>
-        </w:rPr>
-        <w:t xml:space="preserve">    REPO --&gt;|"JDBC · HikariCP"| DB[("MySQL 8.0 — db_sgi_emch")]</w:t>
-      </w:r>
-    </w:p>
-    <w:p>
-      <w:pPr>
-        <w:pStyle w:val="FirstParagraph"/>
-      </w:pPr>
-      <w:r>
-        <w:rPr>
-          <w:b/>
-          <w:bCs/>
-        </w:rPr>
-        <w:t xml:space="preserve">3.1.11.2. Diagrama de Despliegue</w:t>
-      </w:r>
-    </w:p>
-    <w:p>
-      <w:pPr>
-        <w:pStyle w:val="BodyText"/>
-      </w:pPr>
-      <w:r>
-        <w:t xml:space="preserve">El sistema se despliega mediante Docker Compose en el servidor institucional de la EMCH:</w:t>
-      </w:r>
-    </w:p>
-    <w:p>
-      <w:pPr>
-        <w:pStyle w:val="SourceCode"/>
-      </w:pPr>
-      <w:r>
-        <w:rPr>
-          <w:rStyle w:val="VerbatimChar"/>
-        </w:rPr>
-        <w:t xml:space="preserve">graph LR</w:t>
-      </w:r>
-      <w:r>
-        <w:br/>
-      </w:r>
-      <w:r>
-        <w:rPr>
-          <w:rStyle w:val="VerbatimChar"/>
-        </w:rPr>
-        <w:t xml:space="preserve">    Internet["Internet / Intranet EMCH"] --&gt; NPM</w:t>
-      </w:r>
-      <w:r>
-        <w:br/>
-      </w:r>
-      <w:r>
-        <w:br/>
-      </w:r>
-      <w:r>
-        <w:rPr>
-          <w:rStyle w:val="VerbatimChar"/>
-        </w:rPr>
-        <w:t xml:space="preserve">    subgraph VPS["Servidor Institucional EMCH"]</w:t>
-      </w:r>
-      <w:r>
-        <w:br/>
-      </w:r>
-      <w:r>
-        <w:rPr>
-          <w:rStyle w:val="VerbatimChar"/>
-        </w:rPr>
-        <w:t xml:space="preserve">        NPM["Nginx Proxy Manager (HTTPS)"]</w:t>
-      </w:r>
-      <w:r>
-        <w:br/>
-      </w:r>
-      <w:r>
-        <w:rPr>
-          <w:rStyle w:val="VerbatimChar"/>
-        </w:rPr>
-        <w:t xml:space="preserve">        NPM --&gt;|"sgi.escuelamilitar.edu.pe"| FE["sgi-full-frontend (Nginx + React)"]</w:t>
-      </w:r>
-      <w:r>
-        <w:br/>
-      </w:r>
-      <w:r>
-        <w:rPr>
-          <w:rStyle w:val="VerbatimChar"/>
-        </w:rPr>
-        <w:t xml:space="preserve">        NPM --&gt;|"sgi-docs.escuelamilitar.edu.pe"| DOCS["sgi-full-docs (Docusaurus)"]</w:t>
-      </w:r>
-      <w:r>
-        <w:br/>
-      </w:r>
-      <w:r>
-        <w:rPr>
-          <w:rStyle w:val="VerbatimChar"/>
-        </w:rPr>
-        <w:t xml:space="preserve">        NPM --&gt;|"sgi-grafana.escuelamilitar.edu.pe"| GF["Grafana 11.5.2"]</w:t>
-      </w:r>
-      <w:r>
-        <w:br/>
-      </w:r>
-      <w:r>
-        <w:br/>
-      </w:r>
-      <w:r>
-        <w:rPr>
-          <w:rStyle w:val="VerbatimChar"/>
-        </w:rPr>
-        <w:t xml:space="preserve">        FE --&gt;|"HTTP interno /api/*"| BE["sgi-full-backend (Spring Boot)"]</w:t>
-      </w:r>
-      <w:r>
-        <w:br/>
-      </w:r>
-      <w:r>
-        <w:rPr>
-          <w:rStyle w:val="VerbatimChar"/>
-        </w:rPr>
-        <w:t xml:space="preserve">        BE --&gt; DB["sgi-full-db (MySQL 8.0)"]</w:t>
-      </w:r>
-      <w:r>
-        <w:br/>
-      </w:r>
-      <w:r>
-        <w:rPr>
-          <w:rStyle w:val="VerbatimChar"/>
-        </w:rPr>
-        <w:t xml:space="preserve">        BE --&gt; BACKUP["sgi-full-backup (mysqldump diario)"]</w:t>
-      </w:r>
-      <w:r>
-        <w:br/>
-      </w:r>
-      <w:r>
-        <w:rPr>
-          <w:rStyle w:val="VerbatimChar"/>
-        </w:rPr>
-        <w:t xml:space="preserve">        GF --- PROM["Prometheus"]</w:t>
-      </w:r>
-      <w:r>
-        <w:br/>
-      </w:r>
-      <w:r>
-        <w:rPr>
-          <w:rStyle w:val="VerbatimChar"/>
-        </w:rPr>
-        <w:t xml:space="preserve">        PROM --&gt;|"/actuator/prometheus"| BE</w:t>
-      </w:r>
-      <w:r>
-        <w:br/>
-      </w:r>
-      <w:r>
-        <w:rPr>
-          <w:rStyle w:val="VerbatimChar"/>
-        </w:rPr>
-        <w:t xml:space="preserve">    end</w:t>
-      </w:r>
-    </w:p>
-    <w:p>
-      <w:pPr>
-        <w:pStyle w:val="FirstParagraph"/>
-      </w:pPr>
-      <w:r>
-        <w:rPr>
-          <w:b/>
-          <w:bCs/>
-        </w:rPr>
-        <w:t xml:space="preserve">3.1.11.3. Diagrama de Componentes</w:t>
-      </w:r>
-    </w:p>
-    <w:p>
-      <w:pPr>
-        <w:pStyle w:val="BodyText"/>
-      </w:pPr>
-      <w:r>
-        <w:t xml:space="preserve">Las capas del backend y su relación:</w:t>
+        <w:t xml:space="preserve">Base de Datos</w:t>
+      </w:r>
+      <w:r>
+        <w:t xml:space="preserve">):</w:t>
       </w:r>
     </w:p>
     <w:tbl>
@@ -13841,6 +13527,770 @@
               <w:pStyle w:val="Compact"/>
             </w:pPr>
             <w:r>
+              <w:t xml:space="preserve">Documento</w:t>
+            </w:r>
+          </w:p>
+        </w:tc>
+        <w:tc>
+          <w:tcPr/>
+          <w:p>
+            <w:pPr>
+              <w:pStyle w:val="Compact"/>
+            </w:pPr>
+            <w:r>
+              <w:t xml:space="preserve">Sección</w:t>
+            </w:r>
+          </w:p>
+        </w:tc>
+        <w:tc>
+          <w:tcPr/>
+          <w:p>
+            <w:pPr>
+              <w:pStyle w:val="Compact"/>
+            </w:pPr>
+            <w:r>
+              <w:t xml:space="preserve">URL directa</w:t>
+            </w:r>
+          </w:p>
+        </w:tc>
+      </w:tr>
+      <w:tr>
+        <w:tc>
+          <w:tcPr/>
+          <w:p>
+            <w:pPr>
+              <w:pStyle w:val="Compact"/>
+            </w:pPr>
+            <w:r>
+              <w:t xml:space="preserve">Arquitectura de la aplicación</w:t>
+            </w:r>
+          </w:p>
+        </w:tc>
+        <w:tc>
+          <w:tcPr/>
+          <w:p>
+            <w:pPr>
+              <w:pStyle w:val="Compact"/>
+            </w:pPr>
+            <w:r>
+              <w:t xml:space="preserve">Arquitectura</w:t>
+            </w:r>
+          </w:p>
+        </w:tc>
+        <w:tc>
+          <w:tcPr/>
+          <w:p>
+            <w:pPr>
+              <w:pStyle w:val="Compact"/>
+            </w:pPr>
+            <w:r>
+              <w:t xml:space="preserve">https://sgi-docs.escuelamilitar.edu.pe/docs/arquitectura/arquitectura-aplicacion</w:t>
+            </w:r>
+          </w:p>
+        </w:tc>
+      </w:tr>
+      <w:tr>
+        <w:tc>
+          <w:tcPr/>
+          <w:p>
+            <w:pPr>
+              <w:pStyle w:val="Compact"/>
+            </w:pPr>
+            <w:r>
+              <w:t xml:space="preserve">Diagrama de despliegue</w:t>
+            </w:r>
+          </w:p>
+        </w:tc>
+        <w:tc>
+          <w:tcPr/>
+          <w:p>
+            <w:pPr>
+              <w:pStyle w:val="Compact"/>
+            </w:pPr>
+            <w:r>
+              <w:t xml:space="preserve">Arquitectura</w:t>
+            </w:r>
+          </w:p>
+        </w:tc>
+        <w:tc>
+          <w:tcPr/>
+          <w:p>
+            <w:pPr>
+              <w:pStyle w:val="Compact"/>
+            </w:pPr>
+            <w:r>
+              <w:t xml:space="preserve">https://sgi-docs.escuelamilitar.edu.pe/docs/arquitectura/diagrama-despliegue</w:t>
+            </w:r>
+          </w:p>
+        </w:tc>
+      </w:tr>
+      <w:tr>
+        <w:tc>
+          <w:tcPr/>
+          <w:p>
+            <w:pPr>
+              <w:pStyle w:val="Compact"/>
+            </w:pPr>
+            <w:r>
+              <w:t xml:space="preserve">Diagrama de componentes</w:t>
+            </w:r>
+          </w:p>
+        </w:tc>
+        <w:tc>
+          <w:tcPr/>
+          <w:p>
+            <w:pPr>
+              <w:pStyle w:val="Compact"/>
+            </w:pPr>
+            <w:r>
+              <w:t xml:space="preserve">Arquitectura</w:t>
+            </w:r>
+          </w:p>
+        </w:tc>
+        <w:tc>
+          <w:tcPr/>
+          <w:p>
+            <w:pPr>
+              <w:pStyle w:val="Compact"/>
+            </w:pPr>
+            <w:r>
+              <w:t xml:space="preserve">https://sgi-docs.escuelamilitar.edu.pe/docs/arquitectura/diagrama-componentes</w:t>
+            </w:r>
+          </w:p>
+        </w:tc>
+      </w:tr>
+      <w:tr>
+        <w:tc>
+          <w:tcPr/>
+          <w:p>
+            <w:pPr>
+              <w:pStyle w:val="Compact"/>
+            </w:pPr>
+            <w:r>
+              <w:t xml:space="preserve">Patrones de diseño</w:t>
+            </w:r>
+          </w:p>
+        </w:tc>
+        <w:tc>
+          <w:tcPr/>
+          <w:p>
+            <w:pPr>
+              <w:pStyle w:val="Compact"/>
+            </w:pPr>
+            <w:r>
+              <w:t xml:space="preserve">Arquitectura</w:t>
+            </w:r>
+          </w:p>
+        </w:tc>
+        <w:tc>
+          <w:tcPr/>
+          <w:p>
+            <w:pPr>
+              <w:pStyle w:val="Compact"/>
+            </w:pPr>
+            <w:r>
+              <w:t xml:space="preserve">https://sgi-docs.escuelamilitar.edu.pe/docs/arquitectura/patrones</w:t>
+            </w:r>
+          </w:p>
+        </w:tc>
+      </w:tr>
+      <w:tr>
+        <w:tc>
+          <w:tcPr/>
+          <w:p>
+            <w:pPr>
+              <w:pStyle w:val="Compact"/>
+            </w:pPr>
+            <w:r>
+              <w:t xml:space="preserve">Diagrama de clases</w:t>
+            </w:r>
+          </w:p>
+        </w:tc>
+        <w:tc>
+          <w:tcPr/>
+          <w:p>
+            <w:pPr>
+              <w:pStyle w:val="Compact"/>
+            </w:pPr>
+            <w:r>
+              <w:t xml:space="preserve">Arquitectura</w:t>
+            </w:r>
+          </w:p>
+        </w:tc>
+        <w:tc>
+          <w:tcPr/>
+          <w:p>
+            <w:pPr>
+              <w:pStyle w:val="Compact"/>
+            </w:pPr>
+            <w:r>
+              <w:t xml:space="preserve">https://sgi-docs.escuelamilitar.edu.pe/docs/arquitectura/diagrama-clases</w:t>
+            </w:r>
+          </w:p>
+        </w:tc>
+      </w:tr>
+      <w:tr>
+        <w:tc>
+          <w:tcPr/>
+          <w:p>
+            <w:pPr>
+              <w:pStyle w:val="Compact"/>
+            </w:pPr>
+            <w:r>
+              <w:t xml:space="preserve">Stack tecnológico</w:t>
+            </w:r>
+          </w:p>
+        </w:tc>
+        <w:tc>
+          <w:tcPr/>
+          <w:p>
+            <w:pPr>
+              <w:pStyle w:val="Compact"/>
+            </w:pPr>
+            <w:r>
+              <w:t xml:space="preserve">Arquitectura</w:t>
+            </w:r>
+          </w:p>
+        </w:tc>
+        <w:tc>
+          <w:tcPr/>
+          <w:p>
+            <w:pPr>
+              <w:pStyle w:val="Compact"/>
+            </w:pPr>
+            <w:r>
+              <w:t xml:space="preserve">https://sgi-docs.escuelamilitar.edu.pe/docs/arquitectura/stack-tecnologico</w:t>
+            </w:r>
+          </w:p>
+        </w:tc>
+      </w:tr>
+      <w:tr>
+        <w:tc>
+          <w:tcPr/>
+          <w:p>
+            <w:pPr>
+              <w:pStyle w:val="Compact"/>
+            </w:pPr>
+            <w:r>
+              <w:t xml:space="preserve">Diseño conceptual de BD</w:t>
+            </w:r>
+          </w:p>
+        </w:tc>
+        <w:tc>
+          <w:tcPr/>
+          <w:p>
+            <w:pPr>
+              <w:pStyle w:val="Compact"/>
+            </w:pPr>
+            <w:r>
+              <w:t xml:space="preserve">Base de Datos</w:t>
+            </w:r>
+          </w:p>
+        </w:tc>
+        <w:tc>
+          <w:tcPr/>
+          <w:p>
+            <w:pPr>
+              <w:pStyle w:val="Compact"/>
+            </w:pPr>
+            <w:r>
+              <w:t xml:space="preserve">https://sgi-docs.escuelamilitar.edu.pe/docs/base-de-datos/diseño-conceptual</w:t>
+            </w:r>
+          </w:p>
+        </w:tc>
+      </w:tr>
+      <w:tr>
+        <w:tc>
+          <w:tcPr/>
+          <w:p>
+            <w:pPr>
+              <w:pStyle w:val="Compact"/>
+            </w:pPr>
+            <w:r>
+              <w:t xml:space="preserve">Diseño lógico de BD</w:t>
+            </w:r>
+          </w:p>
+        </w:tc>
+        <w:tc>
+          <w:tcPr/>
+          <w:p>
+            <w:pPr>
+              <w:pStyle w:val="Compact"/>
+            </w:pPr>
+            <w:r>
+              <w:t xml:space="preserve">Base de Datos</w:t>
+            </w:r>
+          </w:p>
+        </w:tc>
+        <w:tc>
+          <w:tcPr/>
+          <w:p>
+            <w:pPr>
+              <w:pStyle w:val="Compact"/>
+            </w:pPr>
+            <w:r>
+              <w:t xml:space="preserve">https://sgi-docs.escuelamilitar.edu.pe/docs/base-de-datos/diseño-logico</w:t>
+            </w:r>
+          </w:p>
+        </w:tc>
+      </w:tr>
+      <w:tr>
+        <w:tc>
+          <w:tcPr/>
+          <w:p>
+            <w:pPr>
+              <w:pStyle w:val="Compact"/>
+            </w:pPr>
+            <w:r>
+              <w:t xml:space="preserve">Diseño físico de BD</w:t>
+            </w:r>
+          </w:p>
+        </w:tc>
+        <w:tc>
+          <w:tcPr/>
+          <w:p>
+            <w:pPr>
+              <w:pStyle w:val="Compact"/>
+            </w:pPr>
+            <w:r>
+              <w:t xml:space="preserve">Base de Datos</w:t>
+            </w:r>
+          </w:p>
+        </w:tc>
+        <w:tc>
+          <w:tcPr/>
+          <w:p>
+            <w:pPr>
+              <w:pStyle w:val="Compact"/>
+            </w:pPr>
+            <w:r>
+              <w:t xml:space="preserve">https://sgi-docs.escuelamilitar.edu.pe/docs/base-de-datos/diseño-fisico</w:t>
+            </w:r>
+          </w:p>
+        </w:tc>
+      </w:tr>
+    </w:tbl>
+    <w:p>
+      <w:pPr>
+        <w:pStyle w:val="BodyText"/>
+      </w:pPr>
+      <w:r>
+        <w:rPr>
+          <w:b/>
+          <w:bCs/>
+        </w:rPr>
+        <w:t xml:space="preserve">3.1.11.1. Diagrama de Arquitectura de Aplicaciones</w:t>
+      </w:r>
+    </w:p>
+    <w:p>
+      <w:pPr>
+        <w:pStyle w:val="SourceCode"/>
+      </w:pPr>
+      <w:r>
+        <w:rPr>
+          <w:rStyle w:val="VerbatimChar"/>
+        </w:rPr>
+        <w:t xml:space="preserve">graph TB</w:t>
+      </w:r>
+      <w:r>
+        <w:br/>
+      </w:r>
+      <w:r>
+        <w:rPr>
+          <w:rStyle w:val="VerbatimChar"/>
+        </w:rPr>
+        <w:t xml:space="preserve">    subgraph Cliente["Cliente — Navegador Web"]</w:t>
+      </w:r>
+      <w:r>
+        <w:br/>
+      </w:r>
+      <w:r>
+        <w:rPr>
+          <w:rStyle w:val="VerbatimChar"/>
+        </w:rPr>
+        <w:t xml:space="preserve">        RT["React Router (App.tsx)"]</w:t>
+      </w:r>
+      <w:r>
+        <w:br/>
+      </w:r>
+      <w:r>
+        <w:rPr>
+          <w:rStyle w:val="VerbatimChar"/>
+        </w:rPr>
+        <w:t xml:space="preserve">        PC["Componentes de página (Dashboard, Inventario, Incidentes…)"]</w:t>
+      </w:r>
+      <w:r>
+        <w:br/>
+      </w:r>
+      <w:r>
+        <w:rPr>
+          <w:rStyle w:val="VerbatimChar"/>
+        </w:rPr>
+        <w:t xml:space="preserve">        SM["Servicios (inventarioService, ticketService…)"]</w:t>
+      </w:r>
+      <w:r>
+        <w:br/>
+      </w:r>
+      <w:r>
+        <w:rPr>
+          <w:rStyle w:val="VerbatimChar"/>
+        </w:rPr>
+        <w:t xml:space="preserve">        FA["fetchWithAuth — api.ts (inyecta JWT)"]</w:t>
+      </w:r>
+      <w:r>
+        <w:br/>
+      </w:r>
+      <w:r>
+        <w:rPr>
+          <w:rStyle w:val="VerbatimChar"/>
+        </w:rPr>
+        <w:t xml:space="preserve">        RT --&gt; PC --&gt; SM --&gt; FA</w:t>
+      </w:r>
+      <w:r>
+        <w:br/>
+      </w:r>
+      <w:r>
+        <w:rPr>
+          <w:rStyle w:val="VerbatimChar"/>
+        </w:rPr>
+        <w:t xml:space="preserve">    end</w:t>
+      </w:r>
+      <w:r>
+        <w:br/>
+      </w:r>
+      <w:r>
+        <w:br/>
+      </w:r>
+      <w:r>
+        <w:rPr>
+          <w:rStyle w:val="VerbatimChar"/>
+        </w:rPr>
+        <w:t xml:space="preserve">    FA --&gt;|"HTTPS · Bearer Token"| SEC</w:t>
+      </w:r>
+      <w:r>
+        <w:br/>
+      </w:r>
+      <w:r>
+        <w:br/>
+      </w:r>
+      <w:r>
+        <w:rPr>
+          <w:rStyle w:val="VerbatimChar"/>
+        </w:rPr>
+        <w:t xml:space="preserve">    subgraph Servidor["Servidor — Spring Boot"]</w:t>
+      </w:r>
+      <w:r>
+        <w:br/>
+      </w:r>
+      <w:r>
+        <w:rPr>
+          <w:rStyle w:val="VerbatimChar"/>
+        </w:rPr>
+        <w:t xml:space="preserve">        SEC["Spring Security (JwtFilter + AuditSessionInterceptor)"]</w:t>
+      </w:r>
+      <w:r>
+        <w:br/>
+      </w:r>
+      <w:r>
+        <w:rPr>
+          <w:rStyle w:val="VerbatimChar"/>
+        </w:rPr>
+        <w:t xml:space="preserve">        CTRL["Controladores REST (@RestController)"]</w:t>
+      </w:r>
+      <w:r>
+        <w:br/>
+      </w:r>
+      <w:r>
+        <w:rPr>
+          <w:rStyle w:val="VerbatimChar"/>
+        </w:rPr>
+        <w:t xml:space="preserve">        SVC["Servicios (@Service + lógica de negocio)"]</w:t>
+      </w:r>
+      <w:r>
+        <w:br/>
+      </w:r>
+      <w:r>
+        <w:rPr>
+          <w:rStyle w:val="VerbatimChar"/>
+        </w:rPr>
+        <w:t xml:space="preserve">        CACHE["Caché Caffeine (@Cacheable / @CacheEvict)"]</w:t>
+      </w:r>
+      <w:r>
+        <w:br/>
+      </w:r>
+      <w:r>
+        <w:rPr>
+          <w:rStyle w:val="VerbatimChar"/>
+        </w:rPr>
+        <w:t xml:space="preserve">        REPO["Repositorios JPA (Spring Data)"]</w:t>
+      </w:r>
+      <w:r>
+        <w:br/>
+      </w:r>
+      <w:r>
+        <w:rPr>
+          <w:rStyle w:val="VerbatimChar"/>
+        </w:rPr>
+        <w:t xml:space="preserve">        SCHED["Scheduler (@Scheduled — SLA + stock)"]</w:t>
+      </w:r>
+      <w:r>
+        <w:br/>
+      </w:r>
+      <w:r>
+        <w:rPr>
+          <w:rStyle w:val="VerbatimChar"/>
+        </w:rPr>
+        <w:t xml:space="preserve">        NOTIF["NotificadorService"]</w:t>
+      </w:r>
+      <w:r>
+        <w:br/>
+      </w:r>
+      <w:r>
+        <w:br/>
+      </w:r>
+      <w:r>
+        <w:rPr>
+          <w:rStyle w:val="VerbatimChar"/>
+        </w:rPr>
+        <w:t xml:space="preserve">        SEC --&gt; CTRL --&gt; SVC</w:t>
+      </w:r>
+      <w:r>
+        <w:br/>
+      </w:r>
+      <w:r>
+        <w:rPr>
+          <w:rStyle w:val="VerbatimChar"/>
+        </w:rPr>
+        <w:t xml:space="preserve">        SVC --&gt; CACHE</w:t>
+      </w:r>
+      <w:r>
+        <w:br/>
+      </w:r>
+      <w:r>
+        <w:rPr>
+          <w:rStyle w:val="VerbatimChar"/>
+        </w:rPr>
+        <w:t xml:space="preserve">        SVC --&gt; REPO</w:t>
+      </w:r>
+      <w:r>
+        <w:br/>
+      </w:r>
+      <w:r>
+        <w:rPr>
+          <w:rStyle w:val="VerbatimChar"/>
+        </w:rPr>
+        <w:t xml:space="preserve">        SCHED --&gt; NOTIF --&gt; SVC</w:t>
+      </w:r>
+      <w:r>
+        <w:br/>
+      </w:r>
+      <w:r>
+        <w:rPr>
+          <w:rStyle w:val="VerbatimChar"/>
+        </w:rPr>
+        <w:t xml:space="preserve">    end</w:t>
+      </w:r>
+      <w:r>
+        <w:br/>
+      </w:r>
+      <w:r>
+        <w:br/>
+      </w:r>
+      <w:r>
+        <w:rPr>
+          <w:rStyle w:val="VerbatimChar"/>
+        </w:rPr>
+        <w:t xml:space="preserve">    REPO --&gt;|"JDBC · HikariCP"| DB[("MySQL 8.0 — db_sgi_emch")]</w:t>
+      </w:r>
+    </w:p>
+    <w:p>
+      <w:pPr>
+        <w:pStyle w:val="FirstParagraph"/>
+      </w:pPr>
+      <w:r>
+        <w:rPr>
+          <w:b/>
+          <w:bCs/>
+        </w:rPr>
+        <w:t xml:space="preserve">3.1.11.2. Diagrama de Despliegue</w:t>
+      </w:r>
+    </w:p>
+    <w:p>
+      <w:pPr>
+        <w:pStyle w:val="BodyText"/>
+      </w:pPr>
+      <w:r>
+        <w:t xml:space="preserve">El sistema se despliega mediante Docker Compose en el servidor institucional de la EMCH:</w:t>
+      </w:r>
+    </w:p>
+    <w:p>
+      <w:pPr>
+        <w:pStyle w:val="SourceCode"/>
+      </w:pPr>
+      <w:r>
+        <w:rPr>
+          <w:rStyle w:val="VerbatimChar"/>
+        </w:rPr>
+        <w:t xml:space="preserve">graph LR</w:t>
+      </w:r>
+      <w:r>
+        <w:br/>
+      </w:r>
+      <w:r>
+        <w:rPr>
+          <w:rStyle w:val="VerbatimChar"/>
+        </w:rPr>
+        <w:t xml:space="preserve">    Internet["Internet / Intranet EMCH"] --&gt; NPM</w:t>
+      </w:r>
+      <w:r>
+        <w:br/>
+      </w:r>
+      <w:r>
+        <w:br/>
+      </w:r>
+      <w:r>
+        <w:rPr>
+          <w:rStyle w:val="VerbatimChar"/>
+        </w:rPr>
+        <w:t xml:space="preserve">    subgraph VPS["Servidor Institucional EMCH"]</w:t>
+      </w:r>
+      <w:r>
+        <w:br/>
+      </w:r>
+      <w:r>
+        <w:rPr>
+          <w:rStyle w:val="VerbatimChar"/>
+        </w:rPr>
+        <w:t xml:space="preserve">        NPM["Nginx Proxy Manager (HTTPS)"]</w:t>
+      </w:r>
+      <w:r>
+        <w:br/>
+      </w:r>
+      <w:r>
+        <w:rPr>
+          <w:rStyle w:val="VerbatimChar"/>
+        </w:rPr>
+        <w:t xml:space="preserve">        NPM --&gt;|"sgi.escuelamilitar.edu.pe"| FE["sgi-full-frontend (Nginx + React)"]</w:t>
+      </w:r>
+      <w:r>
+        <w:br/>
+      </w:r>
+      <w:r>
+        <w:rPr>
+          <w:rStyle w:val="VerbatimChar"/>
+        </w:rPr>
+        <w:t xml:space="preserve">        NPM --&gt;|"sgi-docs.escuelamilitar.edu.pe"| DOCS["sgi-full-docs (Docusaurus)"]</w:t>
+      </w:r>
+      <w:r>
+        <w:br/>
+      </w:r>
+      <w:r>
+        <w:rPr>
+          <w:rStyle w:val="VerbatimChar"/>
+        </w:rPr>
+        <w:t xml:space="preserve">        NPM --&gt;|"sgi-grafana.escuelamilitar.edu.pe"| GF["Grafana 11.5.2"]</w:t>
+      </w:r>
+      <w:r>
+        <w:br/>
+      </w:r>
+      <w:r>
+        <w:br/>
+      </w:r>
+      <w:r>
+        <w:rPr>
+          <w:rStyle w:val="VerbatimChar"/>
+        </w:rPr>
+        <w:t xml:space="preserve">        FE --&gt;|"HTTP interno /api/*"| BE["sgi-full-backend (Spring Boot)"]</w:t>
+      </w:r>
+      <w:r>
+        <w:br/>
+      </w:r>
+      <w:r>
+        <w:rPr>
+          <w:rStyle w:val="VerbatimChar"/>
+        </w:rPr>
+        <w:t xml:space="preserve">        BE --&gt; DB["sgi-full-db (MySQL 8.0)"]</w:t>
+      </w:r>
+      <w:r>
+        <w:br/>
+      </w:r>
+      <w:r>
+        <w:rPr>
+          <w:rStyle w:val="VerbatimChar"/>
+        </w:rPr>
+        <w:t xml:space="preserve">        BE --&gt; BACKUP["sgi-full-backup (mysqldump diario)"]</w:t>
+      </w:r>
+      <w:r>
+        <w:br/>
+      </w:r>
+      <w:r>
+        <w:rPr>
+          <w:rStyle w:val="VerbatimChar"/>
+        </w:rPr>
+        <w:t xml:space="preserve">        GF --- PROM["Prometheus"]</w:t>
+      </w:r>
+      <w:r>
+        <w:br/>
+      </w:r>
+      <w:r>
+        <w:rPr>
+          <w:rStyle w:val="VerbatimChar"/>
+        </w:rPr>
+        <w:t xml:space="preserve">        PROM --&gt;|"/actuator/prometheus"| BE</w:t>
+      </w:r>
+      <w:r>
+        <w:br/>
+      </w:r>
+      <w:r>
+        <w:rPr>
+          <w:rStyle w:val="VerbatimChar"/>
+        </w:rPr>
+        <w:t xml:space="preserve">    end</w:t>
+      </w:r>
+    </w:p>
+    <w:p>
+      <w:pPr>
+        <w:pStyle w:val="FirstParagraph"/>
+      </w:pPr>
+      <w:r>
+        <w:rPr>
+          <w:b/>
+          <w:bCs/>
+        </w:rPr>
+        <w:t xml:space="preserve">3.1.11.3. Diagrama de Componentes</w:t>
+      </w:r>
+    </w:p>
+    <w:p>
+      <w:pPr>
+        <w:pStyle w:val="BodyText"/>
+      </w:pPr>
+      <w:r>
+        <w:t xml:space="preserve">Las capas del backend y su relación:</w:t>
+      </w:r>
+    </w:p>
+    <w:tbl>
+      <w:tblPr>
+        <w:tblStyle w:val="Table"/>
+        <w:tblW w:type="pct" w:w="5000"/>
+        <w:tblLayout w:type="fixed"/>
+        <w:tblLook w:firstRow="1" w:lastRow="0" w:firstColumn="0" w:lastColumn="0" w:noHBand="0" w:noVBand="0" w:val="0020"/>
+      </w:tblPr>
+      <w:tblGrid>
+        <w:gridCol w:w="2640"/>
+        <w:gridCol w:w="2640"/>
+        <w:gridCol w:w="2640"/>
+      </w:tblGrid>
+      <w:tr>
+        <w:trPr>
+          <w:tblHeader w:val="on"/>
+        </w:trPr>
+        <w:tc>
+          <w:tcPr/>
+          <w:p>
+            <w:pPr>
+              <w:pStyle w:val="Compact"/>
+            </w:pPr>
+            <w:r>
               <w:t xml:space="preserve">Capa</w:t>
             </w:r>
           </w:p>
@@ -14432,7 +14882,68 @@
           <w:i/>
           <w:iCs/>
         </w:rPr>
-        <w:t xml:space="preserve">(Ver documentación Docusaurus: Arquitectura &gt; Diagrama de Clases, sección Base de Datos &gt; Diseño Conceptual)</w:t>
+        <w:t xml:space="preserve">(Ver:</w:t>
+      </w:r>
+      <w:r>
+        <w:rPr>
+          <w:i/>
+          <w:iCs/>
+        </w:rPr>
+        <w:t xml:space="preserve"> </w:t>
+      </w:r>
+      <w:hyperlink r:id="rId38">
+        <w:r>
+          <w:rPr>
+            <w:rStyle w:val="Hyperlink"/>
+            <w:i/>
+            <w:iCs/>
+          </w:rPr>
+          <w:t xml:space="preserve">Diagrama de Clases</w:t>
+        </w:r>
+      </w:hyperlink>
+      <w:r>
+        <w:rPr>
+          <w:i/>
+          <w:iCs/>
+        </w:rPr>
+        <w:t xml:space="preserve"> </w:t>
+      </w:r>
+      <w:r>
+        <w:rPr>
+          <w:i/>
+          <w:iCs/>
+        </w:rPr>
+        <w:t xml:space="preserve">— sección</w:t>
+      </w:r>
+      <w:r>
+        <w:rPr>
+          <w:i/>
+          <w:iCs/>
+        </w:rPr>
+        <w:t xml:space="preserve"> </w:t>
+      </w:r>
+      <w:r>
+        <w:rPr>
+          <w:b/>
+          <w:bCs/>
+          <w:i/>
+          <w:iCs/>
+        </w:rPr>
+        <w:t xml:space="preserve">Arquitectura</w:t>
+      </w:r>
+      <w:r>
+        <w:rPr>
+          <w:i/>
+          <w:iCs/>
+        </w:rPr>
+        <w:t xml:space="preserve"> </w:t>
+      </w:r>
+      <w:r>
+        <w:rPr>
+          <w:i/>
+          <w:iCs/>
+        </w:rPr>
+        <w:t xml:space="preserve">de la documentación técnica)</w:t>
       </w:r>
     </w:p>
     <w:p>
@@ -14761,31 +15272,68 @@
           <w:i/>
           <w:iCs/>
         </w:rPr>
-        <w:t xml:space="preserve">(Ver Docusaurus: Base de Datos &gt; Diseño Conceptual — Diagrama Entidad-Relación con 15 entidades)</w:t>
-      </w:r>
-    </w:p>
-    <w:p>
-      <w:pPr>
-        <w:pStyle w:val="BodyText"/>
-      </w:pPr>
+        <w:t xml:space="preserve">(Ver:</w:t>
+      </w:r>
+      <w:r>
+        <w:rPr>
+          <w:i/>
+          <w:iCs/>
+        </w:rPr>
+        <w:t xml:space="preserve"> </w:t>
+      </w:r>
+      <w:hyperlink r:id="rId39">
+        <w:r>
+          <w:rPr>
+            <w:rStyle w:val="Hyperlink"/>
+            <w:i/>
+            <w:iCs/>
+          </w:rPr>
+          <w:t xml:space="preserve">Diseño Conceptual de BD</w:t>
+        </w:r>
+      </w:hyperlink>
+      <w:r>
+        <w:rPr>
+          <w:i/>
+          <w:iCs/>
+        </w:rPr>
+        <w:t xml:space="preserve"> </w:t>
+      </w:r>
+      <w:r>
+        <w:rPr>
+          <w:i/>
+          <w:iCs/>
+        </w:rPr>
+        <w:t xml:space="preserve">— sección</w:t>
+      </w:r>
+      <w:r>
+        <w:rPr>
+          <w:i/>
+          <w:iCs/>
+        </w:rPr>
+        <w:t xml:space="preserve"> </w:t>
+      </w:r>
       <w:r>
         <w:rPr>
           <w:b/>
           <w:bCs/>
-        </w:rPr>
-        <w:t xml:space="preserve">3.1.11.7. Diagrama Lógico de BD</w:t>
-      </w:r>
-    </w:p>
-    <w:p>
-      <w:pPr>
-        <w:pStyle w:val="BodyText"/>
-      </w:pPr>
-      <w:r>
-        <w:rPr>
           <w:i/>
           <w:iCs/>
         </w:rPr>
-        <w:t xml:space="preserve">(Ver Docusaurus: Base de Datos &gt; Diseño Lógico — Tablas con atributos, PK, FK y restricciones)</w:t>
+        <w:t xml:space="preserve">Base de Datos</w:t>
+      </w:r>
+      <w:r>
+        <w:rPr>
+          <w:i/>
+          <w:iCs/>
+        </w:rPr>
+        <w:t xml:space="preserve"> </w:t>
+      </w:r>
+      <w:r>
+        <w:rPr>
+          <w:i/>
+          <w:iCs/>
+        </w:rPr>
+        <w:t xml:space="preserve">→ Diseño Conceptual)</w:t>
       </w:r>
     </w:p>
     <w:p>
@@ -14797,7 +15345,7 @@
           <w:b/>
           <w:bCs/>
         </w:rPr>
-        <w:t xml:space="preserve">3.1.11.8. Diagrama Físico de BD</w:t>
+        <w:t xml:space="preserve">3.1.11.7. Diagrama Lógico de BD</w:t>
       </w:r>
     </w:p>
     <w:p>
@@ -14809,7 +15357,153 @@
           <w:i/>
           <w:iCs/>
         </w:rPr>
-        <w:t xml:space="preserve">(Ver Docusaurus: Base de Datos &gt; Diseño Físico — DDL completo MySQL con ENUMs, índices, triggers y vistas)</w:t>
+        <w:t xml:space="preserve">(Ver:</w:t>
+      </w:r>
+      <w:r>
+        <w:rPr>
+          <w:i/>
+          <w:iCs/>
+        </w:rPr>
+        <w:t xml:space="preserve"> </w:t>
+      </w:r>
+      <w:hyperlink r:id="rId40">
+        <w:r>
+          <w:rPr>
+            <w:rStyle w:val="Hyperlink"/>
+            <w:i/>
+            <w:iCs/>
+          </w:rPr>
+          <w:t xml:space="preserve">Diseño Lógico de BD</w:t>
+        </w:r>
+      </w:hyperlink>
+      <w:r>
+        <w:rPr>
+          <w:i/>
+          <w:iCs/>
+        </w:rPr>
+        <w:t xml:space="preserve"> </w:t>
+      </w:r>
+      <w:r>
+        <w:rPr>
+          <w:i/>
+          <w:iCs/>
+        </w:rPr>
+        <w:t xml:space="preserve">— sección</w:t>
+      </w:r>
+      <w:r>
+        <w:rPr>
+          <w:i/>
+          <w:iCs/>
+        </w:rPr>
+        <w:t xml:space="preserve"> </w:t>
+      </w:r>
+      <w:r>
+        <w:rPr>
+          <w:b/>
+          <w:bCs/>
+          <w:i/>
+          <w:iCs/>
+        </w:rPr>
+        <w:t xml:space="preserve">Base de Datos</w:t>
+      </w:r>
+      <w:r>
+        <w:rPr>
+          <w:i/>
+          <w:iCs/>
+        </w:rPr>
+        <w:t xml:space="preserve"> </w:t>
+      </w:r>
+      <w:r>
+        <w:rPr>
+          <w:i/>
+          <w:iCs/>
+        </w:rPr>
+        <w:t xml:space="preserve">→ Diseño Lógico)</w:t>
+      </w:r>
+    </w:p>
+    <w:p>
+      <w:pPr>
+        <w:pStyle w:val="BodyText"/>
+      </w:pPr>
+      <w:r>
+        <w:rPr>
+          <w:b/>
+          <w:bCs/>
+        </w:rPr>
+        <w:t xml:space="preserve">3.1.11.8. Diagrama Físico de BD</w:t>
+      </w:r>
+    </w:p>
+    <w:p>
+      <w:pPr>
+        <w:pStyle w:val="BodyText"/>
+      </w:pPr>
+      <w:r>
+        <w:rPr>
+          <w:i/>
+          <w:iCs/>
+        </w:rPr>
+        <w:t xml:space="preserve">(Ver:</w:t>
+      </w:r>
+      <w:r>
+        <w:rPr>
+          <w:i/>
+          <w:iCs/>
+        </w:rPr>
+        <w:t xml:space="preserve"> </w:t>
+      </w:r>
+      <w:hyperlink r:id="rId41">
+        <w:r>
+          <w:rPr>
+            <w:rStyle w:val="Hyperlink"/>
+            <w:i/>
+            <w:iCs/>
+          </w:rPr>
+          <w:t xml:space="preserve">Diseño Físico de BD</w:t>
+        </w:r>
+      </w:hyperlink>
+      <w:r>
+        <w:rPr>
+          <w:i/>
+          <w:iCs/>
+        </w:rPr>
+        <w:t xml:space="preserve"> </w:t>
+      </w:r>
+      <w:r>
+        <w:rPr>
+          <w:i/>
+          <w:iCs/>
+        </w:rPr>
+        <w:t xml:space="preserve">— sección</w:t>
+      </w:r>
+      <w:r>
+        <w:rPr>
+          <w:i/>
+          <w:iCs/>
+        </w:rPr>
+        <w:t xml:space="preserve"> </w:t>
+      </w:r>
+      <w:r>
+        <w:rPr>
+          <w:b/>
+          <w:bCs/>
+          <w:i/>
+          <w:iCs/>
+        </w:rPr>
+        <w:t xml:space="preserve">Base de Datos</w:t>
+      </w:r>
+      <w:r>
+        <w:rPr>
+          <w:i/>
+          <w:iCs/>
+        </w:rPr>
+        <w:t xml:space="preserve"> </w:t>
+      </w:r>
+      <w:r>
+        <w:rPr>
+          <w:i/>
+          <w:iCs/>
+        </w:rPr>
+        <w:t xml:space="preserve">→ Diseño Físico)</w:t>
       </w:r>
     </w:p>
     <w:p>
@@ -15409,9 +16103,9 @@
         </w:tc>
       </w:tr>
     </w:tbl>
-    <w:bookmarkEnd w:id="38"/>
-    <w:bookmarkEnd w:id="39"/>
-    <w:bookmarkStart w:id="42" w:name="guías"/>
+    <w:bookmarkEnd w:id="42"/>
+    <w:bookmarkEnd w:id="43"/>
+    <w:bookmarkStart w:id="46" w:name="guías"/>
     <w:p>
       <w:pPr>
         <w:pStyle w:val="Heading2"/>
@@ -15420,7 +16114,7 @@
         <w:t xml:space="preserve">3.2. Guías</w:t>
       </w:r>
     </w:p>
-    <w:bookmarkStart w:id="40" w:name="estándares-de-programación"/>
+    <w:bookmarkStart w:id="44" w:name="estándares-de-programación"/>
     <w:p>
       <w:pPr>
         <w:pStyle w:val="Heading3"/>
@@ -16696,8 +17390,8 @@
         <w:t xml:space="preserve">Commits frecuentes y atómicos (un cambio lógico por commit)</w:t>
       </w:r>
     </w:p>
-    <w:bookmarkEnd w:id="40"/>
-    <w:bookmarkStart w:id="41" w:name="manual-de-usuario"/>
+    <w:bookmarkEnd w:id="44"/>
+    <w:bookmarkStart w:id="45" w:name="manual-de-usuario"/>
     <w:p>
       <w:pPr>
         <w:pStyle w:val="Heading3"/>
@@ -16716,41 +17410,7 @@
     </w:p>
     <w:p>
       <w:pPr>
-        <w:pStyle w:val="BlockText"/>
-      </w:pPr>
-      <w:r>
-        <w:rPr>
-          <w:b/>
-          <w:bCs/>
-        </w:rPr>
-        <w:t xml:space="preserve">URL:</w:t>
-      </w:r>
-      <w:r>
-        <w:t xml:space="preserve"> </w:t>
-      </w:r>
-      <w:r>
-        <w:t xml:space="preserve">https://sgi-docs.escuelamilitar.edu.pe</w:t>
-      </w:r>
-      <w:r>
-        <w:br/>
-      </w:r>
-      <w:r>
-        <w:rPr>
-          <w:b/>
-          <w:bCs/>
-        </w:rPr>
-        <w:t xml:space="preserve">Sección:</w:t>
-      </w:r>
-      <w:r>
-        <w:t xml:space="preserve"> </w:t>
-      </w:r>
-      <w:r>
-        <w:t xml:space="preserve">Guía de Usuario</w:t>
-      </w:r>
-    </w:p>
-    <w:p>
-      <w:pPr>
-        <w:pStyle w:val="FirstParagraph"/>
+        <w:pStyle w:val="BodyText"/>
       </w:pPr>
       <w:r>
         <w:t xml:space="preserve">El manual cubre los siguientes módulos, con descripción paso a paso de cada operación disponible según el rol del usuario:</w:t>
@@ -16764,8 +17424,9 @@
         <w:tblLook w:firstRow="1" w:lastRow="0" w:firstColumn="0" w:lastColumn="0" w:noHBand="0" w:noVBand="0" w:val="0020"/>
       </w:tblPr>
       <w:tblGrid>
-        <w:gridCol w:w="3960"/>
-        <w:gridCol w:w="3960"/>
+        <w:gridCol w:w="2640"/>
+        <w:gridCol w:w="2640"/>
+        <w:gridCol w:w="2640"/>
       </w:tblGrid>
       <w:tr>
         <w:trPr>
@@ -16790,6 +17451,17 @@
             </w:pPr>
             <w:r>
               <w:t xml:space="preserve">Contenido</w:t>
+            </w:r>
+          </w:p>
+        </w:tc>
+        <w:tc>
+          <w:tcPr/>
+          <w:p>
+            <w:pPr>
+              <w:pStyle w:val="Compact"/>
+            </w:pPr>
+            <w:r>
+              <w:t xml:space="preserve">URL directa</w:t>
             </w:r>
           </w:p>
         </w:tc>
@@ -16827,6 +17499,17 @@
             </w:r>
           </w:p>
         </w:tc>
+        <w:tc>
+          <w:tcPr/>
+          <w:p>
+            <w:pPr>
+              <w:pStyle w:val="Compact"/>
+            </w:pPr>
+            <w:r>
+              <w:t xml:space="preserve">https://sgi-docs.escuelamilitar.edu.pe/docs/guia-usuario/dashboard</w:t>
+            </w:r>
+          </w:p>
+        </w:tc>
       </w:tr>
       <w:tr>
         <w:tc>
@@ -16855,6 +17538,17 @@
             </w:r>
           </w:p>
         </w:tc>
+        <w:tc>
+          <w:tcPr/>
+          <w:p>
+            <w:pPr>
+              <w:pStyle w:val="Compact"/>
+            </w:pPr>
+            <w:r>
+              <w:t xml:space="preserve">https://sgi-docs.escuelamilitar.edu.pe/docs/guia-usuario/inventario</w:t>
+            </w:r>
+          </w:p>
+        </w:tc>
       </w:tr>
       <w:tr>
         <w:tc>
@@ -16883,6 +17577,17 @@
             </w:r>
           </w:p>
         </w:tc>
+        <w:tc>
+          <w:tcPr/>
+          <w:p>
+            <w:pPr>
+              <w:pStyle w:val="Compact"/>
+            </w:pPr>
+            <w:r>
+              <w:t xml:space="preserve">https://sgi-docs.escuelamilitar.edu.pe/docs/guia-usuario/incidentes</w:t>
+            </w:r>
+          </w:p>
+        </w:tc>
       </w:tr>
       <w:tr>
         <w:tc>
@@ -16911,6 +17616,17 @@
             </w:r>
           </w:p>
         </w:tc>
+        <w:tc>
+          <w:tcPr/>
+          <w:p>
+            <w:pPr>
+              <w:pStyle w:val="Compact"/>
+            </w:pPr>
+            <w:r>
+              <w:t xml:space="preserve">https://sgi-docs.escuelamilitar.edu.pe/docs/guia-usuario/reportes</w:t>
+            </w:r>
+          </w:p>
+        </w:tc>
       </w:tr>
       <w:tr>
         <w:tc>
@@ -16939,6 +17655,17 @@
             </w:r>
           </w:p>
         </w:tc>
+        <w:tc>
+          <w:tcPr/>
+          <w:p>
+            <w:pPr>
+              <w:pStyle w:val="Compact"/>
+            </w:pPr>
+            <w:r>
+              <w:t xml:space="preserve">https://sgi-docs.escuelamilitar.edu.pe/docs/guia-usuario/notificaciones</w:t>
+            </w:r>
+          </w:p>
+        </w:tc>
       </w:tr>
       <w:tr>
         <w:tc>
@@ -16967,6 +17694,17 @@
             </w:r>
           </w:p>
         </w:tc>
+        <w:tc>
+          <w:tcPr/>
+          <w:p>
+            <w:pPr>
+              <w:pStyle w:val="Compact"/>
+            </w:pPr>
+            <w:r>
+              <w:t xml:space="preserve">https://sgi-docs.escuelamilitar.edu.pe/docs/guia-usuario/usuarios</w:t>
+            </w:r>
+          </w:p>
+        </w:tc>
       </w:tr>
       <w:tr>
         <w:tc>
@@ -16991,7 +17729,18 @@
               <w:pStyle w:val="Compact"/>
             </w:pPr>
             <w:r>
-              <w:t xml:space="preserve">Gestión de catálogos (tipos, marcas, modelos, SO, áreas), configuración de SLAs y umbrales de stock</w:t>
+              <w:t xml:space="preserve">Gestión de catálogos (tipos, marcas, modelos, SO, áreas), SLAs y umbrales de stock</w:t>
+            </w:r>
+          </w:p>
+        </w:tc>
+        <w:tc>
+          <w:tcPr/>
+          <w:p>
+            <w:pPr>
+              <w:pStyle w:val="Compact"/>
+            </w:pPr>
+            <w:r>
+              <w:t xml:space="preserve">https://sgi-docs.escuelamilitar.edu.pe/docs/guia-usuario/configuracion</w:t>
             </w:r>
           </w:p>
         </w:tc>
@@ -17004,10 +17753,10 @@
         </w:pict>
       </w:r>
     </w:p>
-    <w:bookmarkEnd w:id="41"/>
-    <w:bookmarkEnd w:id="42"/>
-    <w:bookmarkEnd w:id="43"/>
-    <w:bookmarkStart w:id="47" w:name="capítulo-4-resultados"/>
+    <w:bookmarkEnd w:id="45"/>
+    <w:bookmarkEnd w:id="46"/>
+    <w:bookmarkEnd w:id="47"/>
+    <w:bookmarkStart w:id="51" w:name="capítulo-4-resultados"/>
     <w:p>
       <w:pPr>
         <w:pStyle w:val="Heading1"/>
@@ -17016,7 +17765,7 @@
         <w:t xml:space="preserve">Capítulo 4 — RESULTADOS</w:t>
       </w:r>
     </w:p>
-    <w:bookmarkStart w:id="44" w:name="resultados-por-módulo"/>
+    <w:bookmarkStart w:id="48" w:name="resultados-por-módulo"/>
     <w:p>
       <w:pPr>
         <w:pStyle w:val="Heading2"/>
@@ -18074,8 +18823,8 @@
         </w:tc>
       </w:tr>
     </w:tbl>
-    <w:bookmarkEnd w:id="44"/>
-    <w:bookmarkStart w:id="45" w:name="presupuesto"/>
+    <w:bookmarkEnd w:id="48"/>
+    <w:bookmarkStart w:id="49" w:name="presupuesto"/>
     <w:p>
       <w:pPr>
         <w:pStyle w:val="Heading2"/>
@@ -18779,8 +19528,8 @@
         <w:t xml:space="preserve">El servidor institucional es infraestructura propia de la EMCH; los montos de mantenimiento y soporte corresponden al costo proporcional asignado al período del proyecto. No incluye costo de hardware (ya existente en la institución) ni licencias de software (todo el stack es de código abierto: Spring Boot, MySQL, React, Docker).</w:t>
       </w:r>
     </w:p>
-    <w:bookmarkEnd w:id="45"/>
-    <w:bookmarkStart w:id="46" w:name="cronograma-de-actividades"/>
+    <w:bookmarkEnd w:id="49"/>
+    <w:bookmarkStart w:id="50" w:name="cronograma-de-actividades"/>
     <w:p>
       <w:pPr>
         <w:pStyle w:val="Heading2"/>
@@ -18827,7 +19576,7 @@
         <w:rPr>
           <w:rStyle w:val="VerbatimChar"/>
         </w:rPr>
-        <w:t xml:space="preserve">    title Cronograma SGI-EMCH — Deadline: 16 julio 2026</w:t>
+        <w:t xml:space="preserve">    title Cronograma SGI-EMCH - Deadline 16 julio 2026</w:t>
       </w:r>
       <w:r>
         <w:br/>
@@ -18857,7 +19606,7 @@
         <w:rPr>
           <w:rStyle w:val="VerbatimChar"/>
         </w:rPr>
-        <w:t xml:space="preserve">    section Fase 0 — Inicio</w:t>
+        <w:t xml:space="preserve">    section Fase 0 - Inicio</w:t>
       </w:r>
       <w:r>
         <w:br/>
@@ -18866,7 +19615,7 @@
         <w:rPr>
           <w:rStyle w:val="VerbatimChar"/>
         </w:rPr>
-        <w:t xml:space="preserve">    Kick-off, arquitectura y entorno       :done,    s0,  2026-03-30, 2026-04-05</w:t>
+        <w:t xml:space="preserve">    Kick-off y arquitectura               :done,    s0,  2026-03-30, 2026-04-05</w:t>
       </w:r>
       <w:r>
         <w:br/>
@@ -18878,7 +19627,7 @@
         <w:rPr>
           <w:rStyle w:val="VerbatimChar"/>
         </w:rPr>
-        <w:t xml:space="preserve">    section Sprint 1 — Seguridad</w:t>
+        <w:t xml:space="preserve">    section Sprint 1 - Seguridad</w:t>
       </w:r>
       <w:r>
         <w:br/>
@@ -18887,7 +19636,7 @@
         <w:rPr>
           <w:rStyle w:val="VerbatimChar"/>
         </w:rPr>
-        <w:t xml:space="preserve">    Usuarios, roles y autenticación JWT    :done,    s1,  2026-04-06, 2026-04-19</w:t>
+        <w:t xml:space="preserve">    Usuarios y autenticacion JWT          :done,    s1,  2026-04-06, 2026-04-19</w:t>
       </w:r>
       <w:r>
         <w:br/>
@@ -18899,7 +19648,7 @@
         <w:rPr>
           <w:rStyle w:val="VerbatimChar"/>
         </w:rPr>
-        <w:t xml:space="preserve">    section Sprint 2 — Inventario</w:t>
+        <w:t xml:space="preserve">    section Sprint 2 - Inventario</w:t>
       </w:r>
       <w:r>
         <w:br/>
@@ -18908,7 +19657,7 @@
         <w:rPr>
           <w:rStyle w:val="VerbatimChar"/>
         </w:rPr>
-        <w:t xml:space="preserve">    Equipos, especificaciones y carga masiva :done,  s2,  2026-04-20, 2026-05-10</w:t>
+        <w:t xml:space="preserve">    Equipos y carga masiva Excel          :done,    s2,  2026-04-20, 2026-05-10</w:t>
       </w:r>
       <w:r>
         <w:br/>
@@ -18920,7 +19669,7 @@
         <w:rPr>
           <w:rStyle w:val="VerbatimChar"/>
         </w:rPr>
-        <w:t xml:space="preserve">    section Sprint 3 — Incidentes</w:t>
+        <w:t xml:space="preserve">    section Sprint 3 - Incidentes</w:t>
       </w:r>
       <w:r>
         <w:br/>
@@ -18929,7 +19678,7 @@
         <w:rPr>
           <w:rStyle w:val="VerbatimChar"/>
         </w:rPr>
-        <w:t xml:space="preserve">    Tickets, SLA y mesa de ayuda           :done,    s3,  2026-05-11, 2026-05-31</w:t>
+        <w:t xml:space="preserve">    Tickets y control de SLA              :done,    s3,  2026-05-11, 2026-05-31</w:t>
       </w:r>
       <w:r>
         <w:br/>
@@ -18941,7 +19690,7 @@
         <w:rPr>
           <w:rStyle w:val="VerbatimChar"/>
         </w:rPr>
-        <w:t xml:space="preserve">    section Sprint 4 — Reportes</w:t>
+        <w:t xml:space="preserve">    section Sprint 4 - Reportes</w:t>
       </w:r>
       <w:r>
         <w:br/>
@@ -18950,7 +19699,7 @@
         <w:rPr>
           <w:rStyle w:val="VerbatimChar"/>
         </w:rPr>
-        <w:t xml:space="preserve">    Dashboard y exportaciones Excel/PDF    :done,    s4,  2026-06-01, 2026-06-14</w:t>
+        <w:t xml:space="preserve">    Dashboard y exportaciones             :done,    s4,  2026-06-01, 2026-06-14</w:t>
       </w:r>
       <w:r>
         <w:br/>
@@ -18962,7 +19711,7 @@
         <w:rPr>
           <w:rStyle w:val="VerbatimChar"/>
         </w:rPr>
-        <w:t xml:space="preserve">    section Sprint 5 — Integración</w:t>
+        <w:t xml:space="preserve">    section Sprint 5 - Integracion</w:t>
       </w:r>
       <w:r>
         <w:br/>
@@ -18971,7 +19720,7 @@
         <w:rPr>
           <w:rStyle w:val="VerbatimChar"/>
         </w:rPr>
-        <w:t xml:space="preserve">    Notificaciones, monitoreo y documentación :done, s5,  2026-06-15, 2026-06-28</w:t>
+        <w:t xml:space="preserve">    Notificaciones y monitoreo            :done,    s5,  2026-06-15, 2026-06-28</w:t>
       </w:r>
       <w:r>
         <w:br/>
@@ -18983,7 +19732,7 @@
         <w:rPr>
           <w:rStyle w:val="VerbatimChar"/>
         </w:rPr>
-        <w:t xml:space="preserve">    section Sprint 6 — Cierre</w:t>
+        <w:t xml:space="preserve">    section Sprint 6 - Cierre</w:t>
       </w:r>
       <w:r>
         <w:br/>
@@ -18992,7 +19741,7 @@
         <w:rPr>
           <w:rStyle w:val="VerbatimChar"/>
         </w:rPr>
-        <w:t xml:space="preserve">    UAT y módulo bajas/transferencias      :active,  s6a, 2026-06-29, 2026-07-09</w:t>
+        <w:t xml:space="preserve">    UAT y modulo de bajas                 :active,  s6a, 2026-06-29, 2026-07-09</w:t>
       </w:r>
       <w:r>
         <w:br/>
@@ -19001,7 +19750,7 @@
         <w:rPr>
           <w:rStyle w:val="VerbatimChar"/>
         </w:rPr>
-        <w:t xml:space="preserve">    Entrega final y firma de acta          :         s6b, 2026-07-09, 2026-07-16</w:t>
+        <w:t xml:space="preserve">    Entrega final y firma de acta         :crit,    s6b, 2026-07-09, 2026-07-16</w:t>
       </w:r>
     </w:p>
     <w:p>
@@ -19397,9 +20146,9 @@
         </w:pict>
       </w:r>
     </w:p>
-    <w:bookmarkEnd w:id="46"/>
-    <w:bookmarkEnd w:id="47"/>
-    <w:bookmarkStart w:id="48" w:name="conclusiones"/>
+    <w:bookmarkEnd w:id="50"/>
+    <w:bookmarkEnd w:id="51"/>
+    <w:bookmarkStart w:id="52" w:name="conclusiones"/>
     <w:p>
       <w:pPr>
         <w:pStyle w:val="Heading1"/>
@@ -19541,8 +20290,8 @@
         </w:pict>
       </w:r>
     </w:p>
-    <w:bookmarkEnd w:id="48"/>
-    <w:bookmarkStart w:id="49" w:name="recomendaciones"/>
+    <w:bookmarkEnd w:id="52"/>
+    <w:bookmarkStart w:id="53" w:name="recomendaciones"/>
     <w:p>
       <w:pPr>
         <w:pStyle w:val="Heading1"/>
@@ -19708,8 +20457,8 @@
         </w:pict>
       </w:r>
     </w:p>
-    <w:bookmarkEnd w:id="49"/>
-    <w:bookmarkStart w:id="50" w:name="bibliografías"/>
+    <w:bookmarkEnd w:id="53"/>
+    <w:bookmarkStart w:id="54" w:name="bibliografías"/>
     <w:p>
       <w:pPr>
         <w:pStyle w:val="Heading1"/>
@@ -20013,8 +20762,8 @@
         </w:pict>
       </w:r>
     </w:p>
-    <w:bookmarkEnd w:id="50"/>
-    <w:bookmarkStart w:id="56" w:name="anexos"/>
+    <w:bookmarkEnd w:id="54"/>
+    <w:bookmarkStart w:id="62" w:name="anexos"/>
     <w:p>
       <w:pPr>
         <w:pStyle w:val="Heading1"/>
@@ -20023,7 +20772,7 @@
         <w:t xml:space="preserve">ANEXOS</w:t>
       </w:r>
     </w:p>
-    <w:bookmarkStart w:id="51" w:name="Xbc2c30da8015f3f9b8ceeb4d04f4643f95fb512"/>
+    <w:bookmarkStart w:id="55" w:name="Xbc2c30da8015f3f9b8ceeb4d04f4643f95fb512"/>
     <w:p>
       <w:pPr>
         <w:pStyle w:val="Heading2"/>
@@ -20100,8 +20849,8 @@
         <w:t xml:space="preserve">Pariona Torres, Jonas Efrain</w:t>
       </w:r>
     </w:p>
-    <w:bookmarkEnd w:id="51"/>
-    <w:bookmarkStart w:id="52" w:name="Xd2ec90dad6a07b1e45a8074554b2faf389a727d"/>
+    <w:bookmarkEnd w:id="55"/>
+    <w:bookmarkStart w:id="56" w:name="Xd2ec90dad6a07b1e45a8074554b2faf389a727d"/>
     <w:p>
       <w:pPr>
         <w:pStyle w:val="Heading2"/>
@@ -20153,8 +20902,8 @@
         <w:t xml:space="preserve">Aprobado por el equipo — implementación en Sprint 6.</w:t>
       </w:r>
     </w:p>
-    <w:bookmarkEnd w:id="52"/>
-    <w:bookmarkStart w:id="53" w:name="X90feec8a79a48e702175af1db1240d7cd0809f8"/>
+    <w:bookmarkEnd w:id="56"/>
+    <w:bookmarkStart w:id="57" w:name="X90feec8a79a48e702175af1db1240d7cd0809f8"/>
     <w:p>
       <w:pPr>
         <w:pStyle w:val="Heading2"/>
@@ -20188,8 +20937,8 @@
         <w:t xml:space="preserve">El SRS fue elaborado bajo el estándar IEEE Std 830-1998 / ISO/IEC/IEEE 29148:2018 e incluye: catálogo de 22 historias de usuario, 20 requisitos no funcionales, 7 restricciones técnicas, casos de uso UML, SLAs por tipo de incidente, KPIs del sistema y cronograma Scrum completo.</w:t>
       </w:r>
     </w:p>
-    <w:bookmarkEnd w:id="53"/>
-    <w:bookmarkStart w:id="54" w:name="anexo-4-product-backlog-completo"/>
+    <w:bookmarkEnd w:id="57"/>
+    <w:bookmarkStart w:id="58" w:name="anexo-4-product-backlog-completo"/>
     <w:p>
       <w:pPr>
         <w:pStyle w:val="Heading2"/>
@@ -20206,39 +20955,1153 @@
         <w:t xml:space="preserve">Ver sección 3.1.2 del presente informe y documento SRS.md (sección de requisitos funcionales).</w:t>
       </w:r>
     </w:p>
-    <w:bookmarkEnd w:id="54"/>
-    <w:bookmarkStart w:id="55" w:name="anexo-5-documentación-técnica-en-línea"/>
+    <w:bookmarkEnd w:id="58"/>
+    <w:bookmarkStart w:id="61" w:name="anexo-5-recursos-del-proyecto-en-línea"/>
     <w:p>
       <w:pPr>
         <w:pStyle w:val="Heading2"/>
       </w:pPr>
       <w:r>
-        <w:t xml:space="preserve">Anexo 5: Documentación Técnica en Línea</w:t>
-      </w:r>
-    </w:p>
-    <w:p>
-      <w:pPr>
-        <w:pStyle w:val="FirstParagraph"/>
-      </w:pPr>
-      <w:r>
-        <w:t xml:space="preserve">La documentación completa del sistema SGI-EMCH, incluyendo guías de usuario, guías de administrador, referencia de API y documentación de arquitectura, está disponible en:</w:t>
-      </w:r>
-    </w:p>
-    <w:p>
-      <w:pPr>
-        <w:pStyle w:val="BlockText"/>
-      </w:pPr>
-      <w:r>
-        <w:rPr>
-          <w:b/>
-          <w:bCs/>
-        </w:rPr>
-        <w:t xml:space="preserve">https://sgi-docs.escuelamilitar.edu.pe</w:t>
-      </w:r>
-    </w:p>
-    <w:p>
-      <w:pPr>
-        <w:pStyle w:val="FirstParagraph"/>
+        <w:t xml:space="preserve">Anexo 5: Recursos del Proyecto en Línea</w:t>
+      </w:r>
+    </w:p>
+    <w:bookmarkStart w:id="59" w:name="sistema-en-producción-y-repositorio"/>
+    <w:p>
+      <w:pPr>
+        <w:pStyle w:val="Heading3"/>
+      </w:pPr>
+      <w:r>
+        <w:t xml:space="preserve">Sistema en producción y repositorio</w:t>
+      </w:r>
+    </w:p>
+    <w:tbl>
+      <w:tblPr>
+        <w:tblStyle w:val="Table"/>
+        <w:tblW w:type="pct" w:w="5000"/>
+        <w:tblLayout w:type="fixed"/>
+        <w:tblLook w:firstRow="1" w:lastRow="0" w:firstColumn="0" w:lastColumn="0" w:noHBand="0" w:noVBand="0" w:val="0020"/>
+      </w:tblPr>
+      <w:tblGrid>
+        <w:gridCol w:w="3960"/>
+        <w:gridCol w:w="3960"/>
+      </w:tblGrid>
+      <w:tr>
+        <w:trPr>
+          <w:tblHeader w:val="on"/>
+        </w:trPr>
+        <w:tc>
+          <w:tcPr/>
+          <w:p>
+            <w:pPr>
+              <w:pStyle w:val="Compact"/>
+            </w:pPr>
+            <w:r>
+              <w:t xml:space="preserve">Recurso</w:t>
+            </w:r>
+          </w:p>
+        </w:tc>
+        <w:tc>
+          <w:tcPr/>
+          <w:p>
+            <w:pPr>
+              <w:pStyle w:val="Compact"/>
+            </w:pPr>
+            <w:r>
+              <w:t xml:space="preserve">URL</w:t>
+            </w:r>
+          </w:p>
+        </w:tc>
+      </w:tr>
+      <w:tr>
+        <w:tc>
+          <w:tcPr/>
+          <w:p>
+            <w:pPr>
+              <w:pStyle w:val="Compact"/>
+            </w:pPr>
+            <w:r>
+              <w:rPr>
+                <w:b/>
+                <w:bCs/>
+              </w:rPr>
+              <w:t xml:space="preserve">Sistema SGI-EMCH</w:t>
+            </w:r>
+            <w:r>
+              <w:t xml:space="preserve"> </w:t>
+            </w:r>
+            <w:r>
+              <w:t xml:space="preserve">(acceso con credenciales DTIC)</w:t>
+            </w:r>
+          </w:p>
+        </w:tc>
+        <w:tc>
+          <w:tcPr/>
+          <w:p>
+            <w:pPr>
+              <w:pStyle w:val="Compact"/>
+            </w:pPr>
+            <w:r>
+              <w:t xml:space="preserve">https://sgi.escuelamilitar.edu.pe</w:t>
+            </w:r>
+          </w:p>
+        </w:tc>
+      </w:tr>
+      <w:tr>
+        <w:tc>
+          <w:tcPr/>
+          <w:p>
+            <w:pPr>
+              <w:pStyle w:val="Compact"/>
+            </w:pPr>
+            <w:r>
+              <w:rPr>
+                <w:b/>
+                <w:bCs/>
+              </w:rPr>
+              <w:t xml:space="preserve">Documentación técnica</w:t>
+            </w:r>
+            <w:r>
+              <w:t xml:space="preserve"> </w:t>
+            </w:r>
+            <w:r>
+              <w:t xml:space="preserve">(Docusaurus 3.5.2)</w:t>
+            </w:r>
+          </w:p>
+        </w:tc>
+        <w:tc>
+          <w:tcPr/>
+          <w:p>
+            <w:pPr>
+              <w:pStyle w:val="Compact"/>
+            </w:pPr>
+            <w:r>
+              <w:t xml:space="preserve">https://sgi-docs.escuelamilitar.edu.pe</w:t>
+            </w:r>
+          </w:p>
+        </w:tc>
+      </w:tr>
+      <w:tr>
+        <w:tc>
+          <w:tcPr/>
+          <w:p>
+            <w:pPr>
+              <w:pStyle w:val="Compact"/>
+            </w:pPr>
+            <w:r>
+              <w:rPr>
+                <w:b/>
+                <w:bCs/>
+              </w:rPr>
+              <w:t xml:space="preserve">Monitoreo Grafana</w:t>
+            </w:r>
+            <w:r>
+              <w:t xml:space="preserve"> </w:t>
+            </w:r>
+            <w:r>
+              <w:t xml:space="preserve">(acceso restringido DTIC)</w:t>
+            </w:r>
+          </w:p>
+        </w:tc>
+        <w:tc>
+          <w:tcPr/>
+          <w:p>
+            <w:pPr>
+              <w:pStyle w:val="Compact"/>
+            </w:pPr>
+            <w:r>
+              <w:t xml:space="preserve">https://sgi-grafana.escuelamilitar.edu.pe</w:t>
+            </w:r>
+          </w:p>
+        </w:tc>
+      </w:tr>
+      <w:tr>
+        <w:tc>
+          <w:tcPr/>
+          <w:p>
+            <w:pPr>
+              <w:pStyle w:val="Compact"/>
+            </w:pPr>
+            <w:r>
+              <w:rPr>
+                <w:b/>
+                <w:bCs/>
+              </w:rPr>
+              <w:t xml:space="preserve">Repositorio de código fuente</w:t>
+            </w:r>
+          </w:p>
+        </w:tc>
+        <w:tc>
+          <w:tcPr/>
+          <w:p>
+            <w:pPr>
+              <w:pStyle w:val="Compact"/>
+            </w:pPr>
+            <w:r>
+              <w:t xml:space="preserve">https://github.com/Jnasus/sgi-emch</w:t>
+            </w:r>
+          </w:p>
+        </w:tc>
+      </w:tr>
+    </w:tbl>
+    <w:bookmarkEnd w:id="59"/>
+    <w:bookmarkStart w:id="60" w:name="X12c40eea7cf55be893f7b62c85c6cbf9502e7d8"/>
+    <w:p>
+      <w:pPr>
+        <w:pStyle w:val="Heading3"/>
+      </w:pPr>
+      <w:r>
+        <w:t xml:space="preserve">Índice completo de la documentación técnica</w:t>
+      </w:r>
+    </w:p>
+    <w:tbl>
+      <w:tblPr>
+        <w:tblStyle w:val="Table"/>
+        <w:tblW w:type="pct" w:w="5000"/>
+        <w:tblLayout w:type="fixed"/>
+        <w:tblLook w:firstRow="1" w:lastRow="0" w:firstColumn="0" w:lastColumn="0" w:noHBand="0" w:noVBand="0" w:val="0020"/>
+      </w:tblPr>
+      <w:tblGrid>
+        <w:gridCol w:w="2640"/>
+        <w:gridCol w:w="2640"/>
+        <w:gridCol w:w="2640"/>
+      </w:tblGrid>
+      <w:tr>
+        <w:trPr>
+          <w:tblHeader w:val="on"/>
+        </w:trPr>
+        <w:tc>
+          <w:tcPr/>
+          <w:p>
+            <w:pPr>
+              <w:pStyle w:val="Compact"/>
+            </w:pPr>
+            <w:r>
+              <w:t xml:space="preserve">Sección</w:t>
+            </w:r>
+          </w:p>
+        </w:tc>
+        <w:tc>
+          <w:tcPr/>
+          <w:p>
+            <w:pPr>
+              <w:pStyle w:val="Compact"/>
+            </w:pPr>
+            <w:r>
+              <w:t xml:space="preserve">Documento</w:t>
+            </w:r>
+          </w:p>
+        </w:tc>
+        <w:tc>
+          <w:tcPr/>
+          <w:p>
+            <w:pPr>
+              <w:pStyle w:val="Compact"/>
+            </w:pPr>
+            <w:r>
+              <w:t xml:space="preserve">URL directa</w:t>
+            </w:r>
+          </w:p>
+        </w:tc>
+      </w:tr>
+      <w:tr>
+        <w:tc>
+          <w:tcPr/>
+          <w:p>
+            <w:pPr>
+              <w:pStyle w:val="Compact"/>
+            </w:pPr>
+            <w:r>
+              <w:t xml:space="preserve">Introducción</w:t>
+            </w:r>
+          </w:p>
+        </w:tc>
+        <w:tc>
+          <w:tcPr/>
+          <w:p>
+            <w:pPr>
+              <w:pStyle w:val="Compact"/>
+            </w:pPr>
+            <w:r>
+              <w:t xml:space="preserve">Introducción al SGI-EMCH</w:t>
+            </w:r>
+          </w:p>
+        </w:tc>
+        <w:tc>
+          <w:tcPr/>
+          <w:p>
+            <w:pPr>
+              <w:pStyle w:val="Compact"/>
+            </w:pPr>
+            <w:r>
+              <w:t xml:space="preserve">https://sgi-docs.escuelamilitar.edu.pe/docs/intro</w:t>
+            </w:r>
+          </w:p>
+        </w:tc>
+      </w:tr>
+      <w:tr>
+        <w:tc>
+          <w:tcPr/>
+          <w:p>
+            <w:pPr>
+              <w:pStyle w:val="Compact"/>
+            </w:pPr>
+            <w:r>
+              <w:rPr>
+                <w:b/>
+                <w:bCs/>
+              </w:rPr>
+              <w:t xml:space="preserve">Arquitectura</w:t>
+            </w:r>
+          </w:p>
+        </w:tc>
+        <w:tc>
+          <w:tcPr/>
+          <w:p>
+            <w:pPr>
+              <w:pStyle w:val="Compact"/>
+            </w:pPr>
+            <w:r>
+              <w:t xml:space="preserve">Arquitectura de la aplicación</w:t>
+            </w:r>
+          </w:p>
+        </w:tc>
+        <w:tc>
+          <w:tcPr/>
+          <w:p>
+            <w:pPr>
+              <w:pStyle w:val="Compact"/>
+            </w:pPr>
+            <w:r>
+              <w:t xml:space="preserve">https://sgi-docs.escuelamilitar.edu.pe/docs/arquitectura/arquitectura-aplicacion</w:t>
+            </w:r>
+          </w:p>
+        </w:tc>
+      </w:tr>
+      <w:tr>
+        <w:tc>
+          <w:tcPr/>
+          <w:p>
+            <w:pPr>
+              <w:pStyle w:val="Compact"/>
+            </w:pPr>
+            <w:r>
+              <w:t xml:space="preserve">Arquitectura</w:t>
+            </w:r>
+          </w:p>
+        </w:tc>
+        <w:tc>
+          <w:tcPr/>
+          <w:p>
+            <w:pPr>
+              <w:pStyle w:val="Compact"/>
+            </w:pPr>
+            <w:r>
+              <w:t xml:space="preserve">Stack tecnológico</w:t>
+            </w:r>
+          </w:p>
+        </w:tc>
+        <w:tc>
+          <w:tcPr/>
+          <w:p>
+            <w:pPr>
+              <w:pStyle w:val="Compact"/>
+            </w:pPr>
+            <w:r>
+              <w:t xml:space="preserve">https://sgi-docs.escuelamilitar.edu.pe/docs/arquitectura/stack-tecnologico</w:t>
+            </w:r>
+          </w:p>
+        </w:tc>
+      </w:tr>
+      <w:tr>
+        <w:tc>
+          <w:tcPr/>
+          <w:p>
+            <w:pPr>
+              <w:pStyle w:val="Compact"/>
+            </w:pPr>
+            <w:r>
+              <w:t xml:space="preserve">Arquitectura</w:t>
+            </w:r>
+          </w:p>
+        </w:tc>
+        <w:tc>
+          <w:tcPr/>
+          <w:p>
+            <w:pPr>
+              <w:pStyle w:val="Compact"/>
+            </w:pPr>
+            <w:r>
+              <w:t xml:space="preserve">Estructura del proyecto</w:t>
+            </w:r>
+          </w:p>
+        </w:tc>
+        <w:tc>
+          <w:tcPr/>
+          <w:p>
+            <w:pPr>
+              <w:pStyle w:val="Compact"/>
+            </w:pPr>
+            <w:r>
+              <w:t xml:space="preserve">https://sgi-docs.escuelamilitar.edu.pe/docs/arquitectura/estructura-del-proyecto</w:t>
+            </w:r>
+          </w:p>
+        </w:tc>
+      </w:tr>
+      <w:tr>
+        <w:tc>
+          <w:tcPr/>
+          <w:p>
+            <w:pPr>
+              <w:pStyle w:val="Compact"/>
+            </w:pPr>
+            <w:r>
+              <w:t xml:space="preserve">Arquitectura</w:t>
+            </w:r>
+          </w:p>
+        </w:tc>
+        <w:tc>
+          <w:tcPr/>
+          <w:p>
+            <w:pPr>
+              <w:pStyle w:val="Compact"/>
+            </w:pPr>
+            <w:r>
+              <w:t xml:space="preserve">Diagrama de despliegue</w:t>
+            </w:r>
+          </w:p>
+        </w:tc>
+        <w:tc>
+          <w:tcPr/>
+          <w:p>
+            <w:pPr>
+              <w:pStyle w:val="Compact"/>
+            </w:pPr>
+            <w:r>
+              <w:t xml:space="preserve">https://sgi-docs.escuelamilitar.edu.pe/docs/arquitectura/diagrama-despliegue</w:t>
+            </w:r>
+          </w:p>
+        </w:tc>
+      </w:tr>
+      <w:tr>
+        <w:tc>
+          <w:tcPr/>
+          <w:p>
+            <w:pPr>
+              <w:pStyle w:val="Compact"/>
+            </w:pPr>
+            <w:r>
+              <w:t xml:space="preserve">Arquitectura</w:t>
+            </w:r>
+          </w:p>
+        </w:tc>
+        <w:tc>
+          <w:tcPr/>
+          <w:p>
+            <w:pPr>
+              <w:pStyle w:val="Compact"/>
+            </w:pPr>
+            <w:r>
+              <w:t xml:space="preserve">Diagrama de componentes</w:t>
+            </w:r>
+          </w:p>
+        </w:tc>
+        <w:tc>
+          <w:tcPr/>
+          <w:p>
+            <w:pPr>
+              <w:pStyle w:val="Compact"/>
+            </w:pPr>
+            <w:r>
+              <w:t xml:space="preserve">https://sgi-docs.escuelamilitar.edu.pe/docs/arquitectura/diagrama-componentes</w:t>
+            </w:r>
+          </w:p>
+        </w:tc>
+      </w:tr>
+      <w:tr>
+        <w:tc>
+          <w:tcPr/>
+          <w:p>
+            <w:pPr>
+              <w:pStyle w:val="Compact"/>
+            </w:pPr>
+            <w:r>
+              <w:t xml:space="preserve">Arquitectura</w:t>
+            </w:r>
+          </w:p>
+        </w:tc>
+        <w:tc>
+          <w:tcPr/>
+          <w:p>
+            <w:pPr>
+              <w:pStyle w:val="Compact"/>
+            </w:pPr>
+            <w:r>
+              <w:t xml:space="preserve">Patrones de diseño</w:t>
+            </w:r>
+          </w:p>
+        </w:tc>
+        <w:tc>
+          <w:tcPr/>
+          <w:p>
+            <w:pPr>
+              <w:pStyle w:val="Compact"/>
+            </w:pPr>
+            <w:r>
+              <w:t xml:space="preserve">https://sgi-docs.escuelamilitar.edu.pe/docs/arquitectura/patrones</w:t>
+            </w:r>
+          </w:p>
+        </w:tc>
+      </w:tr>
+      <w:tr>
+        <w:tc>
+          <w:tcPr/>
+          <w:p>
+            <w:pPr>
+              <w:pStyle w:val="Compact"/>
+            </w:pPr>
+            <w:r>
+              <w:t xml:space="preserve">Arquitectura</w:t>
+            </w:r>
+          </w:p>
+        </w:tc>
+        <w:tc>
+          <w:tcPr/>
+          <w:p>
+            <w:pPr>
+              <w:pStyle w:val="Compact"/>
+            </w:pPr>
+            <w:r>
+              <w:t xml:space="preserve">Diagrama de clases</w:t>
+            </w:r>
+          </w:p>
+        </w:tc>
+        <w:tc>
+          <w:tcPr/>
+          <w:p>
+            <w:pPr>
+              <w:pStyle w:val="Compact"/>
+            </w:pPr>
+            <w:r>
+              <w:t xml:space="preserve">https://sgi-docs.escuelamilitar.edu.pe/docs/arquitectura/diagrama-clases</w:t>
+            </w:r>
+          </w:p>
+        </w:tc>
+      </w:tr>
+      <w:tr>
+        <w:tc>
+          <w:tcPr/>
+          <w:p>
+            <w:pPr>
+              <w:pStyle w:val="Compact"/>
+            </w:pPr>
+            <w:r>
+              <w:rPr>
+                <w:b/>
+                <w:bCs/>
+              </w:rPr>
+              <w:t xml:space="preserve">Base de Datos</w:t>
+            </w:r>
+          </w:p>
+        </w:tc>
+        <w:tc>
+          <w:tcPr/>
+          <w:p>
+            <w:pPr>
+              <w:pStyle w:val="Compact"/>
+            </w:pPr>
+            <w:r>
+              <w:t xml:space="preserve">Diseño conceptual</w:t>
+            </w:r>
+          </w:p>
+        </w:tc>
+        <w:tc>
+          <w:tcPr/>
+          <w:p>
+            <w:pPr>
+              <w:pStyle w:val="Compact"/>
+            </w:pPr>
+            <w:r>
+              <w:t xml:space="preserve">https://sgi-docs.escuelamilitar.edu.pe/docs/base-de-datos/diseño-conceptual</w:t>
+            </w:r>
+          </w:p>
+        </w:tc>
+      </w:tr>
+      <w:tr>
+        <w:tc>
+          <w:tcPr/>
+          <w:p>
+            <w:pPr>
+              <w:pStyle w:val="Compact"/>
+            </w:pPr>
+            <w:r>
+              <w:t xml:space="preserve">Base de Datos</w:t>
+            </w:r>
+          </w:p>
+        </w:tc>
+        <w:tc>
+          <w:tcPr/>
+          <w:p>
+            <w:pPr>
+              <w:pStyle w:val="Compact"/>
+            </w:pPr>
+            <w:r>
+              <w:t xml:space="preserve">Diseño lógico</w:t>
+            </w:r>
+          </w:p>
+        </w:tc>
+        <w:tc>
+          <w:tcPr/>
+          <w:p>
+            <w:pPr>
+              <w:pStyle w:val="Compact"/>
+            </w:pPr>
+            <w:r>
+              <w:t xml:space="preserve">https://sgi-docs.escuelamilitar.edu.pe/docs/base-de-datos/diseño-logico</w:t>
+            </w:r>
+          </w:p>
+        </w:tc>
+      </w:tr>
+      <w:tr>
+        <w:tc>
+          <w:tcPr/>
+          <w:p>
+            <w:pPr>
+              <w:pStyle w:val="Compact"/>
+            </w:pPr>
+            <w:r>
+              <w:t xml:space="preserve">Base de Datos</w:t>
+            </w:r>
+          </w:p>
+        </w:tc>
+        <w:tc>
+          <w:tcPr/>
+          <w:p>
+            <w:pPr>
+              <w:pStyle w:val="Compact"/>
+            </w:pPr>
+            <w:r>
+              <w:t xml:space="preserve">Diseño físico</w:t>
+            </w:r>
+          </w:p>
+        </w:tc>
+        <w:tc>
+          <w:tcPr/>
+          <w:p>
+            <w:pPr>
+              <w:pStyle w:val="Compact"/>
+            </w:pPr>
+            <w:r>
+              <w:t xml:space="preserve">https://sgi-docs.escuelamilitar.edu.pe/docs/base-de-datos/diseño-fisico</w:t>
+            </w:r>
+          </w:p>
+        </w:tc>
+      </w:tr>
+      <w:tr>
+        <w:tc>
+          <w:tcPr/>
+          <w:p>
+            <w:pPr>
+              <w:pStyle w:val="Compact"/>
+            </w:pPr>
+            <w:r>
+              <w:rPr>
+                <w:b/>
+                <w:bCs/>
+              </w:rPr>
+              <w:t xml:space="preserve">Guía de Usuario</w:t>
+            </w:r>
+          </w:p>
+        </w:tc>
+        <w:tc>
+          <w:tcPr/>
+          <w:p>
+            <w:pPr>
+              <w:pStyle w:val="Compact"/>
+            </w:pPr>
+            <w:r>
+              <w:t xml:space="preserve">Dashboard</w:t>
+            </w:r>
+          </w:p>
+        </w:tc>
+        <w:tc>
+          <w:tcPr/>
+          <w:p>
+            <w:pPr>
+              <w:pStyle w:val="Compact"/>
+            </w:pPr>
+            <w:r>
+              <w:t xml:space="preserve">https://sgi-docs.escuelamilitar.edu.pe/docs/guia-usuario/dashboard</w:t>
+            </w:r>
+          </w:p>
+        </w:tc>
+      </w:tr>
+      <w:tr>
+        <w:tc>
+          <w:tcPr/>
+          <w:p>
+            <w:pPr>
+              <w:pStyle w:val="Compact"/>
+            </w:pPr>
+            <w:r>
+              <w:t xml:space="preserve">Guía de Usuario</w:t>
+            </w:r>
+          </w:p>
+        </w:tc>
+        <w:tc>
+          <w:tcPr/>
+          <w:p>
+            <w:pPr>
+              <w:pStyle w:val="Compact"/>
+            </w:pPr>
+            <w:r>
+              <w:t xml:space="preserve">Inventario</w:t>
+            </w:r>
+          </w:p>
+        </w:tc>
+        <w:tc>
+          <w:tcPr/>
+          <w:p>
+            <w:pPr>
+              <w:pStyle w:val="Compact"/>
+            </w:pPr>
+            <w:r>
+              <w:t xml:space="preserve">https://sgi-docs.escuelamilitar.edu.pe/docs/guia-usuario/inventario</w:t>
+            </w:r>
+          </w:p>
+        </w:tc>
+      </w:tr>
+      <w:tr>
+        <w:tc>
+          <w:tcPr/>
+          <w:p>
+            <w:pPr>
+              <w:pStyle w:val="Compact"/>
+            </w:pPr>
+            <w:r>
+              <w:t xml:space="preserve">Guía de Usuario</w:t>
+            </w:r>
+          </w:p>
+        </w:tc>
+        <w:tc>
+          <w:tcPr/>
+          <w:p>
+            <w:pPr>
+              <w:pStyle w:val="Compact"/>
+            </w:pPr>
+            <w:r>
+              <w:t xml:space="preserve">Incidentes</w:t>
+            </w:r>
+          </w:p>
+        </w:tc>
+        <w:tc>
+          <w:tcPr/>
+          <w:p>
+            <w:pPr>
+              <w:pStyle w:val="Compact"/>
+            </w:pPr>
+            <w:r>
+              <w:t xml:space="preserve">https://sgi-docs.escuelamilitar.edu.pe/docs/guia-usuario/incidentes</w:t>
+            </w:r>
+          </w:p>
+        </w:tc>
+      </w:tr>
+      <w:tr>
+        <w:tc>
+          <w:tcPr/>
+          <w:p>
+            <w:pPr>
+              <w:pStyle w:val="Compact"/>
+            </w:pPr>
+            <w:r>
+              <w:t xml:space="preserve">Guía de Usuario</w:t>
+            </w:r>
+          </w:p>
+        </w:tc>
+        <w:tc>
+          <w:tcPr/>
+          <w:p>
+            <w:pPr>
+              <w:pStyle w:val="Compact"/>
+            </w:pPr>
+            <w:r>
+              <w:t xml:space="preserve">Reportes</w:t>
+            </w:r>
+          </w:p>
+        </w:tc>
+        <w:tc>
+          <w:tcPr/>
+          <w:p>
+            <w:pPr>
+              <w:pStyle w:val="Compact"/>
+            </w:pPr>
+            <w:r>
+              <w:t xml:space="preserve">https://sgi-docs.escuelamilitar.edu.pe/docs/guia-usuario/reportes</w:t>
+            </w:r>
+          </w:p>
+        </w:tc>
+      </w:tr>
+      <w:tr>
+        <w:tc>
+          <w:tcPr/>
+          <w:p>
+            <w:pPr>
+              <w:pStyle w:val="Compact"/>
+            </w:pPr>
+            <w:r>
+              <w:t xml:space="preserve">Guía de Usuario</w:t>
+            </w:r>
+          </w:p>
+        </w:tc>
+        <w:tc>
+          <w:tcPr/>
+          <w:p>
+            <w:pPr>
+              <w:pStyle w:val="Compact"/>
+            </w:pPr>
+            <w:r>
+              <w:t xml:space="preserve">Notificaciones</w:t>
+            </w:r>
+          </w:p>
+        </w:tc>
+        <w:tc>
+          <w:tcPr/>
+          <w:p>
+            <w:pPr>
+              <w:pStyle w:val="Compact"/>
+            </w:pPr>
+            <w:r>
+              <w:t xml:space="preserve">https://sgi-docs.escuelamilitar.edu.pe/docs/guia-usuario/notificaciones</w:t>
+            </w:r>
+          </w:p>
+        </w:tc>
+      </w:tr>
+      <w:tr>
+        <w:tc>
+          <w:tcPr/>
+          <w:p>
+            <w:pPr>
+              <w:pStyle w:val="Compact"/>
+            </w:pPr>
+            <w:r>
+              <w:t xml:space="preserve">Guía de Usuario</w:t>
+            </w:r>
+          </w:p>
+        </w:tc>
+        <w:tc>
+          <w:tcPr/>
+          <w:p>
+            <w:pPr>
+              <w:pStyle w:val="Compact"/>
+            </w:pPr>
+            <w:r>
+              <w:t xml:space="preserve">Usuarios</w:t>
+            </w:r>
+          </w:p>
+        </w:tc>
+        <w:tc>
+          <w:tcPr/>
+          <w:p>
+            <w:pPr>
+              <w:pStyle w:val="Compact"/>
+            </w:pPr>
+            <w:r>
+              <w:t xml:space="preserve">https://sgi-docs.escuelamilitar.edu.pe/docs/guia-usuario/usuarios</w:t>
+            </w:r>
+          </w:p>
+        </w:tc>
+      </w:tr>
+      <w:tr>
+        <w:tc>
+          <w:tcPr/>
+          <w:p>
+            <w:pPr>
+              <w:pStyle w:val="Compact"/>
+            </w:pPr>
+            <w:r>
+              <w:t xml:space="preserve">Guía de Usuario</w:t>
+            </w:r>
+          </w:p>
+        </w:tc>
+        <w:tc>
+          <w:tcPr/>
+          <w:p>
+            <w:pPr>
+              <w:pStyle w:val="Compact"/>
+            </w:pPr>
+            <w:r>
+              <w:t xml:space="preserve">Configuración</w:t>
+            </w:r>
+          </w:p>
+        </w:tc>
+        <w:tc>
+          <w:tcPr/>
+          <w:p>
+            <w:pPr>
+              <w:pStyle w:val="Compact"/>
+            </w:pPr>
+            <w:r>
+              <w:t xml:space="preserve">https://sgi-docs.escuelamilitar.edu.pe/docs/guia-usuario/configuracion</w:t>
+            </w:r>
+          </w:p>
+        </w:tc>
+      </w:tr>
+      <w:tr>
+        <w:tc>
+          <w:tcPr/>
+          <w:p>
+            <w:pPr>
+              <w:pStyle w:val="Compact"/>
+            </w:pPr>
+            <w:r>
+              <w:rPr>
+                <w:b/>
+                <w:bCs/>
+              </w:rPr>
+              <w:t xml:space="preserve">Guía de Administrador</w:t>
+            </w:r>
+          </w:p>
+        </w:tc>
+        <w:tc>
+          <w:tcPr/>
+          <w:p>
+            <w:pPr>
+              <w:pStyle w:val="Compact"/>
+            </w:pPr>
+            <w:r>
+              <w:t xml:space="preserve">Monitoreo (Prometheus + Grafana)</w:t>
+            </w:r>
+          </w:p>
+        </w:tc>
+        <w:tc>
+          <w:tcPr/>
+          <w:p>
+            <w:pPr>
+              <w:pStyle w:val="Compact"/>
+            </w:pPr>
+            <w:r>
+              <w:t xml:space="preserve">https://sgi-docs.escuelamilitar.edu.pe/docs/guia-admin/monitoreo</w:t>
+            </w:r>
+          </w:p>
+        </w:tc>
+      </w:tr>
+      <w:tr>
+        <w:tc>
+          <w:tcPr/>
+          <w:p>
+            <w:pPr>
+              <w:pStyle w:val="Compact"/>
+            </w:pPr>
+            <w:r>
+              <w:t xml:space="preserve">Guía de Administrador</w:t>
+            </w:r>
+          </w:p>
+        </w:tc>
+        <w:tc>
+          <w:tcPr/>
+          <w:p>
+            <w:pPr>
+              <w:pStyle w:val="Compact"/>
+            </w:pPr>
+            <w:r>
+              <w:t xml:space="preserve">Backups automáticos</w:t>
+            </w:r>
+          </w:p>
+        </w:tc>
+        <w:tc>
+          <w:tcPr/>
+          <w:p>
+            <w:pPr>
+              <w:pStyle w:val="Compact"/>
+            </w:pPr>
+            <w:r>
+              <w:t xml:space="preserve">https://sgi-docs.escuelamilitar.edu.pe/docs/guia-admin/backups</w:t>
+            </w:r>
+          </w:p>
+        </w:tc>
+      </w:tr>
+      <w:tr>
+        <w:tc>
+          <w:tcPr/>
+          <w:p>
+            <w:pPr>
+              <w:pStyle w:val="Compact"/>
+            </w:pPr>
+            <w:r>
+              <w:t xml:space="preserve">Guía de Administrador</w:t>
+            </w:r>
+          </w:p>
+        </w:tc>
+        <w:tc>
+          <w:tcPr/>
+          <w:p>
+            <w:pPr>
+              <w:pStyle w:val="Compact"/>
+            </w:pPr>
+            <w:r>
+              <w:t xml:space="preserve">Caché en memoria (Caffeine)</w:t>
+            </w:r>
+          </w:p>
+        </w:tc>
+        <w:tc>
+          <w:tcPr/>
+          <w:p>
+            <w:pPr>
+              <w:pStyle w:val="Compact"/>
+            </w:pPr>
+            <w:r>
+              <w:t xml:space="preserve">https://sgi-docs.escuelamilitar.edu.pe/docs/guia-admin/cache</w:t>
+            </w:r>
+          </w:p>
+        </w:tc>
+      </w:tr>
+      <w:tr>
+        <w:tc>
+          <w:tcPr/>
+          <w:p>
+            <w:pPr>
+              <w:pStyle w:val="Compact"/>
+            </w:pPr>
+            <w:r>
+              <w:t xml:space="preserve">Guía de Administrador</w:t>
+            </w:r>
+          </w:p>
+        </w:tc>
+        <w:tc>
+          <w:tcPr/>
+          <w:p>
+            <w:pPr>
+              <w:pStyle w:val="Compact"/>
+            </w:pPr>
+            <w:r>
+              <w:t xml:space="preserve">Variables de entorno</w:t>
+            </w:r>
+          </w:p>
+        </w:tc>
+        <w:tc>
+          <w:tcPr/>
+          <w:p>
+            <w:pPr>
+              <w:pStyle w:val="Compact"/>
+            </w:pPr>
+            <w:r>
+              <w:t xml:space="preserve">https://sgi-docs.escuelamilitar.edu.pe/docs/guia-admin/variables-entorno</w:t>
+            </w:r>
+          </w:p>
+        </w:tc>
+      </w:tr>
+      <w:tr>
+        <w:tc>
+          <w:tcPr/>
+          <w:p>
+            <w:pPr>
+              <w:pStyle w:val="Compact"/>
+            </w:pPr>
+            <w:r>
+              <w:t xml:space="preserve">Guía de Administrador</w:t>
+            </w:r>
+          </w:p>
+        </w:tc>
+        <w:tc>
+          <w:tcPr/>
+          <w:p>
+            <w:pPr>
+              <w:pStyle w:val="Compact"/>
+            </w:pPr>
+            <w:r>
+              <w:t xml:space="preserve">Nginx Proxy Manager</w:t>
+            </w:r>
+          </w:p>
+        </w:tc>
+        <w:tc>
+          <w:tcPr/>
+          <w:p>
+            <w:pPr>
+              <w:pStyle w:val="Compact"/>
+            </w:pPr>
+            <w:r>
+              <w:t xml:space="preserve">https://sgi-docs.escuelamilitar.edu.pe/docs/guia-admin/nginx-proxy-manager</w:t>
+            </w:r>
+          </w:p>
+        </w:tc>
+      </w:tr>
+      <w:tr>
+        <w:tc>
+          <w:tcPr/>
+          <w:p>
+            <w:pPr>
+              <w:pStyle w:val="Compact"/>
+            </w:pPr>
+            <w:r>
+              <w:rPr>
+                <w:b/>
+                <w:bCs/>
+              </w:rPr>
+              <w:t xml:space="preserve">API REST</w:t>
+            </w:r>
+          </w:p>
+        </w:tc>
+        <w:tc>
+          <w:tcPr/>
+          <w:p>
+            <w:pPr>
+              <w:pStyle w:val="Compact"/>
+            </w:pPr>
+            <w:r>
+              <w:t xml:space="preserve">Visión general de la API</w:t>
+            </w:r>
+          </w:p>
+        </w:tc>
+        <w:tc>
+          <w:tcPr/>
+          <w:p>
+            <w:pPr>
+              <w:pStyle w:val="Compact"/>
+            </w:pPr>
+            <w:r>
+              <w:t xml:space="preserve">https://sgi-docs.escuelamilitar.edu.pe/docs/api/overview</w:t>
+            </w:r>
+          </w:p>
+        </w:tc>
+      </w:tr>
+      <w:tr>
+        <w:tc>
+          <w:tcPr/>
+          <w:p>
+            <w:pPr>
+              <w:pStyle w:val="Compact"/>
+            </w:pPr>
+            <w:r>
+              <w:t xml:space="preserve">API REST</w:t>
+            </w:r>
+          </w:p>
+        </w:tc>
+        <w:tc>
+          <w:tcPr/>
+          <w:p>
+            <w:pPr>
+              <w:pStyle w:val="Compact"/>
+            </w:pPr>
+            <w:r>
+              <w:t xml:space="preserve">Endpoints principales</w:t>
+            </w:r>
+          </w:p>
+        </w:tc>
+        <w:tc>
+          <w:tcPr/>
+          <w:p>
+            <w:pPr>
+              <w:pStyle w:val="Compact"/>
+            </w:pPr>
+            <w:r>
+              <w:t xml:space="preserve">https://sgi-docs.escuelamilitar.edu.pe/docs/api/endpoints-principales</w:t>
+            </w:r>
+          </w:p>
+        </w:tc>
+      </w:tr>
+    </w:tbl>
+    <w:p>
+      <w:pPr>
+        <w:pStyle w:val="BodyText"/>
       </w:pPr>
       <w:r>
         <w:t xml:space="preserve">El sitio de documentación es un contenedor Docker independiente (Docusaurus 3.5.2) desplegado en el mismo servidor institucional, con soporte de diagramas Mermaid para visualización de arquitectura y base de datos.</w:t>
@@ -20303,8 +22166,9 @@
         <w:t xml:space="preserve">| Sprint 6 — Junio/Julio 2026</w:t>
       </w:r>
     </w:p>
-    <w:bookmarkEnd w:id="55"/>
-    <w:bookmarkEnd w:id="56"/>
+    <w:bookmarkEnd w:id="60"/>
+    <w:bookmarkEnd w:id="61"/>
+    <w:bookmarkEnd w:id="62"/>
     <w:sectPr>
       <w:footnotePr>
         <w:numRestart w:val="eachSect"/>

</xml_diff>

<commit_message>
fix(informe): replace Gantt mermaid block with PNG - Cursor extension 1.32.1 incompatible with gantt diagrams
</commit_message>
<xml_diff>
--- a/markdown/informe_3.docx
+++ b/markdown/informe_3.docx
@@ -13584,7 +13584,7 @@
               <w:pStyle w:val="Compact"/>
             </w:pPr>
             <w:r>
-              <w:t xml:space="preserve">https://sgi-docs.escuelamilitar.edu.pe/docs/arquitectura/arquitectura-aplicacion</w:t>
+              <w:t xml:space="preserve">https://sgi-docs.escuelamilitar.edu.pe/arquitectura/arquitectura-aplicacion</w:t>
             </w:r>
           </w:p>
         </w:tc>
@@ -13619,7 +13619,7 @@
               <w:pStyle w:val="Compact"/>
             </w:pPr>
             <w:r>
-              <w:t xml:space="preserve">https://sgi-docs.escuelamilitar.edu.pe/docs/arquitectura/diagrama-despliegue</w:t>
+              <w:t xml:space="preserve">https://sgi-docs.escuelamilitar.edu.pe/arquitectura/diagrama-despliegue</w:t>
             </w:r>
           </w:p>
         </w:tc>
@@ -13654,7 +13654,7 @@
               <w:pStyle w:val="Compact"/>
             </w:pPr>
             <w:r>
-              <w:t xml:space="preserve">https://sgi-docs.escuelamilitar.edu.pe/docs/arquitectura/diagrama-componentes</w:t>
+              <w:t xml:space="preserve">https://sgi-docs.escuelamilitar.edu.pe/arquitectura/diagrama-componentes</w:t>
             </w:r>
           </w:p>
         </w:tc>
@@ -13689,7 +13689,7 @@
               <w:pStyle w:val="Compact"/>
             </w:pPr>
             <w:r>
-              <w:t xml:space="preserve">https://sgi-docs.escuelamilitar.edu.pe/docs/arquitectura/patrones</w:t>
+              <w:t xml:space="preserve">https://sgi-docs.escuelamilitar.edu.pe/arquitectura/patrones</w:t>
             </w:r>
           </w:p>
         </w:tc>
@@ -13724,7 +13724,7 @@
               <w:pStyle w:val="Compact"/>
             </w:pPr>
             <w:r>
-              <w:t xml:space="preserve">https://sgi-docs.escuelamilitar.edu.pe/docs/arquitectura/diagrama-clases</w:t>
+              <w:t xml:space="preserve">https://sgi-docs.escuelamilitar.edu.pe/arquitectura/diagrama-clases</w:t>
             </w:r>
           </w:p>
         </w:tc>
@@ -13759,7 +13759,7 @@
               <w:pStyle w:val="Compact"/>
             </w:pPr>
             <w:r>
-              <w:t xml:space="preserve">https://sgi-docs.escuelamilitar.edu.pe/docs/arquitectura/stack-tecnologico</w:t>
+              <w:t xml:space="preserve">https://sgi-docs.escuelamilitar.edu.pe/arquitectura/stack-tecnologico</w:t>
             </w:r>
           </w:p>
         </w:tc>
@@ -13794,7 +13794,7 @@
               <w:pStyle w:val="Compact"/>
             </w:pPr>
             <w:r>
-              <w:t xml:space="preserve">https://sgi-docs.escuelamilitar.edu.pe/docs/base-de-datos/diseño-conceptual</w:t>
+              <w:t xml:space="preserve">https://sgi-docs.escuelamilitar.edu.pe/base-de-datos/diseño-conceptual</w:t>
             </w:r>
           </w:p>
         </w:tc>
@@ -13829,7 +13829,7 @@
               <w:pStyle w:val="Compact"/>
             </w:pPr>
             <w:r>
-              <w:t xml:space="preserve">https://sgi-docs.escuelamilitar.edu.pe/docs/base-de-datos/diseño-logico</w:t>
+              <w:t xml:space="preserve">https://sgi-docs.escuelamilitar.edu.pe/base-de-datos/diseño-logico</w:t>
             </w:r>
           </w:p>
         </w:tc>
@@ -13864,7 +13864,7 @@
               <w:pStyle w:val="Compact"/>
             </w:pPr>
             <w:r>
-              <w:t xml:space="preserve">https://sgi-docs.escuelamilitar.edu.pe/docs/base-de-datos/diseño-fisico</w:t>
+              <w:t xml:space="preserve">https://sgi-docs.escuelamilitar.edu.pe/base-de-datos/diseño-fisico</w:t>
             </w:r>
           </w:p>
         </w:tc>
@@ -17506,7 +17506,7 @@
               <w:pStyle w:val="Compact"/>
             </w:pPr>
             <w:r>
-              <w:t xml:space="preserve">https://sgi-docs.escuelamilitar.edu.pe/docs/guia-usuario/dashboard</w:t>
+              <w:t xml:space="preserve">https://sgi-docs.escuelamilitar.edu.pe/guia-usuario/dashboard</w:t>
             </w:r>
           </w:p>
         </w:tc>
@@ -17545,7 +17545,7 @@
               <w:pStyle w:val="Compact"/>
             </w:pPr>
             <w:r>
-              <w:t xml:space="preserve">https://sgi-docs.escuelamilitar.edu.pe/docs/guia-usuario/inventario</w:t>
+              <w:t xml:space="preserve">https://sgi-docs.escuelamilitar.edu.pe/guia-usuario/inventario</w:t>
             </w:r>
           </w:p>
         </w:tc>
@@ -17584,7 +17584,7 @@
               <w:pStyle w:val="Compact"/>
             </w:pPr>
             <w:r>
-              <w:t xml:space="preserve">https://sgi-docs.escuelamilitar.edu.pe/docs/guia-usuario/incidentes</w:t>
+              <w:t xml:space="preserve">https://sgi-docs.escuelamilitar.edu.pe/guia-usuario/incidentes</w:t>
             </w:r>
           </w:p>
         </w:tc>
@@ -17623,7 +17623,7 @@
               <w:pStyle w:val="Compact"/>
             </w:pPr>
             <w:r>
-              <w:t xml:space="preserve">https://sgi-docs.escuelamilitar.edu.pe/docs/guia-usuario/reportes</w:t>
+              <w:t xml:space="preserve">https://sgi-docs.escuelamilitar.edu.pe/guia-usuario/reportes</w:t>
             </w:r>
           </w:p>
         </w:tc>
@@ -17662,7 +17662,7 @@
               <w:pStyle w:val="Compact"/>
             </w:pPr>
             <w:r>
-              <w:t xml:space="preserve">https://sgi-docs.escuelamilitar.edu.pe/docs/guia-usuario/notificaciones</w:t>
+              <w:t xml:space="preserve">https://sgi-docs.escuelamilitar.edu.pe/guia-usuario/notificaciones</w:t>
             </w:r>
           </w:p>
         </w:tc>
@@ -17701,7 +17701,7 @@
               <w:pStyle w:val="Compact"/>
             </w:pPr>
             <w:r>
-              <w:t xml:space="preserve">https://sgi-docs.escuelamilitar.edu.pe/docs/guia-usuario/usuarios</w:t>
+              <w:t xml:space="preserve">https://sgi-docs.escuelamilitar.edu.pe/guia-usuario/usuarios</w:t>
             </w:r>
           </w:p>
         </w:tc>
@@ -17740,7 +17740,7 @@
               <w:pStyle w:val="Compact"/>
             </w:pPr>
             <w:r>
-              <w:t xml:space="preserve">https://sgi-docs.escuelamilitar.edu.pe/docs/guia-usuario/configuracion</w:t>
+              <w:t xml:space="preserve">https://sgi-docs.escuelamilitar.edu.pe/guia-usuario/configuracion</w:t>
             </w:r>
           </w:p>
         </w:tc>
@@ -17756,7 +17756,7 @@
     <w:bookmarkEnd w:id="45"/>
     <w:bookmarkEnd w:id="46"/>
     <w:bookmarkEnd w:id="47"/>
-    <w:bookmarkStart w:id="51" w:name="capítulo-4-resultados"/>
+    <w:bookmarkStart w:id="54" w:name="capítulo-4-resultados"/>
     <w:p>
       <w:pPr>
         <w:pStyle w:val="Heading1"/>
@@ -19529,7 +19529,7 @@
       </w:r>
     </w:p>
     <w:bookmarkEnd w:id="49"/>
-    <w:bookmarkStart w:id="50" w:name="cronograma-de-actividades"/>
+    <w:bookmarkStart w:id="53" w:name="cronograma-de-actividades"/>
     <w:p>
       <w:pPr>
         <w:pStyle w:val="Heading2"/>
@@ -19561,201 +19561,62 @@
     </w:p>
     <w:p>
       <w:pPr>
-        <w:pStyle w:val="SourceCode"/>
-      </w:pPr>
-      <w:r>
-        <w:rPr>
-          <w:rStyle w:val="VerbatimChar"/>
-        </w:rPr>
-        <w:t xml:space="preserve">gantt</w:t>
-      </w:r>
-      <w:r>
-        <w:br/>
-      </w:r>
-      <w:r>
-        <w:rPr>
-          <w:rStyle w:val="VerbatimChar"/>
-        </w:rPr>
-        <w:t xml:space="preserve">    title Cronograma SGI-EMCH - Deadline 16 julio 2026</w:t>
-      </w:r>
-      <w:r>
-        <w:br/>
-      </w:r>
-      <w:r>
-        <w:rPr>
-          <w:rStyle w:val="VerbatimChar"/>
-        </w:rPr>
-        <w:t xml:space="preserve">    dateFormat  YYYY-MM-DD</w:t>
-      </w:r>
-      <w:r>
-        <w:br/>
-      </w:r>
-      <w:r>
-        <w:rPr>
-          <w:rStyle w:val="VerbatimChar"/>
-        </w:rPr>
-        <w:t xml:space="preserve">    axisFormat  %d/%m/%y</w:t>
-      </w:r>
-      <w:r>
-        <w:br/>
-      </w:r>
-      <w:r>
-        <w:br/>
-      </w:r>
-      <w:r>
-        <w:rPr>
-          <w:rStyle w:val="VerbatimChar"/>
-        </w:rPr>
-        <w:t xml:space="preserve">    section Fase 0 - Inicio</w:t>
-      </w:r>
-      <w:r>
-        <w:br/>
-      </w:r>
-      <w:r>
-        <w:rPr>
-          <w:rStyle w:val="VerbatimChar"/>
-        </w:rPr>
-        <w:t xml:space="preserve">    Kick-off y arquitectura               :done,    s0,  2026-03-30, 2026-04-05</w:t>
-      </w:r>
-      <w:r>
-        <w:br/>
-      </w:r>
-      <w:r>
-        <w:br/>
-      </w:r>
-      <w:r>
-        <w:rPr>
-          <w:rStyle w:val="VerbatimChar"/>
-        </w:rPr>
-        <w:t xml:space="preserve">    section Sprint 1 - Seguridad</w:t>
-      </w:r>
-      <w:r>
-        <w:br/>
-      </w:r>
-      <w:r>
-        <w:rPr>
-          <w:rStyle w:val="VerbatimChar"/>
-        </w:rPr>
-        <w:t xml:space="preserve">    Usuarios y autenticacion JWT          :done,    s1,  2026-04-06, 2026-04-19</w:t>
-      </w:r>
-      <w:r>
-        <w:br/>
-      </w:r>
-      <w:r>
-        <w:br/>
-      </w:r>
-      <w:r>
-        <w:rPr>
-          <w:rStyle w:val="VerbatimChar"/>
-        </w:rPr>
-        <w:t xml:space="preserve">    section Sprint 2 - Inventario</w:t>
-      </w:r>
-      <w:r>
-        <w:br/>
-      </w:r>
-      <w:r>
-        <w:rPr>
-          <w:rStyle w:val="VerbatimChar"/>
-        </w:rPr>
-        <w:t xml:space="preserve">    Equipos y carga masiva Excel          :done,    s2,  2026-04-20, 2026-05-10</w:t>
-      </w:r>
-      <w:r>
-        <w:br/>
-      </w:r>
-      <w:r>
-        <w:br/>
-      </w:r>
-      <w:r>
-        <w:rPr>
-          <w:rStyle w:val="VerbatimChar"/>
-        </w:rPr>
-        <w:t xml:space="preserve">    section Sprint 3 - Incidentes</w:t>
-      </w:r>
-      <w:r>
-        <w:br/>
-      </w:r>
-      <w:r>
-        <w:rPr>
-          <w:rStyle w:val="VerbatimChar"/>
-        </w:rPr>
-        <w:t xml:space="preserve">    Tickets y control de SLA              :done,    s3,  2026-05-11, 2026-05-31</w:t>
-      </w:r>
-      <w:r>
-        <w:br/>
-      </w:r>
-      <w:r>
-        <w:br/>
-      </w:r>
-      <w:r>
-        <w:rPr>
-          <w:rStyle w:val="VerbatimChar"/>
-        </w:rPr>
-        <w:t xml:space="preserve">    section Sprint 4 - Reportes</w:t>
-      </w:r>
-      <w:r>
-        <w:br/>
-      </w:r>
-      <w:r>
-        <w:rPr>
-          <w:rStyle w:val="VerbatimChar"/>
-        </w:rPr>
-        <w:t xml:space="preserve">    Dashboard y exportaciones             :done,    s4,  2026-06-01, 2026-06-14</w:t>
-      </w:r>
-      <w:r>
-        <w:br/>
-      </w:r>
-      <w:r>
-        <w:br/>
-      </w:r>
-      <w:r>
-        <w:rPr>
-          <w:rStyle w:val="VerbatimChar"/>
-        </w:rPr>
-        <w:t xml:space="preserve">    section Sprint 5 - Integracion</w:t>
-      </w:r>
-      <w:r>
-        <w:br/>
-      </w:r>
-      <w:r>
-        <w:rPr>
-          <w:rStyle w:val="VerbatimChar"/>
-        </w:rPr>
-        <w:t xml:space="preserve">    Notificaciones y monitoreo            :done,    s5,  2026-06-15, 2026-06-28</w:t>
-      </w:r>
-      <w:r>
-        <w:br/>
-      </w:r>
-      <w:r>
-        <w:br/>
-      </w:r>
-      <w:r>
-        <w:rPr>
-          <w:rStyle w:val="VerbatimChar"/>
-        </w:rPr>
-        <w:t xml:space="preserve">    section Sprint 6 - Cierre</w:t>
-      </w:r>
-      <w:r>
-        <w:br/>
-      </w:r>
-      <w:r>
-        <w:rPr>
-          <w:rStyle w:val="VerbatimChar"/>
-        </w:rPr>
-        <w:t xml:space="preserve">    UAT y modulo de bajas                 :active,  s6a, 2026-06-29, 2026-07-09</w:t>
-      </w:r>
-      <w:r>
-        <w:br/>
-      </w:r>
-      <w:r>
-        <w:rPr>
-          <w:rStyle w:val="VerbatimChar"/>
-        </w:rPr>
-        <w:t xml:space="preserve">    Entrega final y firma de acta         :crit,    s6b, 2026-07-09, 2026-07-16</w:t>
-      </w:r>
-    </w:p>
-    <w:p>
-      <w:pPr>
-        <w:pStyle w:val="FirstParagraph"/>
+        <w:pStyle w:val="CaptionedFigure"/>
+      </w:pPr>
+      <w:r>
+        <w:drawing>
+          <wp:inline>
+            <wp:extent cx="5334000" cy="1315479"/>
+            <wp:effectExtent b="0" l="0" r="0" t="0"/>
+            <wp:docPr descr="Cronograma SGI-EMCH — Gantt Sprint 0 al Sprint 6" title="" id="51" name="Picture"/>
+            <a:graphic>
+              <a:graphicData uri="http://schemas.openxmlformats.org/drawingml/2006/picture">
+                <pic:pic>
+                  <pic:nvPicPr>
+                    <pic:cNvPr descr="gantt_cronograma.png" id="52" name="Picture"/>
+                    <pic:cNvPicPr>
+                      <a:picLocks noChangeArrowheads="1" noChangeAspect="1"/>
+                    </pic:cNvPicPr>
+                  </pic:nvPicPr>
+                  <pic:blipFill>
+                    <a:blip r:embed="rId50"/>
+                    <a:stretch>
+                      <a:fillRect/>
+                    </a:stretch>
+                  </pic:blipFill>
+                  <pic:spPr bwMode="auto">
+                    <a:xfrm>
+                      <a:off x="0" y="0"/>
+                      <a:ext cx="5334000" cy="1315479"/>
+                    </a:xfrm>
+                    <a:prstGeom prst="rect">
+                      <a:avLst/>
+                    </a:prstGeom>
+                    <a:noFill/>
+                    <a:ln w="9525">
+                      <a:noFill/>
+                      <a:headEnd/>
+                      <a:tailEnd/>
+                    </a:ln>
+                  </pic:spPr>
+                </pic:pic>
+              </a:graphicData>
+            </a:graphic>
+          </wp:inline>
+        </w:drawing>
+      </w:r>
+    </w:p>
+    <w:p>
+      <w:pPr>
+        <w:pStyle w:val="ImageCaption"/>
+      </w:pPr>
+      <w:r>
+        <w:t xml:space="preserve">Cronograma SGI-EMCH — Gantt Sprint 0 al Sprint 6</w:t>
+      </w:r>
+    </w:p>
+    <w:p>
+      <w:pPr>
+        <w:pStyle w:val="BodyText"/>
       </w:pPr>
       <w:r>
         <w:rPr>
@@ -20146,9 +20007,9 @@
         </w:pict>
       </w:r>
     </w:p>
-    <w:bookmarkEnd w:id="50"/>
-    <w:bookmarkEnd w:id="51"/>
-    <w:bookmarkStart w:id="52" w:name="conclusiones"/>
+    <w:bookmarkEnd w:id="53"/>
+    <w:bookmarkEnd w:id="54"/>
+    <w:bookmarkStart w:id="55" w:name="conclusiones"/>
     <w:p>
       <w:pPr>
         <w:pStyle w:val="Heading1"/>
@@ -20290,8 +20151,8 @@
         </w:pict>
       </w:r>
     </w:p>
-    <w:bookmarkEnd w:id="52"/>
-    <w:bookmarkStart w:id="53" w:name="recomendaciones"/>
+    <w:bookmarkEnd w:id="55"/>
+    <w:bookmarkStart w:id="56" w:name="recomendaciones"/>
     <w:p>
       <w:pPr>
         <w:pStyle w:val="Heading1"/>
@@ -20457,8 +20318,8 @@
         </w:pict>
       </w:r>
     </w:p>
-    <w:bookmarkEnd w:id="53"/>
-    <w:bookmarkStart w:id="54" w:name="bibliografías"/>
+    <w:bookmarkEnd w:id="56"/>
+    <w:bookmarkStart w:id="57" w:name="bibliografías"/>
     <w:p>
       <w:pPr>
         <w:pStyle w:val="Heading1"/>
@@ -20762,8 +20623,8 @@
         </w:pict>
       </w:r>
     </w:p>
-    <w:bookmarkEnd w:id="54"/>
-    <w:bookmarkStart w:id="62" w:name="anexos"/>
+    <w:bookmarkEnd w:id="57"/>
+    <w:bookmarkStart w:id="65" w:name="anexos"/>
     <w:p>
       <w:pPr>
         <w:pStyle w:val="Heading1"/>
@@ -20772,7 +20633,7 @@
         <w:t xml:space="preserve">ANEXOS</w:t>
       </w:r>
     </w:p>
-    <w:bookmarkStart w:id="55" w:name="Xbc2c30da8015f3f9b8ceeb4d04f4643f95fb512"/>
+    <w:bookmarkStart w:id="58" w:name="Xbc2c30da8015f3f9b8ceeb4d04f4643f95fb512"/>
     <w:p>
       <w:pPr>
         <w:pStyle w:val="Heading2"/>
@@ -20849,8 +20710,8 @@
         <w:t xml:space="preserve">Pariona Torres, Jonas Efrain</w:t>
       </w:r>
     </w:p>
-    <w:bookmarkEnd w:id="55"/>
-    <w:bookmarkStart w:id="56" w:name="Xd2ec90dad6a07b1e45a8074554b2faf389a727d"/>
+    <w:bookmarkEnd w:id="58"/>
+    <w:bookmarkStart w:id="59" w:name="Xd2ec90dad6a07b1e45a8074554b2faf389a727d"/>
     <w:p>
       <w:pPr>
         <w:pStyle w:val="Heading2"/>
@@ -20902,8 +20763,8 @@
         <w:t xml:space="preserve">Aprobado por el equipo — implementación en Sprint 6.</w:t>
       </w:r>
     </w:p>
-    <w:bookmarkEnd w:id="56"/>
-    <w:bookmarkStart w:id="57" w:name="X90feec8a79a48e702175af1db1240d7cd0809f8"/>
+    <w:bookmarkEnd w:id="59"/>
+    <w:bookmarkStart w:id="60" w:name="X90feec8a79a48e702175af1db1240d7cd0809f8"/>
     <w:p>
       <w:pPr>
         <w:pStyle w:val="Heading2"/>
@@ -20937,8 +20798,8 @@
         <w:t xml:space="preserve">El SRS fue elaborado bajo el estándar IEEE Std 830-1998 / ISO/IEC/IEEE 29148:2018 e incluye: catálogo de 22 historias de usuario, 20 requisitos no funcionales, 7 restricciones técnicas, casos de uso UML, SLAs por tipo de incidente, KPIs del sistema y cronograma Scrum completo.</w:t>
       </w:r>
     </w:p>
-    <w:bookmarkEnd w:id="57"/>
-    <w:bookmarkStart w:id="58" w:name="anexo-4-product-backlog-completo"/>
+    <w:bookmarkEnd w:id="60"/>
+    <w:bookmarkStart w:id="61" w:name="anexo-4-product-backlog-completo"/>
     <w:p>
       <w:pPr>
         <w:pStyle w:val="Heading2"/>
@@ -20955,8 +20816,8 @@
         <w:t xml:space="preserve">Ver sección 3.1.2 del presente informe y documento SRS.md (sección de requisitos funcionales).</w:t>
       </w:r>
     </w:p>
-    <w:bookmarkEnd w:id="58"/>
-    <w:bookmarkStart w:id="61" w:name="anexo-5-recursos-del-proyecto-en-línea"/>
+    <w:bookmarkEnd w:id="61"/>
+    <w:bookmarkStart w:id="64" w:name="anexo-5-recursos-del-proyecto-en-línea"/>
     <w:p>
       <w:pPr>
         <w:pStyle w:val="Heading2"/>
@@ -20965,7 +20826,7 @@
         <w:t xml:space="preserve">Anexo 5: Recursos del Proyecto en Línea</w:t>
       </w:r>
     </w:p>
-    <w:bookmarkStart w:id="59" w:name="sistema-en-producción-y-repositorio"/>
+    <w:bookmarkStart w:id="62" w:name="sistema-en-producción-y-repositorio"/>
     <w:p>
       <w:pPr>
         <w:pStyle w:val="Heading3"/>
@@ -21143,8 +21004,8 @@
         </w:tc>
       </w:tr>
     </w:tbl>
-    <w:bookmarkEnd w:id="59"/>
-    <w:bookmarkStart w:id="60" w:name="X12c40eea7cf55be893f7b62c85c6cbf9502e7d8"/>
+    <w:bookmarkEnd w:id="62"/>
+    <w:bookmarkStart w:id="63" w:name="X12c40eea7cf55be893f7b62c85c6cbf9502e7d8"/>
     <w:p>
       <w:pPr>
         <w:pStyle w:val="Heading3"/>
@@ -21233,7 +21094,7 @@
               <w:pStyle w:val="Compact"/>
             </w:pPr>
             <w:r>
-              <w:t xml:space="preserve">https://sgi-docs.escuelamilitar.edu.pe/docs/intro</w:t>
+              <w:t xml:space="preserve">https://sgi-docs.escuelamilitar.edu.pe/intro</w:t>
             </w:r>
           </w:p>
         </w:tc>
@@ -21272,7 +21133,7 @@
               <w:pStyle w:val="Compact"/>
             </w:pPr>
             <w:r>
-              <w:t xml:space="preserve">https://sgi-docs.escuelamilitar.edu.pe/docs/arquitectura/arquitectura-aplicacion</w:t>
+              <w:t xml:space="preserve">https://sgi-docs.escuelamilitar.edu.pe/arquitectura/arquitectura-aplicacion</w:t>
             </w:r>
           </w:p>
         </w:tc>
@@ -21307,7 +21168,7 @@
               <w:pStyle w:val="Compact"/>
             </w:pPr>
             <w:r>
-              <w:t xml:space="preserve">https://sgi-docs.escuelamilitar.edu.pe/docs/arquitectura/stack-tecnologico</w:t>
+              <w:t xml:space="preserve">https://sgi-docs.escuelamilitar.edu.pe/arquitectura/stack-tecnologico</w:t>
             </w:r>
           </w:p>
         </w:tc>
@@ -21342,7 +21203,7 @@
               <w:pStyle w:val="Compact"/>
             </w:pPr>
             <w:r>
-              <w:t xml:space="preserve">https://sgi-docs.escuelamilitar.edu.pe/docs/arquitectura/estructura-del-proyecto</w:t>
+              <w:t xml:space="preserve">https://sgi-docs.escuelamilitar.edu.pe/arquitectura/estructura-del-proyecto</w:t>
             </w:r>
           </w:p>
         </w:tc>
@@ -21377,7 +21238,7 @@
               <w:pStyle w:val="Compact"/>
             </w:pPr>
             <w:r>
-              <w:t xml:space="preserve">https://sgi-docs.escuelamilitar.edu.pe/docs/arquitectura/diagrama-despliegue</w:t>
+              <w:t xml:space="preserve">https://sgi-docs.escuelamilitar.edu.pe/arquitectura/diagrama-despliegue</w:t>
             </w:r>
           </w:p>
         </w:tc>
@@ -21412,7 +21273,7 @@
               <w:pStyle w:val="Compact"/>
             </w:pPr>
             <w:r>
-              <w:t xml:space="preserve">https://sgi-docs.escuelamilitar.edu.pe/docs/arquitectura/diagrama-componentes</w:t>
+              <w:t xml:space="preserve">https://sgi-docs.escuelamilitar.edu.pe/arquitectura/diagrama-componentes</w:t>
             </w:r>
           </w:p>
         </w:tc>
@@ -21447,7 +21308,7 @@
               <w:pStyle w:val="Compact"/>
             </w:pPr>
             <w:r>
-              <w:t xml:space="preserve">https://sgi-docs.escuelamilitar.edu.pe/docs/arquitectura/patrones</w:t>
+              <w:t xml:space="preserve">https://sgi-docs.escuelamilitar.edu.pe/arquitectura/patrones</w:t>
             </w:r>
           </w:p>
         </w:tc>
@@ -21482,7 +21343,7 @@
               <w:pStyle w:val="Compact"/>
             </w:pPr>
             <w:r>
-              <w:t xml:space="preserve">https://sgi-docs.escuelamilitar.edu.pe/docs/arquitectura/diagrama-clases</w:t>
+              <w:t xml:space="preserve">https://sgi-docs.escuelamilitar.edu.pe/arquitectura/diagrama-clases</w:t>
             </w:r>
           </w:p>
         </w:tc>
@@ -21521,7 +21382,7 @@
               <w:pStyle w:val="Compact"/>
             </w:pPr>
             <w:r>
-              <w:t xml:space="preserve">https://sgi-docs.escuelamilitar.edu.pe/docs/base-de-datos/diseño-conceptual</w:t>
+              <w:t xml:space="preserve">https://sgi-docs.escuelamilitar.edu.pe/base-de-datos/diseño-conceptual</w:t>
             </w:r>
           </w:p>
         </w:tc>
@@ -21556,7 +21417,7 @@
               <w:pStyle w:val="Compact"/>
             </w:pPr>
             <w:r>
-              <w:t xml:space="preserve">https://sgi-docs.escuelamilitar.edu.pe/docs/base-de-datos/diseño-logico</w:t>
+              <w:t xml:space="preserve">https://sgi-docs.escuelamilitar.edu.pe/base-de-datos/diseño-logico</w:t>
             </w:r>
           </w:p>
         </w:tc>
@@ -21591,7 +21452,7 @@
               <w:pStyle w:val="Compact"/>
             </w:pPr>
             <w:r>
-              <w:t xml:space="preserve">https://sgi-docs.escuelamilitar.edu.pe/docs/base-de-datos/diseño-fisico</w:t>
+              <w:t xml:space="preserve">https://sgi-docs.escuelamilitar.edu.pe/base-de-datos/diseño-fisico</w:t>
             </w:r>
           </w:p>
         </w:tc>
@@ -21630,7 +21491,7 @@
               <w:pStyle w:val="Compact"/>
             </w:pPr>
             <w:r>
-              <w:t xml:space="preserve">https://sgi-docs.escuelamilitar.edu.pe/docs/guia-usuario/dashboard</w:t>
+              <w:t xml:space="preserve">https://sgi-docs.escuelamilitar.edu.pe/guia-usuario/dashboard</w:t>
             </w:r>
           </w:p>
         </w:tc>
@@ -21665,7 +21526,7 @@
               <w:pStyle w:val="Compact"/>
             </w:pPr>
             <w:r>
-              <w:t xml:space="preserve">https://sgi-docs.escuelamilitar.edu.pe/docs/guia-usuario/inventario</w:t>
+              <w:t xml:space="preserve">https://sgi-docs.escuelamilitar.edu.pe/guia-usuario/inventario</w:t>
             </w:r>
           </w:p>
         </w:tc>
@@ -21700,7 +21561,7 @@
               <w:pStyle w:val="Compact"/>
             </w:pPr>
             <w:r>
-              <w:t xml:space="preserve">https://sgi-docs.escuelamilitar.edu.pe/docs/guia-usuario/incidentes</w:t>
+              <w:t xml:space="preserve">https://sgi-docs.escuelamilitar.edu.pe/guia-usuario/incidentes</w:t>
             </w:r>
           </w:p>
         </w:tc>
@@ -21735,7 +21596,7 @@
               <w:pStyle w:val="Compact"/>
             </w:pPr>
             <w:r>
-              <w:t xml:space="preserve">https://sgi-docs.escuelamilitar.edu.pe/docs/guia-usuario/reportes</w:t>
+              <w:t xml:space="preserve">https://sgi-docs.escuelamilitar.edu.pe/guia-usuario/reportes</w:t>
             </w:r>
           </w:p>
         </w:tc>
@@ -21770,7 +21631,7 @@
               <w:pStyle w:val="Compact"/>
             </w:pPr>
             <w:r>
-              <w:t xml:space="preserve">https://sgi-docs.escuelamilitar.edu.pe/docs/guia-usuario/notificaciones</w:t>
+              <w:t xml:space="preserve">https://sgi-docs.escuelamilitar.edu.pe/guia-usuario/notificaciones</w:t>
             </w:r>
           </w:p>
         </w:tc>
@@ -21805,7 +21666,7 @@
               <w:pStyle w:val="Compact"/>
             </w:pPr>
             <w:r>
-              <w:t xml:space="preserve">https://sgi-docs.escuelamilitar.edu.pe/docs/guia-usuario/usuarios</w:t>
+              <w:t xml:space="preserve">https://sgi-docs.escuelamilitar.edu.pe/guia-usuario/usuarios</w:t>
             </w:r>
           </w:p>
         </w:tc>
@@ -21840,7 +21701,7 @@
               <w:pStyle w:val="Compact"/>
             </w:pPr>
             <w:r>
-              <w:t xml:space="preserve">https://sgi-docs.escuelamilitar.edu.pe/docs/guia-usuario/configuracion</w:t>
+              <w:t xml:space="preserve">https://sgi-docs.escuelamilitar.edu.pe/guia-usuario/configuracion</w:t>
             </w:r>
           </w:p>
         </w:tc>
@@ -21879,7 +21740,7 @@
               <w:pStyle w:val="Compact"/>
             </w:pPr>
             <w:r>
-              <w:t xml:space="preserve">https://sgi-docs.escuelamilitar.edu.pe/docs/guia-admin/monitoreo</w:t>
+              <w:t xml:space="preserve">https://sgi-docs.escuelamilitar.edu.pe/guia-admin/monitoreo</w:t>
             </w:r>
           </w:p>
         </w:tc>
@@ -21914,7 +21775,7 @@
               <w:pStyle w:val="Compact"/>
             </w:pPr>
             <w:r>
-              <w:t xml:space="preserve">https://sgi-docs.escuelamilitar.edu.pe/docs/guia-admin/backups</w:t>
+              <w:t xml:space="preserve">https://sgi-docs.escuelamilitar.edu.pe/guia-admin/backups</w:t>
             </w:r>
           </w:p>
         </w:tc>
@@ -21949,7 +21810,7 @@
               <w:pStyle w:val="Compact"/>
             </w:pPr>
             <w:r>
-              <w:t xml:space="preserve">https://sgi-docs.escuelamilitar.edu.pe/docs/guia-admin/cache</w:t>
+              <w:t xml:space="preserve">https://sgi-docs.escuelamilitar.edu.pe/guia-admin/cache</w:t>
             </w:r>
           </w:p>
         </w:tc>
@@ -21984,7 +21845,7 @@
               <w:pStyle w:val="Compact"/>
             </w:pPr>
             <w:r>
-              <w:t xml:space="preserve">https://sgi-docs.escuelamilitar.edu.pe/docs/guia-admin/variables-entorno</w:t>
+              <w:t xml:space="preserve">https://sgi-docs.escuelamilitar.edu.pe/guia-admin/variables-entorno</w:t>
             </w:r>
           </w:p>
         </w:tc>
@@ -22019,7 +21880,7 @@
               <w:pStyle w:val="Compact"/>
             </w:pPr>
             <w:r>
-              <w:t xml:space="preserve">https://sgi-docs.escuelamilitar.edu.pe/docs/guia-admin/nginx-proxy-manager</w:t>
+              <w:t xml:space="preserve">https://sgi-docs.escuelamilitar.edu.pe/guia-admin/nginx-proxy-manager</w:t>
             </w:r>
           </w:p>
         </w:tc>
@@ -22058,7 +21919,7 @@
               <w:pStyle w:val="Compact"/>
             </w:pPr>
             <w:r>
-              <w:t xml:space="preserve">https://sgi-docs.escuelamilitar.edu.pe/docs/api/overview</w:t>
+              <w:t xml:space="preserve">https://sgi-docs.escuelamilitar.edu.pe/api/overview</w:t>
             </w:r>
           </w:p>
         </w:tc>
@@ -22093,7 +21954,7 @@
               <w:pStyle w:val="Compact"/>
             </w:pPr>
             <w:r>
-              <w:t xml:space="preserve">https://sgi-docs.escuelamilitar.edu.pe/docs/api/endpoints-principales</w:t>
+              <w:t xml:space="preserve">https://sgi-docs.escuelamilitar.edu.pe/api/endpoints-principales</w:t>
             </w:r>
           </w:p>
         </w:tc>
@@ -22166,9 +22027,9 @@
         <w:t xml:space="preserve">| Sprint 6 — Junio/Julio 2026</w:t>
       </w:r>
     </w:p>
-    <w:bookmarkEnd w:id="60"/>
-    <w:bookmarkEnd w:id="61"/>
-    <w:bookmarkEnd w:id="62"/>
+    <w:bookmarkEnd w:id="63"/>
+    <w:bookmarkEnd w:id="64"/>
+    <w:bookmarkEnd w:id="65"/>
     <w:sectPr>
       <w:footnotePr>
         <w:numRestart w:val="eachSect"/>

</xml_diff>

<commit_message>
fix(informe): replace non-rendering mermaid blocks in 3.1.11.1 and 3.1.11.2 with Docusaurus links and summary tables
</commit_message>
<xml_diff>
--- a/markdown/informe_3.docx
+++ b/markdown/informe_3.docx
@@ -4749,7 +4749,7 @@
     <w:bookmarkEnd w:id="25"/>
     <w:bookmarkEnd w:id="26"/>
     <w:bookmarkEnd w:id="27"/>
-    <w:bookmarkStart w:id="47" w:name="capítulo-3-desarrollo-de-la-solución"/>
+    <w:bookmarkStart w:id="49" w:name="capítulo-3-desarrollo-de-la-solución"/>
     <w:p>
       <w:pPr>
         <w:pStyle w:val="Heading1"/>
@@ -4758,7 +4758,7 @@
         <w:t xml:space="preserve">Capítulo 3 — DESARROLLO DE LA SOLUCIÓN</w:t>
       </w:r>
     </w:p>
-    <w:bookmarkStart w:id="43" w:name="desarrollo-de-la-solución"/>
+    <w:bookmarkStart w:id="45" w:name="desarrollo-de-la-solución"/>
     <w:p>
       <w:pPr>
         <w:pStyle w:val="Heading2"/>
@@ -13458,7 +13458,7 @@
       </w:tr>
     </w:tbl>
     <w:bookmarkEnd w:id="37"/>
-    <w:bookmarkStart w:id="42" w:name="arquitectura-de-aplicaciones"/>
+    <w:bookmarkStart w:id="44" w:name="arquitectura-de-aplicaciones"/>
     <w:p>
       <w:pPr>
         <w:pStyle w:val="Heading3"/>
@@ -13884,388 +13884,41 @@
     </w:p>
     <w:p>
       <w:pPr>
-        <w:pStyle w:val="SourceCode"/>
-      </w:pPr>
-      <w:r>
-        <w:rPr>
-          <w:rStyle w:val="VerbatimChar"/>
-        </w:rPr>
-        <w:t xml:space="preserve">graph TB</w:t>
-      </w:r>
-      <w:r>
-        <w:br/>
-      </w:r>
-      <w:r>
-        <w:rPr>
-          <w:rStyle w:val="VerbatimChar"/>
-        </w:rPr>
-        <w:t xml:space="preserve">    subgraph Cliente["Cliente — Navegador Web"]</w:t>
-      </w:r>
-      <w:r>
-        <w:br/>
-      </w:r>
-      <w:r>
-        <w:rPr>
-          <w:rStyle w:val="VerbatimChar"/>
-        </w:rPr>
-        <w:t xml:space="preserve">        RT["React Router (App.tsx)"]</w:t>
-      </w:r>
-      <w:r>
-        <w:br/>
-      </w:r>
-      <w:r>
-        <w:rPr>
-          <w:rStyle w:val="VerbatimChar"/>
-        </w:rPr>
-        <w:t xml:space="preserve">        PC["Componentes de página (Dashboard, Inventario, Incidentes…)"]</w:t>
-      </w:r>
-      <w:r>
-        <w:br/>
-      </w:r>
-      <w:r>
-        <w:rPr>
-          <w:rStyle w:val="VerbatimChar"/>
-        </w:rPr>
-        <w:t xml:space="preserve">        SM["Servicios (inventarioService, ticketService…)"]</w:t>
-      </w:r>
-      <w:r>
-        <w:br/>
-      </w:r>
-      <w:r>
-        <w:rPr>
-          <w:rStyle w:val="VerbatimChar"/>
-        </w:rPr>
-        <w:t xml:space="preserve">        FA["fetchWithAuth — api.ts (inyecta JWT)"]</w:t>
-      </w:r>
-      <w:r>
-        <w:br/>
-      </w:r>
-      <w:r>
-        <w:rPr>
-          <w:rStyle w:val="VerbatimChar"/>
-        </w:rPr>
-        <w:t xml:space="preserve">        RT --&gt; PC --&gt; SM --&gt; FA</w:t>
-      </w:r>
-      <w:r>
-        <w:br/>
-      </w:r>
-      <w:r>
-        <w:rPr>
-          <w:rStyle w:val="VerbatimChar"/>
-        </w:rPr>
-        <w:t xml:space="preserve">    end</w:t>
-      </w:r>
-      <w:r>
-        <w:br/>
-      </w:r>
-      <w:r>
-        <w:br/>
-      </w:r>
-      <w:r>
-        <w:rPr>
-          <w:rStyle w:val="VerbatimChar"/>
-        </w:rPr>
-        <w:t xml:space="preserve">    FA --&gt;|"HTTPS · Bearer Token"| SEC</w:t>
-      </w:r>
-      <w:r>
-        <w:br/>
-      </w:r>
-      <w:r>
-        <w:br/>
-      </w:r>
-      <w:r>
-        <w:rPr>
-          <w:rStyle w:val="VerbatimChar"/>
-        </w:rPr>
-        <w:t xml:space="preserve">    subgraph Servidor["Servidor — Spring Boot"]</w:t>
-      </w:r>
-      <w:r>
-        <w:br/>
-      </w:r>
-      <w:r>
-        <w:rPr>
-          <w:rStyle w:val="VerbatimChar"/>
-        </w:rPr>
-        <w:t xml:space="preserve">        SEC["Spring Security (JwtFilter + AuditSessionInterceptor)"]</w:t>
-      </w:r>
-      <w:r>
-        <w:br/>
-      </w:r>
-      <w:r>
-        <w:rPr>
-          <w:rStyle w:val="VerbatimChar"/>
-        </w:rPr>
-        <w:t xml:space="preserve">        CTRL["Controladores REST (@RestController)"]</w:t>
-      </w:r>
-      <w:r>
-        <w:br/>
-      </w:r>
-      <w:r>
-        <w:rPr>
-          <w:rStyle w:val="VerbatimChar"/>
-        </w:rPr>
-        <w:t xml:space="preserve">        SVC["Servicios (@Service + lógica de negocio)"]</w:t>
-      </w:r>
-      <w:r>
-        <w:br/>
-      </w:r>
-      <w:r>
-        <w:rPr>
-          <w:rStyle w:val="VerbatimChar"/>
-        </w:rPr>
-        <w:t xml:space="preserve">        CACHE["Caché Caffeine (@Cacheable / @CacheEvict)"]</w:t>
-      </w:r>
-      <w:r>
-        <w:br/>
-      </w:r>
-      <w:r>
-        <w:rPr>
-          <w:rStyle w:val="VerbatimChar"/>
-        </w:rPr>
-        <w:t xml:space="preserve">        REPO["Repositorios JPA (Spring Data)"]</w:t>
-      </w:r>
-      <w:r>
-        <w:br/>
-      </w:r>
-      <w:r>
-        <w:rPr>
-          <w:rStyle w:val="VerbatimChar"/>
-        </w:rPr>
-        <w:t xml:space="preserve">        SCHED["Scheduler (@Scheduled — SLA + stock)"]</w:t>
-      </w:r>
-      <w:r>
-        <w:br/>
-      </w:r>
-      <w:r>
-        <w:rPr>
-          <w:rStyle w:val="VerbatimChar"/>
-        </w:rPr>
-        <w:t xml:space="preserve">        NOTIF["NotificadorService"]</w:t>
-      </w:r>
-      <w:r>
-        <w:br/>
-      </w:r>
-      <w:r>
-        <w:br/>
-      </w:r>
-      <w:r>
-        <w:rPr>
-          <w:rStyle w:val="VerbatimChar"/>
-        </w:rPr>
-        <w:t xml:space="preserve">        SEC --&gt; CTRL --&gt; SVC</w:t>
-      </w:r>
-      <w:r>
-        <w:br/>
-      </w:r>
-      <w:r>
-        <w:rPr>
-          <w:rStyle w:val="VerbatimChar"/>
-        </w:rPr>
-        <w:t xml:space="preserve">        SVC --&gt; CACHE</w:t>
-      </w:r>
-      <w:r>
-        <w:br/>
-      </w:r>
-      <w:r>
-        <w:rPr>
-          <w:rStyle w:val="VerbatimChar"/>
-        </w:rPr>
-        <w:t xml:space="preserve">        SVC --&gt; REPO</w:t>
-      </w:r>
-      <w:r>
-        <w:br/>
-      </w:r>
-      <w:r>
-        <w:rPr>
-          <w:rStyle w:val="VerbatimChar"/>
-        </w:rPr>
-        <w:t xml:space="preserve">        SCHED --&gt; NOTIF --&gt; SVC</w:t>
-      </w:r>
-      <w:r>
-        <w:br/>
-      </w:r>
-      <w:r>
-        <w:rPr>
-          <w:rStyle w:val="VerbatimChar"/>
-        </w:rPr>
-        <w:t xml:space="preserve">    end</w:t>
-      </w:r>
-      <w:r>
-        <w:br/>
-      </w:r>
-      <w:r>
-        <w:br/>
-      </w:r>
-      <w:r>
-        <w:rPr>
-          <w:rStyle w:val="VerbatimChar"/>
-        </w:rPr>
-        <w:t xml:space="preserve">    REPO --&gt;|"JDBC · HikariCP"| DB[("MySQL 8.0 — db_sgi_emch")]</w:t>
-      </w:r>
-    </w:p>
-    <w:p>
-      <w:pPr>
-        <w:pStyle w:val="FirstParagraph"/>
-      </w:pPr>
+        <w:pStyle w:val="BlockText"/>
+      </w:pPr>
+      <w:r>
+        <w:t xml:space="preserve">📐</w:t>
+      </w:r>
+      <w:r>
+        <w:t xml:space="preserve"> </w:t>
+      </w:r>
       <w:r>
         <w:rPr>
           <w:b/>
           <w:bCs/>
         </w:rPr>
-        <w:t xml:space="preserve">3.1.11.2. Diagrama de Despliegue</w:t>
-      </w:r>
-    </w:p>
-    <w:p>
-      <w:pPr>
-        <w:pStyle w:val="BodyText"/>
-      </w:pPr>
-      <w:r>
-        <w:t xml:space="preserve">El sistema se despliega mediante Docker Compose en el servidor institucional de la EMCH:</w:t>
-      </w:r>
-    </w:p>
-    <w:p>
-      <w:pPr>
-        <w:pStyle w:val="SourceCode"/>
-      </w:pPr>
-      <w:r>
-        <w:rPr>
-          <w:rStyle w:val="VerbatimChar"/>
-        </w:rPr>
-        <w:t xml:space="preserve">graph LR</w:t>
-      </w:r>
-      <w:r>
-        <w:br/>
-      </w:r>
-      <w:r>
-        <w:rPr>
-          <w:rStyle w:val="VerbatimChar"/>
-        </w:rPr>
-        <w:t xml:space="preserve">    Internet["Internet / Intranet EMCH"] --&gt; NPM</w:t>
-      </w:r>
-      <w:r>
-        <w:br/>
-      </w:r>
-      <w:r>
-        <w:br/>
-      </w:r>
-      <w:r>
-        <w:rPr>
-          <w:rStyle w:val="VerbatimChar"/>
-        </w:rPr>
-        <w:t xml:space="preserve">    subgraph VPS["Servidor Institucional EMCH"]</w:t>
-      </w:r>
-      <w:r>
-        <w:br/>
-      </w:r>
-      <w:r>
-        <w:rPr>
-          <w:rStyle w:val="VerbatimChar"/>
-        </w:rPr>
-        <w:t xml:space="preserve">        NPM["Nginx Proxy Manager (HTTPS)"]</w:t>
-      </w:r>
-      <w:r>
-        <w:br/>
-      </w:r>
-      <w:r>
-        <w:rPr>
-          <w:rStyle w:val="VerbatimChar"/>
-        </w:rPr>
-        <w:t xml:space="preserve">        NPM --&gt;|"sgi.escuelamilitar.edu.pe"| FE["sgi-full-frontend (Nginx + React)"]</w:t>
-      </w:r>
-      <w:r>
-        <w:br/>
-      </w:r>
-      <w:r>
-        <w:rPr>
-          <w:rStyle w:val="VerbatimChar"/>
-        </w:rPr>
-        <w:t xml:space="preserve">        NPM --&gt;|"sgi-docs.escuelamilitar.edu.pe"| DOCS["sgi-full-docs (Docusaurus)"]</w:t>
-      </w:r>
-      <w:r>
-        <w:br/>
-      </w:r>
-      <w:r>
-        <w:rPr>
-          <w:rStyle w:val="VerbatimChar"/>
-        </w:rPr>
-        <w:t xml:space="preserve">        NPM --&gt;|"sgi-grafana.escuelamilitar.edu.pe"| GF["Grafana 11.5.2"]</w:t>
-      </w:r>
-      <w:r>
-        <w:br/>
-      </w:r>
-      <w:r>
-        <w:br/>
-      </w:r>
-      <w:r>
-        <w:rPr>
-          <w:rStyle w:val="VerbatimChar"/>
-        </w:rPr>
-        <w:t xml:space="preserve">        FE --&gt;|"HTTP interno /api/*"| BE["sgi-full-backend (Spring Boot)"]</w:t>
-      </w:r>
-      <w:r>
-        <w:br/>
-      </w:r>
-      <w:r>
-        <w:rPr>
-          <w:rStyle w:val="VerbatimChar"/>
-        </w:rPr>
-        <w:t xml:space="preserve">        BE --&gt; DB["sgi-full-db (MySQL 8.0)"]</w:t>
-      </w:r>
-      <w:r>
-        <w:br/>
-      </w:r>
-      <w:r>
-        <w:rPr>
-          <w:rStyle w:val="VerbatimChar"/>
-        </w:rPr>
-        <w:t xml:space="preserve">        BE --&gt; BACKUP["sgi-full-backup (mysqldump diario)"]</w:t>
-      </w:r>
-      <w:r>
-        <w:br/>
-      </w:r>
-      <w:r>
-        <w:rPr>
-          <w:rStyle w:val="VerbatimChar"/>
-        </w:rPr>
-        <w:t xml:space="preserve">        GF --- PROM["Prometheus"]</w:t>
-      </w:r>
-      <w:r>
-        <w:br/>
-      </w:r>
-      <w:r>
-        <w:rPr>
-          <w:rStyle w:val="VerbatimChar"/>
-        </w:rPr>
-        <w:t xml:space="preserve">        PROM --&gt;|"/actuator/prometheus"| BE</w:t>
-      </w:r>
-      <w:r>
-        <w:br/>
-      </w:r>
-      <w:r>
-        <w:rPr>
-          <w:rStyle w:val="VerbatimChar"/>
-        </w:rPr>
-        <w:t xml:space="preserve">    end</w:t>
-      </w:r>
+        <w:t xml:space="preserve">Diagrama interactivo disponible en la documentación oficial:</w:t>
+      </w:r>
+      <w:r>
+        <w:t xml:space="preserve"> </w:t>
+      </w:r>
+      <w:hyperlink r:id="rId38">
+        <w:r>
+          <w:rPr>
+            <w:rStyle w:val="Hyperlink"/>
+            <w:b/>
+            <w:bCs/>
+          </w:rPr>
+          <w:t xml:space="preserve">https://sgi-docs.escuelamilitar.edu.pe/arquitectura/arquitectura-aplicacion</w:t>
+        </w:r>
+      </w:hyperlink>
     </w:p>
     <w:p>
       <w:pPr>
         <w:pStyle w:val="FirstParagraph"/>
       </w:pPr>
       <w:r>
-        <w:rPr>
-          <w:b/>
-          <w:bCs/>
-        </w:rPr>
-        <w:t xml:space="preserve">3.1.11.3. Diagrama de Componentes</w:t>
-      </w:r>
-    </w:p>
-    <w:p>
-      <w:pPr>
-        <w:pStyle w:val="BodyText"/>
-      </w:pPr>
-      <w:r>
-        <w:t xml:space="preserve">Las capas del backend y su relación:</w:t>
+        <w:t xml:space="preserve">El diagrama muestra el flujo completo desde el navegador del cliente hasta la base de datos:</w:t>
       </w:r>
     </w:p>
     <w:tbl>
@@ -14302,6 +13955,1005 @@
               <w:pStyle w:val="Compact"/>
             </w:pPr>
             <w:r>
+              <w:t xml:space="preserve">Tecnología</w:t>
+            </w:r>
+          </w:p>
+        </w:tc>
+        <w:tc>
+          <w:tcPr/>
+          <w:p>
+            <w:pPr>
+              <w:pStyle w:val="Compact"/>
+            </w:pPr>
+            <w:r>
+              <w:t xml:space="preserve">Descripción</w:t>
+            </w:r>
+          </w:p>
+        </w:tc>
+      </w:tr>
+      <w:tr>
+        <w:tc>
+          <w:tcPr/>
+          <w:p>
+            <w:pPr>
+              <w:pStyle w:val="Compact"/>
+            </w:pPr>
+            <w:r>
+              <w:rPr>
+                <w:b/>
+                <w:bCs/>
+              </w:rPr>
+              <w:t xml:space="preserve">Presentación</w:t>
+            </w:r>
+          </w:p>
+        </w:tc>
+        <w:tc>
+          <w:tcPr/>
+          <w:p>
+            <w:pPr>
+              <w:pStyle w:val="Compact"/>
+            </w:pPr>
+            <w:r>
+              <w:t xml:space="preserve">React 18 + TypeScript</w:t>
+            </w:r>
+          </w:p>
+        </w:tc>
+        <w:tc>
+          <w:tcPr/>
+          <w:p>
+            <w:pPr>
+              <w:pStyle w:val="Compact"/>
+            </w:pPr>
+            <w:r>
+              <w:rPr>
+                <w:rStyle w:val="VerbatimChar"/>
+              </w:rPr>
+              <w:t xml:space="preserve">App.tsx</w:t>
+            </w:r>
+            <w:r>
+              <w:t xml:space="preserve"> </w:t>
+            </w:r>
+            <w:r>
+              <w:t xml:space="preserve">→ Páginas → Servicios →</w:t>
+            </w:r>
+            <w:r>
+              <w:t xml:space="preserve"> </w:t>
+            </w:r>
+            <w:r>
+              <w:rPr>
+                <w:rStyle w:val="VerbatimChar"/>
+              </w:rPr>
+              <w:t xml:space="preserve">fetchWithAuth</w:t>
+            </w:r>
+            <w:r>
+              <w:t xml:space="preserve"> </w:t>
+            </w:r>
+            <w:r>
+              <w:t xml:space="preserve">(inyecta JWT)</w:t>
+            </w:r>
+          </w:p>
+        </w:tc>
+      </w:tr>
+      <w:tr>
+        <w:tc>
+          <w:tcPr/>
+          <w:p>
+            <w:pPr>
+              <w:pStyle w:val="Compact"/>
+            </w:pPr>
+            <w:r>
+              <w:rPr>
+                <w:b/>
+                <w:bCs/>
+              </w:rPr>
+              <w:t xml:space="preserve">Seguridad</w:t>
+            </w:r>
+          </w:p>
+        </w:tc>
+        <w:tc>
+          <w:tcPr/>
+          <w:p>
+            <w:pPr>
+              <w:pStyle w:val="Compact"/>
+            </w:pPr>
+            <w:r>
+              <w:t xml:space="preserve">Spring Security 6</w:t>
+            </w:r>
+          </w:p>
+        </w:tc>
+        <w:tc>
+          <w:tcPr/>
+          <w:p>
+            <w:pPr>
+              <w:pStyle w:val="Compact"/>
+            </w:pPr>
+            <w:r>
+              <w:rPr>
+                <w:rStyle w:val="VerbatimChar"/>
+              </w:rPr>
+              <w:t xml:space="preserve">JwtFilter</w:t>
+            </w:r>
+            <w:r>
+              <w:t xml:space="preserve"> </w:t>
+            </w:r>
+            <w:r>
+              <w:t xml:space="preserve">valida token ·</w:t>
+            </w:r>
+            <w:r>
+              <w:t xml:space="preserve"> </w:t>
+            </w:r>
+            <w:r>
+              <w:rPr>
+                <w:rStyle w:val="VerbatimChar"/>
+              </w:rPr>
+              <w:t xml:space="preserve">AuditSessionInterceptor</w:t>
+            </w:r>
+            <w:r>
+              <w:t xml:space="preserve"> </w:t>
+            </w:r>
+            <w:r>
+              <w:t xml:space="preserve">registra usuario/IP</w:t>
+            </w:r>
+          </w:p>
+        </w:tc>
+      </w:tr>
+      <w:tr>
+        <w:tc>
+          <w:tcPr/>
+          <w:p>
+            <w:pPr>
+              <w:pStyle w:val="Compact"/>
+            </w:pPr>
+            <w:r>
+              <w:rPr>
+                <w:b/>
+                <w:bCs/>
+              </w:rPr>
+              <w:t xml:space="preserve">Controladores</w:t>
+            </w:r>
+          </w:p>
+        </w:tc>
+        <w:tc>
+          <w:tcPr/>
+          <w:p>
+            <w:pPr>
+              <w:pStyle w:val="Compact"/>
+            </w:pPr>
+            <w:r>
+              <w:rPr>
+                <w:rStyle w:val="VerbatimChar"/>
+              </w:rPr>
+              <w:t xml:space="preserve">@RestController</w:t>
+            </w:r>
+          </w:p>
+        </w:tc>
+        <w:tc>
+          <w:tcPr/>
+          <w:p>
+            <w:pPr>
+              <w:pStyle w:val="Compact"/>
+            </w:pPr>
+            <w:r>
+              <w:t xml:space="preserve">Enrutan peticiones HTTP, validan entrada, devuelven</w:t>
+            </w:r>
+            <w:r>
+              <w:t xml:space="preserve"> </w:t>
+            </w:r>
+            <w:r>
+              <w:rPr>
+                <w:rStyle w:val="VerbatimChar"/>
+              </w:rPr>
+              <w:t xml:space="preserve">ApiResponse&lt;T&gt;</w:t>
+            </w:r>
+          </w:p>
+        </w:tc>
+      </w:tr>
+      <w:tr>
+        <w:tc>
+          <w:tcPr/>
+          <w:p>
+            <w:pPr>
+              <w:pStyle w:val="Compact"/>
+            </w:pPr>
+            <w:r>
+              <w:rPr>
+                <w:b/>
+                <w:bCs/>
+              </w:rPr>
+              <w:t xml:space="preserve">Servicios</w:t>
+            </w:r>
+          </w:p>
+        </w:tc>
+        <w:tc>
+          <w:tcPr/>
+          <w:p>
+            <w:pPr>
+              <w:pStyle w:val="Compact"/>
+            </w:pPr>
+            <w:r>
+              <w:rPr>
+                <w:rStyle w:val="VerbatimChar"/>
+              </w:rPr>
+              <w:t xml:space="preserve">@Service</w:t>
+            </w:r>
+          </w:p>
+        </w:tc>
+        <w:tc>
+          <w:tcPr/>
+          <w:p>
+            <w:pPr>
+              <w:pStyle w:val="Compact"/>
+            </w:pPr>
+            <w:r>
+              <w:t xml:space="preserve">Lógica de negocio,</w:t>
+            </w:r>
+            <w:r>
+              <w:t xml:space="preserve"> </w:t>
+            </w:r>
+            <w:r>
+              <w:rPr>
+                <w:rStyle w:val="VerbatimChar"/>
+              </w:rPr>
+              <w:t xml:space="preserve">@Transactional</w:t>
+            </w:r>
+            <w:r>
+              <w:t xml:space="preserve">, orquestación de repositorios</w:t>
+            </w:r>
+          </w:p>
+        </w:tc>
+      </w:tr>
+      <w:tr>
+        <w:tc>
+          <w:tcPr/>
+          <w:p>
+            <w:pPr>
+              <w:pStyle w:val="Compact"/>
+            </w:pPr>
+            <w:r>
+              <w:rPr>
+                <w:b/>
+                <w:bCs/>
+              </w:rPr>
+              <w:t xml:space="preserve">Caché</w:t>
+            </w:r>
+          </w:p>
+        </w:tc>
+        <w:tc>
+          <w:tcPr/>
+          <w:p>
+            <w:pPr>
+              <w:pStyle w:val="Compact"/>
+            </w:pPr>
+            <w:r>
+              <w:t xml:space="preserve">Caffeine</w:t>
+            </w:r>
+          </w:p>
+        </w:tc>
+        <w:tc>
+          <w:tcPr/>
+          <w:p>
+            <w:pPr>
+              <w:pStyle w:val="Compact"/>
+            </w:pPr>
+            <w:r>
+              <w:rPr>
+                <w:rStyle w:val="VerbatimChar"/>
+              </w:rPr>
+              <w:t xml:space="preserve">@Cacheable</w:t>
+            </w:r>
+            <w:r>
+              <w:t xml:space="preserve"> </w:t>
+            </w:r>
+            <w:r>
+              <w:t xml:space="preserve">/</w:t>
+            </w:r>
+            <w:r>
+              <w:t xml:space="preserve"> </w:t>
+            </w:r>
+            <w:r>
+              <w:rPr>
+                <w:rStyle w:val="VerbatimChar"/>
+              </w:rPr>
+              <w:t xml:space="preserve">@CacheEvict</w:t>
+            </w:r>
+            <w:r>
+              <w:t xml:space="preserve"> </w:t>
+            </w:r>
+            <w:r>
+              <w:t xml:space="preserve">para catálogos (TTL 1 h, máx. 1 000 entradas)</w:t>
+            </w:r>
+          </w:p>
+        </w:tc>
+      </w:tr>
+      <w:tr>
+        <w:tc>
+          <w:tcPr/>
+          <w:p>
+            <w:pPr>
+              <w:pStyle w:val="Compact"/>
+            </w:pPr>
+            <w:r>
+              <w:rPr>
+                <w:b/>
+                <w:bCs/>
+              </w:rPr>
+              <w:t xml:space="preserve">Scheduler</w:t>
+            </w:r>
+          </w:p>
+        </w:tc>
+        <w:tc>
+          <w:tcPr/>
+          <w:p>
+            <w:pPr>
+              <w:pStyle w:val="Compact"/>
+            </w:pPr>
+            <w:r>
+              <w:rPr>
+                <w:rStyle w:val="VerbatimChar"/>
+              </w:rPr>
+              <w:t xml:space="preserve">@Scheduled</w:t>
+            </w:r>
+          </w:p>
+        </w:tc>
+        <w:tc>
+          <w:tcPr/>
+          <w:p>
+            <w:pPr>
+              <w:pStyle w:val="Compact"/>
+            </w:pPr>
+            <w:r>
+              <w:rPr>
+                <w:rStyle w:val="VerbatimChar"/>
+              </w:rPr>
+              <w:t xml:space="preserve">NotificadorService</w:t>
+            </w:r>
+            <w:r>
+              <w:t xml:space="preserve"> </w:t>
+            </w:r>
+            <w:r>
+              <w:t xml:space="preserve">— revisa SLA vencidos y stock crítico cada 5 min</w:t>
+            </w:r>
+          </w:p>
+        </w:tc>
+      </w:tr>
+      <w:tr>
+        <w:tc>
+          <w:tcPr/>
+          <w:p>
+            <w:pPr>
+              <w:pStyle w:val="Compact"/>
+            </w:pPr>
+            <w:r>
+              <w:rPr>
+                <w:b/>
+                <w:bCs/>
+              </w:rPr>
+              <w:t xml:space="preserve">Repositorios</w:t>
+            </w:r>
+          </w:p>
+        </w:tc>
+        <w:tc>
+          <w:tcPr/>
+          <w:p>
+            <w:pPr>
+              <w:pStyle w:val="Compact"/>
+            </w:pPr>
+            <w:r>
+              <w:t xml:space="preserve">Spring Data JPA</w:t>
+            </w:r>
+          </w:p>
+        </w:tc>
+        <w:tc>
+          <w:tcPr/>
+          <w:p>
+            <w:pPr>
+              <w:pStyle w:val="Compact"/>
+            </w:pPr>
+            <w:r>
+              <w:t xml:space="preserve">Acceso a datos vía JPQL; HikariCP gestiona el pool de conexiones</w:t>
+            </w:r>
+          </w:p>
+        </w:tc>
+      </w:tr>
+      <w:tr>
+        <w:tc>
+          <w:tcPr/>
+          <w:p>
+            <w:pPr>
+              <w:pStyle w:val="Compact"/>
+            </w:pPr>
+            <w:r>
+              <w:rPr>
+                <w:b/>
+                <w:bCs/>
+              </w:rPr>
+              <w:t xml:space="preserve">Base de datos</w:t>
+            </w:r>
+          </w:p>
+        </w:tc>
+        <w:tc>
+          <w:tcPr/>
+          <w:p>
+            <w:pPr>
+              <w:pStyle w:val="Compact"/>
+            </w:pPr>
+            <w:r>
+              <w:t xml:space="preserve">MySQL 8.0</w:t>
+            </w:r>
+          </w:p>
+        </w:tc>
+        <w:tc>
+          <w:tcPr/>
+          <w:p>
+            <w:pPr>
+              <w:pStyle w:val="Compact"/>
+            </w:pPr>
+            <w:r>
+              <w:rPr>
+                <w:rStyle w:val="VerbatimChar"/>
+              </w:rPr>
+              <w:t xml:space="preserve">db_sgi_emch</w:t>
+            </w:r>
+            <w:r>
+              <w:t xml:space="preserve"> </w:t>
+            </w:r>
+            <w:r>
+              <w:t xml:space="preserve">— triggers de auditoría, vistas SQL, procedimientos almacenados</w:t>
+            </w:r>
+          </w:p>
+        </w:tc>
+      </w:tr>
+    </w:tbl>
+    <w:p>
+      <w:pPr>
+        <w:pStyle w:val="BodyText"/>
+      </w:pPr>
+      <w:r>
+        <w:rPr>
+          <w:b/>
+          <w:bCs/>
+        </w:rPr>
+        <w:t xml:space="preserve">3.1.11.2. Diagrama de Despliegue</w:t>
+      </w:r>
+    </w:p>
+    <w:p>
+      <w:pPr>
+        <w:pStyle w:val="BlockText"/>
+      </w:pPr>
+      <w:r>
+        <w:t xml:space="preserve">🚀</w:t>
+      </w:r>
+      <w:r>
+        <w:t xml:space="preserve"> </w:t>
+      </w:r>
+      <w:r>
+        <w:rPr>
+          <w:b/>
+          <w:bCs/>
+        </w:rPr>
+        <w:t xml:space="preserve">Diagrama interactivo disponible en la documentación oficial:</w:t>
+      </w:r>
+      <w:r>
+        <w:t xml:space="preserve"> </w:t>
+      </w:r>
+      <w:hyperlink r:id="rId39">
+        <w:r>
+          <w:rPr>
+            <w:rStyle w:val="Hyperlink"/>
+            <w:b/>
+            <w:bCs/>
+          </w:rPr>
+          <w:t xml:space="preserve">https://sgi-docs.escuelamilitar.edu.pe/arquitectura/diagrama-despliegue</w:t>
+        </w:r>
+      </w:hyperlink>
+    </w:p>
+    <w:p>
+      <w:pPr>
+        <w:pStyle w:val="FirstParagraph"/>
+      </w:pPr>
+      <w:r>
+        <w:t xml:space="preserve">El sistema se despliega mediante Docker Compose en el servidor institucional de la EMCH. La topología de servicios es:</w:t>
+      </w:r>
+    </w:p>
+    <w:tbl>
+      <w:tblPr>
+        <w:tblStyle w:val="Table"/>
+        <w:tblW w:type="pct" w:w="5000"/>
+        <w:tblLayout w:type="fixed"/>
+        <w:tblLook w:firstRow="1" w:lastRow="0" w:firstColumn="0" w:lastColumn="0" w:noHBand="0" w:noVBand="0" w:val="0020"/>
+      </w:tblPr>
+      <w:tblGrid>
+        <w:gridCol w:w="2640"/>
+        <w:gridCol w:w="2640"/>
+        <w:gridCol w:w="2640"/>
+      </w:tblGrid>
+      <w:tr>
+        <w:trPr>
+          <w:tblHeader w:val="on"/>
+        </w:trPr>
+        <w:tc>
+          <w:tcPr/>
+          <w:p>
+            <w:pPr>
+              <w:pStyle w:val="Compact"/>
+            </w:pPr>
+            <w:r>
+              <w:t xml:space="preserve">Servicio</w:t>
+            </w:r>
+          </w:p>
+        </w:tc>
+        <w:tc>
+          <w:tcPr/>
+          <w:p>
+            <w:pPr>
+              <w:pStyle w:val="Compact"/>
+            </w:pPr>
+            <w:r>
+              <w:t xml:space="preserve">Imagen / Puerto</w:t>
+            </w:r>
+          </w:p>
+        </w:tc>
+        <w:tc>
+          <w:tcPr/>
+          <w:p>
+            <w:pPr>
+              <w:pStyle w:val="Compact"/>
+            </w:pPr>
+            <w:r>
+              <w:t xml:space="preserve">Descripción</w:t>
+            </w:r>
+          </w:p>
+        </w:tc>
+      </w:tr>
+      <w:tr>
+        <w:tc>
+          <w:tcPr/>
+          <w:p>
+            <w:pPr>
+              <w:pStyle w:val="Compact"/>
+            </w:pPr>
+            <w:r>
+              <w:rPr>
+                <w:b/>
+                <w:bCs/>
+              </w:rPr>
+              <w:t xml:space="preserve">Nginx Proxy Manager</w:t>
+            </w:r>
+          </w:p>
+        </w:tc>
+        <w:tc>
+          <w:tcPr/>
+          <w:p>
+            <w:pPr>
+              <w:pStyle w:val="Compact"/>
+            </w:pPr>
+            <w:r>
+              <w:rPr>
+                <w:rStyle w:val="VerbatimChar"/>
+              </w:rPr>
+              <w:t xml:space="preserve">jc21/nginx-proxy-manager</w:t>
+            </w:r>
+          </w:p>
+        </w:tc>
+        <w:tc>
+          <w:tcPr/>
+          <w:p>
+            <w:pPr>
+              <w:pStyle w:val="Compact"/>
+            </w:pPr>
+            <w:r>
+              <w:t xml:space="preserve">Punto de entrada HTTPS; gestiona TLS y enruta por subdominio</w:t>
+            </w:r>
+          </w:p>
+        </w:tc>
+      </w:tr>
+      <w:tr>
+        <w:tc>
+          <w:tcPr/>
+          <w:p>
+            <w:pPr>
+              <w:pStyle w:val="Compact"/>
+            </w:pPr>
+            <w:r>
+              <w:rPr>
+                <w:rStyle w:val="VerbatimChar"/>
+              </w:rPr>
+              <w:t xml:space="preserve">sgi-full-frontend</w:t>
+            </w:r>
+          </w:p>
+        </w:tc>
+        <w:tc>
+          <w:tcPr/>
+          <w:p>
+            <w:pPr>
+              <w:pStyle w:val="Compact"/>
+            </w:pPr>
+            <w:r>
+              <w:rPr>
+                <w:rStyle w:val="VerbatimChar"/>
+              </w:rPr>
+              <w:t xml:space="preserve">nginx:alpine</w:t>
+            </w:r>
+            <w:r>
+              <w:t xml:space="preserve"> </w:t>
+            </w:r>
+            <w:r>
+              <w:t xml:space="preserve">· 80</w:t>
+            </w:r>
+          </w:p>
+        </w:tc>
+        <w:tc>
+          <w:tcPr/>
+          <w:p>
+            <w:pPr>
+              <w:pStyle w:val="Compact"/>
+            </w:pPr>
+            <w:r>
+              <w:t xml:space="preserve">SPA React compilada con Vite, servida por Nginx</w:t>
+            </w:r>
+          </w:p>
+        </w:tc>
+      </w:tr>
+      <w:tr>
+        <w:tc>
+          <w:tcPr/>
+          <w:p>
+            <w:pPr>
+              <w:pStyle w:val="Compact"/>
+            </w:pPr>
+            <w:r>
+              <w:rPr>
+                <w:rStyle w:val="VerbatimChar"/>
+              </w:rPr>
+              <w:t xml:space="preserve">sgi-full-backend</w:t>
+            </w:r>
+          </w:p>
+        </w:tc>
+        <w:tc>
+          <w:tcPr/>
+          <w:p>
+            <w:pPr>
+              <w:pStyle w:val="Compact"/>
+            </w:pPr>
+            <w:r>
+              <w:rPr>
+                <w:rStyle w:val="VerbatimChar"/>
+              </w:rPr>
+              <w:t xml:space="preserve">eclipse-temurin:21</w:t>
+            </w:r>
+            <w:r>
+              <w:t xml:space="preserve"> </w:t>
+            </w:r>
+            <w:r>
+              <w:t xml:space="preserve">· 8080</w:t>
+            </w:r>
+          </w:p>
+        </w:tc>
+        <w:tc>
+          <w:tcPr/>
+          <w:p>
+            <w:pPr>
+              <w:pStyle w:val="Compact"/>
+            </w:pPr>
+            <w:r>
+              <w:t xml:space="preserve">API REST Spring Boot 3.5 (embedded Tomcat)</w:t>
+            </w:r>
+          </w:p>
+        </w:tc>
+      </w:tr>
+      <w:tr>
+        <w:tc>
+          <w:tcPr/>
+          <w:p>
+            <w:pPr>
+              <w:pStyle w:val="Compact"/>
+            </w:pPr>
+            <w:r>
+              <w:rPr>
+                <w:rStyle w:val="VerbatimChar"/>
+              </w:rPr>
+              <w:t xml:space="preserve">sgi-full-db</w:t>
+            </w:r>
+          </w:p>
+        </w:tc>
+        <w:tc>
+          <w:tcPr/>
+          <w:p>
+            <w:pPr>
+              <w:pStyle w:val="Compact"/>
+            </w:pPr>
+            <w:r>
+              <w:rPr>
+                <w:rStyle w:val="VerbatimChar"/>
+              </w:rPr>
+              <w:t xml:space="preserve">mysql:8.0</w:t>
+            </w:r>
+            <w:r>
+              <w:t xml:space="preserve"> </w:t>
+            </w:r>
+            <w:r>
+              <w:t xml:space="preserve">· 3306</w:t>
+            </w:r>
+          </w:p>
+        </w:tc>
+        <w:tc>
+          <w:tcPr/>
+          <w:p>
+            <w:pPr>
+              <w:pStyle w:val="Compact"/>
+            </w:pPr>
+            <w:r>
+              <w:t xml:space="preserve">Base de datos principal</w:t>
+            </w:r>
+            <w:r>
+              <w:t xml:space="preserve"> </w:t>
+            </w:r>
+            <w:r>
+              <w:rPr>
+                <w:rStyle w:val="VerbatimChar"/>
+              </w:rPr>
+              <w:t xml:space="preserve">db_sgi_emch</w:t>
+            </w:r>
+          </w:p>
+        </w:tc>
+      </w:tr>
+      <w:tr>
+        <w:tc>
+          <w:tcPr/>
+          <w:p>
+            <w:pPr>
+              <w:pStyle w:val="Compact"/>
+            </w:pPr>
+            <w:r>
+              <w:rPr>
+                <w:rStyle w:val="VerbatimChar"/>
+              </w:rPr>
+              <w:t xml:space="preserve">sgi-full-docs</w:t>
+            </w:r>
+          </w:p>
+        </w:tc>
+        <w:tc>
+          <w:tcPr/>
+          <w:p>
+            <w:pPr>
+              <w:pStyle w:val="Compact"/>
+            </w:pPr>
+            <w:r>
+              <w:rPr>
+                <w:rStyle w:val="VerbatimChar"/>
+              </w:rPr>
+              <w:t xml:space="preserve">node:alpine</w:t>
+            </w:r>
+            <w:r>
+              <w:t xml:space="preserve"> </w:t>
+            </w:r>
+            <w:r>
+              <w:t xml:space="preserve">· 3000</w:t>
+            </w:r>
+          </w:p>
+        </w:tc>
+        <w:tc>
+          <w:tcPr/>
+          <w:p>
+            <w:pPr>
+              <w:pStyle w:val="Compact"/>
+            </w:pPr>
+            <w:r>
+              <w:t xml:space="preserve">Documentación Docusaurus</w:t>
+            </w:r>
+          </w:p>
+        </w:tc>
+      </w:tr>
+      <w:tr>
+        <w:tc>
+          <w:tcPr/>
+          <w:p>
+            <w:pPr>
+              <w:pStyle w:val="Compact"/>
+            </w:pPr>
+            <w:r>
+              <w:rPr>
+                <w:rStyle w:val="VerbatimChar"/>
+              </w:rPr>
+              <w:t xml:space="preserve">sgi-full-backup</w:t>
+            </w:r>
+          </w:p>
+        </w:tc>
+        <w:tc>
+          <w:tcPr/>
+          <w:p>
+            <w:pPr>
+              <w:pStyle w:val="Compact"/>
+            </w:pPr>
+            <w:r>
+              <w:rPr>
+                <w:rStyle w:val="VerbatimChar"/>
+              </w:rPr>
+              <w:t xml:space="preserve">alpine:crond</w:t>
+            </w:r>
+          </w:p>
+        </w:tc>
+        <w:tc>
+          <w:tcPr/>
+          <w:p>
+            <w:pPr>
+              <w:pStyle w:val="Compact"/>
+            </w:pPr>
+            <w:r>
+              <w:rPr>
+                <w:rStyle w:val="VerbatimChar"/>
+              </w:rPr>
+              <w:t xml:space="preserve">mysqldump</w:t>
+            </w:r>
+            <w:r>
+              <w:t xml:space="preserve"> </w:t>
+            </w:r>
+            <w:r>
+              <w:t xml:space="preserve">diario, retención 7 días</w:t>
+            </w:r>
+          </w:p>
+        </w:tc>
+      </w:tr>
+      <w:tr>
+        <w:tc>
+          <w:tcPr/>
+          <w:p>
+            <w:pPr>
+              <w:pStyle w:val="Compact"/>
+            </w:pPr>
+            <w:r>
+              <w:rPr>
+                <w:b/>
+                <w:bCs/>
+              </w:rPr>
+              <w:t xml:space="preserve">Prometheus</w:t>
+            </w:r>
+          </w:p>
+        </w:tc>
+        <w:tc>
+          <w:tcPr/>
+          <w:p>
+            <w:pPr>
+              <w:pStyle w:val="Compact"/>
+            </w:pPr>
+            <w:r>
+              <w:rPr>
+                <w:rStyle w:val="VerbatimChar"/>
+              </w:rPr>
+              <w:t xml:space="preserve">prom/prometheus</w:t>
+            </w:r>
+            <w:r>
+              <w:t xml:space="preserve"> </w:t>
+            </w:r>
+            <w:r>
+              <w:t xml:space="preserve">· 9090</w:t>
+            </w:r>
+          </w:p>
+        </w:tc>
+        <w:tc>
+          <w:tcPr/>
+          <w:p>
+            <w:pPr>
+              <w:pStyle w:val="Compact"/>
+            </w:pPr>
+            <w:r>
+              <w:t xml:space="preserve">Recolector de métricas desde</w:t>
+            </w:r>
+            <w:r>
+              <w:t xml:space="preserve"> </w:t>
+            </w:r>
+            <w:r>
+              <w:rPr>
+                <w:rStyle w:val="VerbatimChar"/>
+              </w:rPr>
+              <w:t xml:space="preserve">/actuator/prometheus</w:t>
+            </w:r>
+          </w:p>
+        </w:tc>
+      </w:tr>
+      <w:tr>
+        <w:tc>
+          <w:tcPr/>
+          <w:p>
+            <w:pPr>
+              <w:pStyle w:val="Compact"/>
+            </w:pPr>
+            <w:r>
+              <w:rPr>
+                <w:b/>
+                <w:bCs/>
+              </w:rPr>
+              <w:t xml:space="preserve">Grafana</w:t>
+            </w:r>
+          </w:p>
+        </w:tc>
+        <w:tc>
+          <w:tcPr/>
+          <w:p>
+            <w:pPr>
+              <w:pStyle w:val="Compact"/>
+            </w:pPr>
+            <w:r>
+              <w:rPr>
+                <w:rStyle w:val="VerbatimChar"/>
+              </w:rPr>
+              <w:t xml:space="preserve">grafana/grafana:11.5.2</w:t>
+            </w:r>
+            <w:r>
+              <w:t xml:space="preserve"> </w:t>
+            </w:r>
+            <w:r>
+              <w:t xml:space="preserve">· 3001</w:t>
+            </w:r>
+          </w:p>
+        </w:tc>
+        <w:tc>
+          <w:tcPr/>
+          <w:p>
+            <w:pPr>
+              <w:pStyle w:val="Compact"/>
+            </w:pPr>
+            <w:r>
+              <w:t xml:space="preserve">Dashboard de monitoreo (17 paneles pre-provisionados)</w:t>
+            </w:r>
+          </w:p>
+        </w:tc>
+      </w:tr>
+    </w:tbl>
+    <w:p>
+      <w:pPr>
+        <w:pStyle w:val="BodyText"/>
+      </w:pPr>
+      <w:r>
+        <w:rPr>
+          <w:b/>
+          <w:bCs/>
+        </w:rPr>
+        <w:t xml:space="preserve">3.1.11.3. Diagrama de Componentes</w:t>
+      </w:r>
+    </w:p>
+    <w:p>
+      <w:pPr>
+        <w:pStyle w:val="BodyText"/>
+      </w:pPr>
+      <w:r>
+        <w:t xml:space="preserve">Las capas del backend y su relación:</w:t>
+      </w:r>
+    </w:p>
+    <w:tbl>
+      <w:tblPr>
+        <w:tblStyle w:val="Table"/>
+        <w:tblW w:type="pct" w:w="5000"/>
+        <w:tblLayout w:type="fixed"/>
+        <w:tblLook w:firstRow="1" w:lastRow="0" w:firstColumn="0" w:lastColumn="0" w:noHBand="0" w:noVBand="0" w:val="0020"/>
+      </w:tblPr>
+      <w:tblGrid>
+        <w:gridCol w:w="2640"/>
+        <w:gridCol w:w="2640"/>
+        <w:gridCol w:w="2640"/>
+      </w:tblGrid>
+      <w:tr>
+        <w:trPr>
+          <w:tblHeader w:val="on"/>
+        </w:trPr>
+        <w:tc>
+          <w:tcPr/>
+          <w:p>
+            <w:pPr>
+              <w:pStyle w:val="Compact"/>
+            </w:pPr>
+            <w:r>
+              <w:t xml:space="preserve">Capa</w:t>
+            </w:r>
+          </w:p>
+        </w:tc>
+        <w:tc>
+          <w:tcPr/>
+          <w:p>
+            <w:pPr>
+              <w:pStyle w:val="Compact"/>
+            </w:pPr>
+            <w:r>
               <w:t xml:space="preserve">Anotación Spring</w:t>
             </w:r>
           </w:p>
@@ -14891,7 +15543,7 @@
         </w:rPr>
         <w:t xml:space="preserve"> </w:t>
       </w:r>
-      <w:hyperlink r:id="rId38">
+      <w:hyperlink r:id="rId40">
         <w:r>
           <w:rPr>
             <w:rStyle w:val="Hyperlink"/>
@@ -15281,7 +15933,7 @@
         </w:rPr>
         <w:t xml:space="preserve"> </w:t>
       </w:r>
-      <w:hyperlink r:id="rId39">
+      <w:hyperlink r:id="rId41">
         <w:r>
           <w:rPr>
             <w:rStyle w:val="Hyperlink"/>
@@ -15366,7 +16018,7 @@
         </w:rPr>
         <w:t xml:space="preserve"> </w:t>
       </w:r>
-      <w:hyperlink r:id="rId40">
+      <w:hyperlink r:id="rId42">
         <w:r>
           <w:rPr>
             <w:rStyle w:val="Hyperlink"/>
@@ -15451,7 +16103,7 @@
         </w:rPr>
         <w:t xml:space="preserve"> </w:t>
       </w:r>
-      <w:hyperlink r:id="rId41">
+      <w:hyperlink r:id="rId43">
         <w:r>
           <w:rPr>
             <w:rStyle w:val="Hyperlink"/>
@@ -16103,9 +16755,9 @@
         </w:tc>
       </w:tr>
     </w:tbl>
-    <w:bookmarkEnd w:id="42"/>
-    <w:bookmarkEnd w:id="43"/>
-    <w:bookmarkStart w:id="46" w:name="guías"/>
+    <w:bookmarkEnd w:id="44"/>
+    <w:bookmarkEnd w:id="45"/>
+    <w:bookmarkStart w:id="48" w:name="guías"/>
     <w:p>
       <w:pPr>
         <w:pStyle w:val="Heading2"/>
@@ -16114,7 +16766,7 @@
         <w:t xml:space="preserve">3.2. Guías</w:t>
       </w:r>
     </w:p>
-    <w:bookmarkStart w:id="44" w:name="estándares-de-programación"/>
+    <w:bookmarkStart w:id="46" w:name="estándares-de-programación"/>
     <w:p>
       <w:pPr>
         <w:pStyle w:val="Heading3"/>
@@ -17390,8 +18042,8 @@
         <w:t xml:space="preserve">Commits frecuentes y atómicos (un cambio lógico por commit)</w:t>
       </w:r>
     </w:p>
-    <w:bookmarkEnd w:id="44"/>
-    <w:bookmarkStart w:id="45" w:name="manual-de-usuario"/>
+    <w:bookmarkEnd w:id="46"/>
+    <w:bookmarkStart w:id="47" w:name="manual-de-usuario"/>
     <w:p>
       <w:pPr>
         <w:pStyle w:val="Heading3"/>
@@ -17753,10 +18405,10 @@
         </w:pict>
       </w:r>
     </w:p>
-    <w:bookmarkEnd w:id="45"/>
-    <w:bookmarkEnd w:id="46"/>
     <w:bookmarkEnd w:id="47"/>
-    <w:bookmarkStart w:id="54" w:name="capítulo-4-resultados"/>
+    <w:bookmarkEnd w:id="48"/>
+    <w:bookmarkEnd w:id="49"/>
+    <w:bookmarkStart w:id="56" w:name="capítulo-4-resultados"/>
     <w:p>
       <w:pPr>
         <w:pStyle w:val="Heading1"/>
@@ -17765,7 +18417,7 @@
         <w:t xml:space="preserve">Capítulo 4 — RESULTADOS</w:t>
       </w:r>
     </w:p>
-    <w:bookmarkStart w:id="48" w:name="resultados-por-módulo"/>
+    <w:bookmarkStart w:id="50" w:name="resultados-por-módulo"/>
     <w:p>
       <w:pPr>
         <w:pStyle w:val="Heading2"/>
@@ -18823,8 +19475,8 @@
         </w:tc>
       </w:tr>
     </w:tbl>
-    <w:bookmarkEnd w:id="48"/>
-    <w:bookmarkStart w:id="49" w:name="presupuesto"/>
+    <w:bookmarkEnd w:id="50"/>
+    <w:bookmarkStart w:id="51" w:name="presupuesto"/>
     <w:p>
       <w:pPr>
         <w:pStyle w:val="Heading2"/>
@@ -19528,8 +20180,8 @@
         <w:t xml:space="preserve">El servidor institucional es infraestructura propia de la EMCH; los montos de mantenimiento y soporte corresponden al costo proporcional asignado al período del proyecto. No incluye costo de hardware (ya existente en la institución) ni licencias de software (todo el stack es de código abierto: Spring Boot, MySQL, React, Docker).</w:t>
       </w:r>
     </w:p>
-    <w:bookmarkEnd w:id="49"/>
-    <w:bookmarkStart w:id="53" w:name="cronograma-de-actividades"/>
+    <w:bookmarkEnd w:id="51"/>
+    <w:bookmarkStart w:id="55" w:name="cronograma-de-actividades"/>
     <w:p>
       <w:pPr>
         <w:pStyle w:val="Heading2"/>
@@ -19568,18 +20220,18 @@
           <wp:inline>
             <wp:extent cx="5334000" cy="1315479"/>
             <wp:effectExtent b="0" l="0" r="0" t="0"/>
-            <wp:docPr descr="Cronograma SGI-EMCH — Gantt Sprint 0 al Sprint 6" title="" id="51" name="Picture"/>
+            <wp:docPr descr="Cronograma SGI-EMCH — Gantt Sprint 0 al Sprint 6" title="" id="53" name="Picture"/>
             <a:graphic>
               <a:graphicData uri="http://schemas.openxmlformats.org/drawingml/2006/picture">
                 <pic:pic>
                   <pic:nvPicPr>
-                    <pic:cNvPr descr="gantt_cronograma.png" id="52" name="Picture"/>
+                    <pic:cNvPr descr="gantt_cronograma.png" id="54" name="Picture"/>
                     <pic:cNvPicPr>
                       <a:picLocks noChangeArrowheads="1" noChangeAspect="1"/>
                     </pic:cNvPicPr>
                   </pic:nvPicPr>
                   <pic:blipFill>
-                    <a:blip r:embed="rId50"/>
+                    <a:blip r:embed="rId52"/>
                     <a:stretch>
                       <a:fillRect/>
                     </a:stretch>
@@ -20007,9 +20659,9 @@
         </w:pict>
       </w:r>
     </w:p>
-    <w:bookmarkEnd w:id="53"/>
-    <w:bookmarkEnd w:id="54"/>
-    <w:bookmarkStart w:id="55" w:name="conclusiones"/>
+    <w:bookmarkEnd w:id="55"/>
+    <w:bookmarkEnd w:id="56"/>
+    <w:bookmarkStart w:id="57" w:name="conclusiones"/>
     <w:p>
       <w:pPr>
         <w:pStyle w:val="Heading1"/>
@@ -20151,8 +20803,8 @@
         </w:pict>
       </w:r>
     </w:p>
-    <w:bookmarkEnd w:id="55"/>
-    <w:bookmarkStart w:id="56" w:name="recomendaciones"/>
+    <w:bookmarkEnd w:id="57"/>
+    <w:bookmarkStart w:id="58" w:name="recomendaciones"/>
     <w:p>
       <w:pPr>
         <w:pStyle w:val="Heading1"/>
@@ -20318,8 +20970,8 @@
         </w:pict>
       </w:r>
     </w:p>
-    <w:bookmarkEnd w:id="56"/>
-    <w:bookmarkStart w:id="57" w:name="bibliografías"/>
+    <w:bookmarkEnd w:id="58"/>
+    <w:bookmarkStart w:id="59" w:name="bibliografías"/>
     <w:p>
       <w:pPr>
         <w:pStyle w:val="Heading1"/>
@@ -20623,8 +21275,8 @@
         </w:pict>
       </w:r>
     </w:p>
-    <w:bookmarkEnd w:id="57"/>
-    <w:bookmarkStart w:id="65" w:name="anexos"/>
+    <w:bookmarkEnd w:id="59"/>
+    <w:bookmarkStart w:id="67" w:name="anexos"/>
     <w:p>
       <w:pPr>
         <w:pStyle w:val="Heading1"/>
@@ -20633,7 +21285,7 @@
         <w:t xml:space="preserve">ANEXOS</w:t>
       </w:r>
     </w:p>
-    <w:bookmarkStart w:id="58" w:name="Xbc2c30da8015f3f9b8ceeb4d04f4643f95fb512"/>
+    <w:bookmarkStart w:id="60" w:name="Xbc2c30da8015f3f9b8ceeb4d04f4643f95fb512"/>
     <w:p>
       <w:pPr>
         <w:pStyle w:val="Heading2"/>
@@ -20710,8 +21362,8 @@
         <w:t xml:space="preserve">Pariona Torres, Jonas Efrain</w:t>
       </w:r>
     </w:p>
-    <w:bookmarkEnd w:id="58"/>
-    <w:bookmarkStart w:id="59" w:name="Xd2ec90dad6a07b1e45a8074554b2faf389a727d"/>
+    <w:bookmarkEnd w:id="60"/>
+    <w:bookmarkStart w:id="61" w:name="Xd2ec90dad6a07b1e45a8074554b2faf389a727d"/>
     <w:p>
       <w:pPr>
         <w:pStyle w:val="Heading2"/>
@@ -20763,8 +21415,8 @@
         <w:t xml:space="preserve">Aprobado por el equipo — implementación en Sprint 6.</w:t>
       </w:r>
     </w:p>
-    <w:bookmarkEnd w:id="59"/>
-    <w:bookmarkStart w:id="60" w:name="X90feec8a79a48e702175af1db1240d7cd0809f8"/>
+    <w:bookmarkEnd w:id="61"/>
+    <w:bookmarkStart w:id="62" w:name="X90feec8a79a48e702175af1db1240d7cd0809f8"/>
     <w:p>
       <w:pPr>
         <w:pStyle w:val="Heading2"/>
@@ -20798,8 +21450,8 @@
         <w:t xml:space="preserve">El SRS fue elaborado bajo el estándar IEEE Std 830-1998 / ISO/IEC/IEEE 29148:2018 e incluye: catálogo de 22 historias de usuario, 20 requisitos no funcionales, 7 restricciones técnicas, casos de uso UML, SLAs por tipo de incidente, KPIs del sistema y cronograma Scrum completo.</w:t>
       </w:r>
     </w:p>
-    <w:bookmarkEnd w:id="60"/>
-    <w:bookmarkStart w:id="61" w:name="anexo-4-product-backlog-completo"/>
+    <w:bookmarkEnd w:id="62"/>
+    <w:bookmarkStart w:id="63" w:name="anexo-4-product-backlog-completo"/>
     <w:p>
       <w:pPr>
         <w:pStyle w:val="Heading2"/>
@@ -20816,8 +21468,8 @@
         <w:t xml:space="preserve">Ver sección 3.1.2 del presente informe y documento SRS.md (sección de requisitos funcionales).</w:t>
       </w:r>
     </w:p>
-    <w:bookmarkEnd w:id="61"/>
-    <w:bookmarkStart w:id="64" w:name="anexo-5-recursos-del-proyecto-en-línea"/>
+    <w:bookmarkEnd w:id="63"/>
+    <w:bookmarkStart w:id="66" w:name="anexo-5-recursos-del-proyecto-en-línea"/>
     <w:p>
       <w:pPr>
         <w:pStyle w:val="Heading2"/>
@@ -20826,7 +21478,7 @@
         <w:t xml:space="preserve">Anexo 5: Recursos del Proyecto en Línea</w:t>
       </w:r>
     </w:p>
-    <w:bookmarkStart w:id="62" w:name="sistema-en-producción-y-repositorio"/>
+    <w:bookmarkStart w:id="64" w:name="sistema-en-producción-y-repositorio"/>
     <w:p>
       <w:pPr>
         <w:pStyle w:val="Heading3"/>
@@ -21004,8 +21656,8 @@
         </w:tc>
       </w:tr>
     </w:tbl>
-    <w:bookmarkEnd w:id="62"/>
-    <w:bookmarkStart w:id="63" w:name="X12c40eea7cf55be893f7b62c85c6cbf9502e7d8"/>
+    <w:bookmarkEnd w:id="64"/>
+    <w:bookmarkStart w:id="65" w:name="X12c40eea7cf55be893f7b62c85c6cbf9502e7d8"/>
     <w:p>
       <w:pPr>
         <w:pStyle w:val="Heading3"/>
@@ -22027,9 +22679,9 @@
         <w:t xml:space="preserve">| Sprint 6 — Junio/Julio 2026</w:t>
       </w:r>
     </w:p>
-    <w:bookmarkEnd w:id="63"/>
-    <w:bookmarkEnd w:id="64"/>
     <w:bookmarkEnd w:id="65"/>
+    <w:bookmarkEnd w:id="66"/>
+    <w:bookmarkEnd w:id="67"/>
     <w:sectPr>
       <w:footnotePr>
         <w:numRestart w:val="eachSect"/>

</xml_diff>